<commit_message>
docs: add N01 activity/class/sequence diagrams for wine catalog process
Adds analysis/design artifacts for the wine catalog and stock management
process (gestion-catalogo-stock-vinos, Entrega N01): business-process
activity diagram, conceptual model, domain class diagram, and sequence
diagrams for the 3 principal use cases (CU-21 propose/authorize wine,
CU-22 register stock movement, CU-23 propose/authorize discontinuation).
Extends the existing DER and class diagram with the new domain entities,
and extends the use-case docx generator with an extended template
(cover, revision history, extension points, affected diagrams,
UI prototype) for the 3 principal CUs plus the support CU. No code
changes — documentation only, per Entrega 1 scope.
</commit_message>
<xml_diff>
--- a/DIAGRAMAS/CasosDeUso.docx
+++ b/DIAGRAMAS/CasosDeUso.docx
@@ -14,7 +14,7 @@
       <w:r>
         <w:t>Sistema de Gestión de Usuarios — TP Ingeniería de Software.</w:t>
         <w:br/>
-        <w:t>Documento de descripción de los 20 casos de uso identificados, organizados por subsistema.</w:t>
+        <w:t>Documento de descripción de los 24 casos de uso identificados: CU-01..CU-20 (esqueleto base — usuarios, roles/permisos, idiomas, bitácora, integridad) y CU-21..CU-23 más el caso de soporte Consultar Alerta de Stock Mínimo, del dominio de Gestión de Catálogo y Stock de Vinos (Entrega N01).</w:t>
       </w:r>
     </w:p>
     <w:p>
@@ -814,6 +814,134 @@
           </w:p>
         </w:tc>
       </w:tr>
+      <w:tr>
+        <w:tc>
+          <w:tcPr>
+            <w:tcW w:type="dxa" w:w="3135"/>
+          </w:tcPr>
+          <w:p>
+            <w:r>
+              <w:t>CU-21</w:t>
+            </w:r>
+          </w:p>
+        </w:tc>
+        <w:tc>
+          <w:tcPr>
+            <w:tcW w:type="dxa" w:w="3135"/>
+          </w:tcPr>
+          <w:p>
+            <w:r>
+              <w:t>Proponer y Autorizar Alta de Vino</w:t>
+            </w:r>
+          </w:p>
+        </w:tc>
+        <w:tc>
+          <w:tcPr>
+            <w:tcW w:type="dxa" w:w="3135"/>
+          </w:tcPr>
+          <w:p>
+            <w:r>
+              <w:t>Usuario</w:t>
+            </w:r>
+          </w:p>
+        </w:tc>
+      </w:tr>
+      <w:tr>
+        <w:tc>
+          <w:tcPr>
+            <w:tcW w:type="dxa" w:w="3135"/>
+          </w:tcPr>
+          <w:p>
+            <w:r>
+              <w:t>CU-22</w:t>
+            </w:r>
+          </w:p>
+        </w:tc>
+        <w:tc>
+          <w:tcPr>
+            <w:tcW w:type="dxa" w:w="3135"/>
+          </w:tcPr>
+          <w:p>
+            <w:r>
+              <w:t>Registrar Movimiento de Stock</w:t>
+            </w:r>
+          </w:p>
+        </w:tc>
+        <w:tc>
+          <w:tcPr>
+            <w:tcW w:type="dxa" w:w="3135"/>
+          </w:tcPr>
+          <w:p>
+            <w:r>
+              <w:t>Usuario</w:t>
+            </w:r>
+          </w:p>
+        </w:tc>
+      </w:tr>
+      <w:tr>
+        <w:tc>
+          <w:tcPr>
+            <w:tcW w:type="dxa" w:w="3135"/>
+          </w:tcPr>
+          <w:p>
+            <w:r>
+              <w:t>CU-23</w:t>
+            </w:r>
+          </w:p>
+        </w:tc>
+        <w:tc>
+          <w:tcPr>
+            <w:tcW w:type="dxa" w:w="3135"/>
+          </w:tcPr>
+          <w:p>
+            <w:r>
+              <w:t>Solicitar y Autorizar Descontinuación de Vino</w:t>
+            </w:r>
+          </w:p>
+        </w:tc>
+        <w:tc>
+          <w:tcPr>
+            <w:tcW w:type="dxa" w:w="3135"/>
+          </w:tcPr>
+          <w:p>
+            <w:r>
+              <w:t>Usuario</w:t>
+            </w:r>
+          </w:p>
+        </w:tc>
+      </w:tr>
+      <w:tr>
+        <w:tc>
+          <w:tcPr>
+            <w:tcW w:type="dxa" w:w="3135"/>
+          </w:tcPr>
+          <w:p>
+            <w:r>
+              <w:t>CU-S1</w:t>
+            </w:r>
+          </w:p>
+        </w:tc>
+        <w:tc>
+          <w:tcPr>
+            <w:tcW w:type="dxa" w:w="3135"/>
+          </w:tcPr>
+          <w:p>
+            <w:r>
+              <w:t>Consultar Alerta de Stock Mínimo</w:t>
+            </w:r>
+          </w:p>
+        </w:tc>
+        <w:tc>
+          <w:tcPr>
+            <w:tcW w:type="dxa" w:w="3135"/>
+          </w:tcPr>
+          <w:p>
+            <w:r>
+              <w:t>Usuario</w:t>
+            </w:r>
+          </w:p>
+        </w:tc>
+      </w:tr>
     </w:tbl>
     <w:p>
       <w:r>
@@ -1001,7 +1129,7 @@
         <w:pStyle w:val="Heading2"/>
       </w:pPr>
       <w:r>
-        <w:t>Propósito</w:t>
+        <w:t>Objetivo</w:t>
       </w:r>
     </w:p>
     <w:p>
@@ -1150,7 +1278,7 @@
         <w:pStyle w:val="Heading2"/>
       </w:pPr>
       <w:r>
-        <w:t>Disparador</w:t>
+        <w:t>Evento disparador</w:t>
       </w:r>
     </w:p>
     <w:p>
@@ -2053,7 +2181,7 @@
         <w:pStyle w:val="Heading2"/>
       </w:pPr>
       <w:r>
-        <w:t>Propósito</w:t>
+        <w:t>Objetivo</w:t>
       </w:r>
     </w:p>
     <w:p>
@@ -2170,7 +2298,7 @@
         <w:pStyle w:val="Heading2"/>
       </w:pPr>
       <w:r>
-        <w:t>Disparador</w:t>
+        <w:t>Evento disparador</w:t>
       </w:r>
     </w:p>
     <w:p>
@@ -2877,7 +3005,7 @@
         <w:pStyle w:val="Heading2"/>
       </w:pPr>
       <w:r>
-        <w:t>Propósito</w:t>
+        <w:t>Objetivo</w:t>
       </w:r>
     </w:p>
     <w:p>
@@ -2954,7 +3082,7 @@
         <w:pStyle w:val="Heading2"/>
       </w:pPr>
       <w:r>
-        <w:t>Disparador</w:t>
+        <w:t>Evento disparador</w:t>
       </w:r>
     </w:p>
     <w:p>
@@ -3264,7 +3392,7 @@
         <w:pStyle w:val="Heading2"/>
       </w:pPr>
       <w:r>
-        <w:t>Propósito</w:t>
+        <w:t>Objetivo</w:t>
       </w:r>
     </w:p>
     <w:p>
@@ -3373,7 +3501,7 @@
         <w:pStyle w:val="Heading2"/>
       </w:pPr>
       <w:r>
-        <w:t>Disparador</w:t>
+        <w:t>Evento disparador</w:t>
       </w:r>
     </w:p>
     <w:p>
@@ -3873,7 +4001,7 @@
         <w:pStyle w:val="Heading2"/>
       </w:pPr>
       <w:r>
-        <w:t>Propósito</w:t>
+        <w:t>Objetivo</w:t>
       </w:r>
     </w:p>
     <w:p>
@@ -3950,7 +4078,7 @@
         <w:pStyle w:val="Heading2"/>
       </w:pPr>
       <w:r>
-        <w:t>Disparador</w:t>
+        <w:t>Evento disparador</w:t>
       </w:r>
     </w:p>
     <w:p>
@@ -4327,7 +4455,7 @@
         <w:pStyle w:val="Heading2"/>
       </w:pPr>
       <w:r>
-        <w:t>Propósito</w:t>
+        <w:t>Objetivo</w:t>
       </w:r>
     </w:p>
     <w:p>
@@ -4428,7 +4556,7 @@
         <w:pStyle w:val="Heading2"/>
       </w:pPr>
       <w:r>
-        <w:t>Disparador</w:t>
+        <w:t>Evento disparador</w:t>
       </w:r>
     </w:p>
     <w:p>
@@ -4899,7 +5027,7 @@
         <w:pStyle w:val="Heading2"/>
       </w:pPr>
       <w:r>
-        <w:t>Propósito</w:t>
+        <w:t>Objetivo</w:t>
       </w:r>
     </w:p>
     <w:p>
@@ -5008,7 +5136,7 @@
         <w:pStyle w:val="Heading2"/>
       </w:pPr>
       <w:r>
-        <w:t>Disparador</w:t>
+        <w:t>Evento disparador</w:t>
       </w:r>
     </w:p>
     <w:p>
@@ -5474,7 +5602,7 @@
         <w:pStyle w:val="Heading2"/>
       </w:pPr>
       <w:r>
-        <w:t>Propósito</w:t>
+        <w:t>Objetivo</w:t>
       </w:r>
     </w:p>
     <w:p>
@@ -5575,7 +5703,7 @@
         <w:pStyle w:val="Heading2"/>
       </w:pPr>
       <w:r>
-        <w:t>Disparador</w:t>
+        <w:t>Evento disparador</w:t>
       </w:r>
     </w:p>
     <w:p>
@@ -6011,7 +6139,7 @@
         <w:pStyle w:val="Heading2"/>
       </w:pPr>
       <w:r>
-        <w:t>Propósito</w:t>
+        <w:t>Objetivo</w:t>
       </w:r>
     </w:p>
     <w:p>
@@ -6104,7 +6232,7 @@
         <w:pStyle w:val="Heading2"/>
       </w:pPr>
       <w:r>
-        <w:t>Disparador</w:t>
+        <w:t>Evento disparador</w:t>
       </w:r>
     </w:p>
     <w:p>
@@ -6516,7 +6644,7 @@
         <w:pStyle w:val="Heading2"/>
       </w:pPr>
       <w:r>
-        <w:t>Propósito</w:t>
+        <w:t>Objetivo</w:t>
       </w:r>
     </w:p>
     <w:p>
@@ -6585,7 +6713,7 @@
         <w:pStyle w:val="Heading2"/>
       </w:pPr>
       <w:r>
-        <w:t>Disparador</w:t>
+        <w:t>Evento disparador</w:t>
       </w:r>
     </w:p>
     <w:p>
@@ -7054,7 +7182,7 @@
         <w:pStyle w:val="Heading2"/>
       </w:pPr>
       <w:r>
-        <w:t>Propósito</w:t>
+        <w:t>Objetivo</w:t>
       </w:r>
     </w:p>
     <w:p>
@@ -7195,7 +7323,7 @@
         <w:pStyle w:val="Heading2"/>
       </w:pPr>
       <w:r>
-        <w:t>Disparador</w:t>
+        <w:t>Evento disparador</w:t>
       </w:r>
     </w:p>
     <w:p>
@@ -7879,7 +8007,7 @@
         <w:pStyle w:val="Heading2"/>
       </w:pPr>
       <w:r>
-        <w:t>Propósito</w:t>
+        <w:t>Objetivo</w:t>
       </w:r>
     </w:p>
     <w:p>
@@ -7964,7 +8092,7 @@
         <w:pStyle w:val="Heading2"/>
       </w:pPr>
       <w:r>
-        <w:t>Disparador</w:t>
+        <w:t>Evento disparador</w:t>
       </w:r>
     </w:p>
     <w:p>
@@ -8360,7 +8488,7 @@
         <w:pStyle w:val="Heading2"/>
       </w:pPr>
       <w:r>
-        <w:t>Propósito</w:t>
+        <w:t>Objetivo</w:t>
       </w:r>
     </w:p>
     <w:p>
@@ -8469,7 +8597,7 @@
         <w:pStyle w:val="Heading2"/>
       </w:pPr>
       <w:r>
-        <w:t>Disparador</w:t>
+        <w:t>Evento disparador</w:t>
       </w:r>
     </w:p>
     <w:p>
@@ -8913,7 +9041,7 @@
         <w:pStyle w:val="Heading2"/>
       </w:pPr>
       <w:r>
-        <w:t>Propósito</w:t>
+        <w:t>Objetivo</w:t>
       </w:r>
     </w:p>
     <w:p>
@@ -9030,7 +9158,7 @@
         <w:pStyle w:val="Heading2"/>
       </w:pPr>
       <w:r>
-        <w:t>Disparador</w:t>
+        <w:t>Evento disparador</w:t>
       </w:r>
     </w:p>
     <w:p>
@@ -9464,7 +9592,7 @@
         <w:pStyle w:val="Heading2"/>
       </w:pPr>
       <w:r>
-        <w:t>Propósito</w:t>
+        <w:t>Objetivo</w:t>
       </w:r>
     </w:p>
     <w:p>
@@ -9541,7 +9669,7 @@
         <w:pStyle w:val="Heading2"/>
       </w:pPr>
       <w:r>
-        <w:t>Disparador</w:t>
+        <w:t>Evento disparador</w:t>
       </w:r>
     </w:p>
     <w:p>
@@ -9918,7 +10046,7 @@
         <w:pStyle w:val="Heading2"/>
       </w:pPr>
       <w:r>
-        <w:t>Propósito</w:t>
+        <w:t>Objetivo</w:t>
       </w:r>
     </w:p>
     <w:p>
@@ -9987,7 +10115,7 @@
         <w:pStyle w:val="Heading2"/>
       </w:pPr>
       <w:r>
-        <w:t>Disparador</w:t>
+        <w:t>Evento disparador</w:t>
       </w:r>
     </w:p>
     <w:p>
@@ -10299,7 +10427,7 @@
         <w:pStyle w:val="Heading2"/>
       </w:pPr>
       <w:r>
-        <w:t>Propósito</w:t>
+        <w:t>Objetivo</w:t>
       </w:r>
     </w:p>
     <w:p>
@@ -10384,7 +10512,7 @@
         <w:pStyle w:val="Heading2"/>
       </w:pPr>
       <w:r>
-        <w:t>Disparador</w:t>
+        <w:t>Evento disparador</w:t>
       </w:r>
     </w:p>
     <w:p>
@@ -10734,7 +10862,7 @@
         <w:pStyle w:val="Heading2"/>
       </w:pPr>
       <w:r>
-        <w:t>Propósito</w:t>
+        <w:t>Objetivo</w:t>
       </w:r>
     </w:p>
     <w:p>
@@ -10811,7 +10939,7 @@
         <w:pStyle w:val="Heading2"/>
       </w:pPr>
       <w:r>
-        <w:t>Disparador</w:t>
+        <w:t>Evento disparador</w:t>
       </w:r>
     </w:p>
     <w:p>
@@ -11185,7 +11313,7 @@
         <w:pStyle w:val="Heading2"/>
       </w:pPr>
       <w:r>
-        <w:t>Propósito</w:t>
+        <w:t>Objetivo</w:t>
       </w:r>
     </w:p>
     <w:p>
@@ -11270,7 +11398,7 @@
         <w:pStyle w:val="Heading2"/>
       </w:pPr>
       <w:r>
-        <w:t>Disparador</w:t>
+        <w:t>Evento disparador</w:t>
       </w:r>
     </w:p>
     <w:p>
@@ -11642,7 +11770,7 @@
         <w:pStyle w:val="Heading2"/>
       </w:pPr>
       <w:r>
-        <w:t>Propósito</w:t>
+        <w:t>Objetivo</w:t>
       </w:r>
     </w:p>
     <w:p>
@@ -11703,7 +11831,7 @@
         <w:pStyle w:val="Heading2"/>
       </w:pPr>
       <w:r>
-        <w:t>Disparador</w:t>
+        <w:t>Evento disparador</w:t>
       </w:r>
     </w:p>
     <w:p>
@@ -11907,6 +12035,3912 @@
       </w:tr>
     </w:tbl>
     <w:p/>
+    <w:p>
+      <w:r>
+        <w:br w:type="page"/>
+      </w:r>
+    </w:p>
+    <w:p>
+      <w:pPr>
+        <w:pStyle w:val="Heading1"/>
+      </w:pPr>
+      <w:r>
+        <w:t>CU-21 — Proponer y Autorizar Alta de Vino</w:t>
+      </w:r>
+    </w:p>
+    <w:tbl>
+      <w:tblPr>
+        <w:tblStyle w:val="LightGrid-Accent1"/>
+        <w:tblW w:type="auto" w:w="0"/>
+        <w:tblLook w:firstColumn="1" w:firstRow="1" w:lastColumn="0" w:lastRow="0" w:noHBand="0" w:noVBand="1" w:val="04A0"/>
+      </w:tblPr>
+      <w:tblGrid>
+        <w:gridCol w:w="4703"/>
+        <w:gridCol w:w="4703"/>
+      </w:tblGrid>
+      <w:tr>
+        <w:tc>
+          <w:tcPr>
+            <w:tcW w:type="dxa" w:w="4703"/>
+            <w:shd w:val="clear" w:color="auto" w:fill="DAE3F3"/>
+          </w:tcPr>
+          <w:p>
+            <w:r>
+              <w:rPr>
+                <w:b/>
+              </w:rPr>
+              <w:t>Versión</w:t>
+            </w:r>
+          </w:p>
+        </w:tc>
+        <w:tc>
+          <w:tcPr>
+            <w:tcW w:type="dxa" w:w="4703"/>
+          </w:tcPr>
+          <w:p>
+            <w:r>
+              <w:t>1.0</w:t>
+            </w:r>
+          </w:p>
+        </w:tc>
+      </w:tr>
+      <w:tr>
+        <w:tc>
+          <w:tcPr>
+            <w:tcW w:type="dxa" w:w="4703"/>
+            <w:shd w:val="clear" w:color="auto" w:fill="DAE3F3"/>
+          </w:tcPr>
+          <w:p>
+            <w:r>
+              <w:rPr>
+                <w:b/>
+              </w:rPr>
+              <w:t>Fecha</w:t>
+            </w:r>
+          </w:p>
+        </w:tc>
+        <w:tc>
+          <w:tcPr>
+            <w:tcW w:type="dxa" w:w="4703"/>
+          </w:tcPr>
+          <w:p>
+            <w:r>
+              <w:t>30/08/2026</w:t>
+            </w:r>
+          </w:p>
+        </w:tc>
+      </w:tr>
+      <w:tr>
+        <w:tc>
+          <w:tcPr>
+            <w:tcW w:type="dxa" w:w="4703"/>
+            <w:shd w:val="clear" w:color="auto" w:fill="DAE3F3"/>
+          </w:tcPr>
+          <w:p>
+            <w:r>
+              <w:rPr>
+                <w:b/>
+              </w:rPr>
+              <w:t>Autor</w:t>
+            </w:r>
+          </w:p>
+        </w:tc>
+        <w:tc>
+          <w:tcPr>
+            <w:tcW w:type="dxa" w:w="4703"/>
+          </w:tcPr>
+          <w:p>
+            <w:r>
+              <w:t>Equipo TP — Ingeniería de Software</w:t>
+            </w:r>
+          </w:p>
+        </w:tc>
+      </w:tr>
+    </w:tbl>
+    <w:p/>
+    <w:tbl>
+      <w:tblPr>
+        <w:tblStyle w:val="LightGrid-Accent1"/>
+        <w:tblW w:type="auto" w:w="0"/>
+        <w:tblLook w:firstColumn="1" w:firstRow="1" w:lastColumn="0" w:lastRow="0" w:noHBand="0" w:noVBand="1" w:val="04A0"/>
+      </w:tblPr>
+      <w:tblGrid>
+        <w:gridCol w:w="4703"/>
+        <w:gridCol w:w="4703"/>
+      </w:tblGrid>
+      <w:tr>
+        <w:tc>
+          <w:tcPr>
+            <w:tcW w:type="dxa" w:w="4703"/>
+            <w:shd w:val="clear" w:color="auto" w:fill="DAE3F3"/>
+          </w:tcPr>
+          <w:p>
+            <w:r>
+              <w:rPr>
+                <w:b/>
+              </w:rPr>
+              <w:t>Identificador</w:t>
+            </w:r>
+          </w:p>
+        </w:tc>
+        <w:tc>
+          <w:tcPr>
+            <w:tcW w:type="dxa" w:w="4703"/>
+          </w:tcPr>
+          <w:p>
+            <w:r>
+              <w:t>CU-21</w:t>
+            </w:r>
+          </w:p>
+        </w:tc>
+      </w:tr>
+      <w:tr>
+        <w:tc>
+          <w:tcPr>
+            <w:tcW w:type="dxa" w:w="4703"/>
+            <w:shd w:val="clear" w:color="auto" w:fill="DAE3F3"/>
+          </w:tcPr>
+          <w:p>
+            <w:r>
+              <w:rPr>
+                <w:b/>
+              </w:rPr>
+              <w:t>Nombre</w:t>
+            </w:r>
+          </w:p>
+        </w:tc>
+        <w:tc>
+          <w:tcPr>
+            <w:tcW w:type="dxa" w:w="4703"/>
+          </w:tcPr>
+          <w:p>
+            <w:r>
+              <w:t>Proponer y Autorizar Alta de Vino</w:t>
+            </w:r>
+          </w:p>
+        </w:tc>
+      </w:tr>
+      <w:tr>
+        <w:tc>
+          <w:tcPr>
+            <w:tcW w:type="dxa" w:w="4703"/>
+            <w:shd w:val="clear" w:color="auto" w:fill="DAE3F3"/>
+          </w:tcPr>
+          <w:p>
+            <w:r>
+              <w:rPr>
+                <w:b/>
+              </w:rPr>
+              <w:t>Actor primario</w:t>
+            </w:r>
+          </w:p>
+        </w:tc>
+        <w:tc>
+          <w:tcPr>
+            <w:tcW w:type="dxa" w:w="4703"/>
+          </w:tcPr>
+          <w:p>
+            <w:r>
+              <w:t>Usuario</w:t>
+            </w:r>
+          </w:p>
+        </w:tc>
+      </w:tr>
+      <w:tr>
+        <w:tc>
+          <w:tcPr>
+            <w:tcW w:type="dxa" w:w="4703"/>
+            <w:shd w:val="clear" w:color="auto" w:fill="DAE3F3"/>
+          </w:tcPr>
+          <w:p>
+            <w:r>
+              <w:rPr>
+                <w:b/>
+              </w:rPr>
+              <w:t>Actor secundario</w:t>
+            </w:r>
+          </w:p>
+        </w:tc>
+        <w:tc>
+          <w:tcPr>
+            <w:tcW w:type="dxa" w:w="4703"/>
+          </w:tcPr>
+          <w:p>
+            <w:r>
+              <w:t>Administrador (autoriza, en el flujo alternativo 9)</w:t>
+            </w:r>
+          </w:p>
+        </w:tc>
+      </w:tr>
+      <w:tr>
+        <w:tc>
+          <w:tcPr>
+            <w:tcW w:type="dxa" w:w="4703"/>
+            <w:shd w:val="clear" w:color="auto" w:fill="DAE3F3"/>
+          </w:tcPr>
+          <w:p>
+            <w:r>
+              <w:rPr>
+                <w:b/>
+              </w:rPr>
+              <w:t>Frecuencia</w:t>
+            </w:r>
+          </w:p>
+        </w:tc>
+        <w:tc>
+          <w:tcPr>
+            <w:tcW w:type="dxa" w:w="4703"/>
+          </w:tcPr>
+          <w:p>
+            <w:r>
+              <w:t>Media</w:t>
+            </w:r>
+          </w:p>
+        </w:tc>
+      </w:tr>
+      <w:tr>
+        <w:tc>
+          <w:tcPr>
+            <w:tcW w:type="dxa" w:w="4703"/>
+            <w:shd w:val="clear" w:color="auto" w:fill="DAE3F3"/>
+          </w:tcPr>
+          <w:p>
+            <w:r>
+              <w:rPr>
+                <w:b/>
+              </w:rPr>
+              <w:t>Prioridad</w:t>
+            </w:r>
+          </w:p>
+        </w:tc>
+        <w:tc>
+          <w:tcPr>
+            <w:tcW w:type="dxa" w:w="4703"/>
+          </w:tcPr>
+          <w:p>
+            <w:r>
+              <w:t>Alta</w:t>
+            </w:r>
+          </w:p>
+        </w:tc>
+      </w:tr>
+    </w:tbl>
+    <w:p/>
+    <w:p>
+      <w:pPr>
+        <w:pStyle w:val="Heading2"/>
+      </w:pPr>
+      <w:r>
+        <w:t>Historial de revisión</w:t>
+      </w:r>
+    </w:p>
+    <w:tbl>
+      <w:tblPr>
+        <w:tblStyle w:val="LightGrid-Accent1"/>
+        <w:tblW w:type="auto" w:w="0"/>
+        <w:tblLook w:firstColumn="1" w:firstRow="1" w:lastColumn="0" w:lastRow="0" w:noHBand="0" w:noVBand="1" w:val="04A0"/>
+      </w:tblPr>
+      <w:tblGrid>
+        <w:gridCol w:w="2351"/>
+        <w:gridCol w:w="2351"/>
+        <w:gridCol w:w="2351"/>
+        <w:gridCol w:w="2351"/>
+      </w:tblGrid>
+      <w:tr>
+        <w:tc>
+          <w:tcPr>
+            <w:tcW w:type="dxa" w:w="2351"/>
+            <w:shd w:val="clear" w:color="auto" w:fill="DAE3F3"/>
+          </w:tcPr>
+          <w:p>
+            <w:r>
+              <w:rPr>
+                <w:b/>
+              </w:rPr>
+              <w:t>Versión</w:t>
+            </w:r>
+          </w:p>
+        </w:tc>
+        <w:tc>
+          <w:tcPr>
+            <w:tcW w:type="dxa" w:w="2351"/>
+            <w:shd w:val="clear" w:color="auto" w:fill="DAE3F3"/>
+          </w:tcPr>
+          <w:p>
+            <w:r>
+              <w:rPr>
+                <w:b/>
+              </w:rPr>
+              <w:t>Fecha</w:t>
+            </w:r>
+          </w:p>
+        </w:tc>
+        <w:tc>
+          <w:tcPr>
+            <w:tcW w:type="dxa" w:w="2351"/>
+            <w:shd w:val="clear" w:color="auto" w:fill="DAE3F3"/>
+          </w:tcPr>
+          <w:p>
+            <w:r>
+              <w:rPr>
+                <w:b/>
+              </w:rPr>
+              <w:t>Autor</w:t>
+            </w:r>
+          </w:p>
+        </w:tc>
+        <w:tc>
+          <w:tcPr>
+            <w:tcW w:type="dxa" w:w="2351"/>
+            <w:shd w:val="clear" w:color="auto" w:fill="DAE3F3"/>
+          </w:tcPr>
+          <w:p>
+            <w:r>
+              <w:rPr>
+                <w:b/>
+              </w:rPr>
+              <w:t>Descripción</w:t>
+            </w:r>
+          </w:p>
+        </w:tc>
+      </w:tr>
+      <w:tr>
+        <w:tc>
+          <w:tcPr>
+            <w:tcW w:type="dxa" w:w="2351"/>
+          </w:tcPr>
+          <w:p>
+            <w:r>
+              <w:t>1.0</w:t>
+            </w:r>
+          </w:p>
+        </w:tc>
+        <w:tc>
+          <w:tcPr>
+            <w:tcW w:type="dxa" w:w="2351"/>
+          </w:tcPr>
+          <w:p>
+            <w:r>
+              <w:t>30/08/2026</w:t>
+            </w:r>
+          </w:p>
+        </w:tc>
+        <w:tc>
+          <w:tcPr>
+            <w:tcW w:type="dxa" w:w="2351"/>
+          </w:tcPr>
+          <w:p>
+            <w:r>
+              <w:t>Equipo TP</w:t>
+            </w:r>
+          </w:p>
+        </w:tc>
+        <w:tc>
+          <w:tcPr>
+            <w:tcW w:type="dxa" w:w="2351"/>
+          </w:tcPr>
+          <w:p>
+            <w:r>
+              <w:t>Versión inicial — Entrega 1 (análisis y diseño). Fusiona las propuestas previas CU-21 (proponer) y CU-22 (autorizar) en un único caso de uso con dos flujos.</w:t>
+            </w:r>
+          </w:p>
+        </w:tc>
+      </w:tr>
+    </w:tbl>
+    <w:p/>
+    <w:p>
+      <w:pPr>
+        <w:pStyle w:val="Heading2"/>
+      </w:pPr>
+      <w:r>
+        <w:t>Objetivo</w:t>
+      </w:r>
+    </w:p>
+    <w:p>
+      <w:r>
+        <w:t>Permitir que un Usuario con el permiso "Gestionar catálogo de vinos" (rol Encargado de Compras/Bodega) proponga el alta de un vino nuevo en el catálogo, y que un Administrador distinto, con el permiso "Autorizar catálogo de vinos", apruebe su publicación — garantizando la separación de funciones entre quien carga y quien autoriza (RN-01).</w:t>
+      </w:r>
+    </w:p>
+    <w:p>
+      <w:pPr>
+        <w:pStyle w:val="Heading2"/>
+      </w:pPr>
+      <w:r>
+        <w:t>Precondiciones</w:t>
+      </w:r>
+    </w:p>
+    <w:p>
+      <w:pPr>
+        <w:pStyle w:val="ListBullet"/>
+      </w:pPr>
+      <w:r>
+        <w:t>El Usuario que propone el alta inició sesión correctamente y tiene el permiso "Gestionar catálogo de vinos".</w:t>
+      </w:r>
+    </w:p>
+    <w:p>
+      <w:pPr>
+        <w:pStyle w:val="ListBullet"/>
+      </w:pPr>
+      <w:r>
+        <w:t>La bodega del vino ya existe en BODEGA y está habilitada.</w:t>
+      </w:r>
+    </w:p>
+    <w:p>
+      <w:pPr>
+        <w:pStyle w:val="ListBullet"/>
+      </w:pPr>
+      <w:r>
+        <w:t>El código/SKU del vino no está registrado previamente en VINO.</w:t>
+      </w:r>
+    </w:p>
+    <w:p>
+      <w:pPr>
+        <w:pStyle w:val="ListBullet"/>
+      </w:pPr>
+      <w:r>
+        <w:t>Para la autorización: el Administrador inició sesión correctamente, tiene el permiso "Autorizar catálogo de vinos" y es distinto del Usuario que propuso el alta.</w:t>
+      </w:r>
+    </w:p>
+    <w:p>
+      <w:pPr>
+        <w:pStyle w:val="Heading2"/>
+      </w:pPr>
+      <w:r>
+        <w:t>Postcondiciones</w:t>
+      </w:r>
+    </w:p>
+    <w:p>
+      <w:pPr>
+        <w:pStyle w:val="Heading3"/>
+      </w:pPr>
+      <w:r>
+        <w:t>En caso de éxito</w:t>
+      </w:r>
+    </w:p>
+    <w:p>
+      <w:pPr>
+        <w:pStyle w:val="ListBullet"/>
+      </w:pPr>
+      <w:r>
+        <w:t>El vino queda registrado en VINO con AUTORIZADO_POR = NULL hasta que un Administrador lo autorice.</w:t>
+      </w:r>
+    </w:p>
+    <w:p>
+      <w:pPr>
+        <w:pStyle w:val="ListBullet"/>
+      </w:pPr>
+      <w:r>
+        <w:t>Tras la autorización, AUTORIZADO_POR y FECHA_AUTORIZACION quedan completos y el vino es visible en el catálogo publicado.</w:t>
+      </w:r>
+    </w:p>
+    <w:p>
+      <w:pPr>
+        <w:pStyle w:val="Heading3"/>
+      </w:pPr>
+      <w:r>
+        <w:t>En caso de fallo</w:t>
+      </w:r>
+    </w:p>
+    <w:p>
+      <w:pPr>
+        <w:pStyle w:val="ListBullet"/>
+      </w:pPr>
+      <w:r>
+        <w:t>Si el código ya existe: no se crea el vino y se informa el conflicto.</w:t>
+      </w:r>
+    </w:p>
+    <w:p>
+      <w:pPr>
+        <w:pStyle w:val="ListBullet"/>
+      </w:pPr>
+      <w:r>
+        <w:t>Si el Administrador que intenta autorizar es el mismo Usuario que propuso el alta: el sistema rechaza la operación (RN-01) y el vino permanece pendiente.</w:t>
+      </w:r>
+    </w:p>
+    <w:p>
+      <w:pPr>
+        <w:pStyle w:val="Heading2"/>
+      </w:pPr>
+      <w:r>
+        <w:t>Evento disparador</w:t>
+      </w:r>
+    </w:p>
+    <w:p>
+      <w:r>
+        <w:t>El Usuario presiona "Nuevo vino" en frmCatalogoVinos para iniciar la propuesta; un Administrador presiona "Autorizar" sobre un vino pendiente en frmAutorizarVinos para completar el caso de uso.</w:t>
+      </w:r>
+    </w:p>
+    <w:p>
+      <w:pPr>
+        <w:pStyle w:val="Heading2"/>
+      </w:pPr>
+      <w:r>
+        <w:t>Puntos de extensión</w:t>
+      </w:r>
+    </w:p>
+    <w:tbl>
+      <w:tblPr>
+        <w:tblStyle w:val="LightGrid-Accent1"/>
+        <w:tblW w:type="auto" w:w="0"/>
+        <w:tblLook w:firstColumn="1" w:firstRow="1" w:lastColumn="0" w:lastRow="0" w:noHBand="0" w:noVBand="1" w:val="04A0"/>
+      </w:tblPr>
+      <w:tblGrid>
+        <w:gridCol w:w="4703"/>
+        <w:gridCol w:w="4703"/>
+      </w:tblGrid>
+      <w:tr>
+        <w:tc>
+          <w:tcPr>
+            <w:tcW w:type="dxa" w:w="4703"/>
+            <w:shd w:val="clear" w:color="auto" w:fill="DAE3F3"/>
+          </w:tcPr>
+          <w:p>
+            <w:r>
+              <w:rPr>
+                <w:b/>
+              </w:rPr>
+              <w:t>Paso</w:t>
+            </w:r>
+          </w:p>
+        </w:tc>
+        <w:tc>
+          <w:tcPr>
+            <w:tcW w:type="dxa" w:w="4703"/>
+            <w:shd w:val="clear" w:color="auto" w:fill="DAE3F3"/>
+          </w:tcPr>
+          <w:p>
+            <w:r>
+              <w:rPr>
+                <w:b/>
+              </w:rPr>
+              <w:t>Extensión posible</w:t>
+            </w:r>
+          </w:p>
+        </w:tc>
+      </w:tr>
+      <w:tr>
+        <w:tc>
+          <w:tcPr>
+            <w:tcW w:type="dxa" w:w="4703"/>
+          </w:tcPr>
+          <w:p>
+            <w:r>
+              <w:t>Tras el paso 13 (vino autorizado y publicado)</w:t>
+            </w:r>
+          </w:p>
+        </w:tc>
+        <w:tc>
+          <w:tcPr>
+            <w:tcW w:type="dxa" w:w="4703"/>
+          </w:tcPr>
+          <w:p>
+            <w:r>
+              <w:t>Notificación automática al Usuario que propuso el alta — fuera de alcance de esta entrega (ver decisión D9 del diseño: la alerta/notificación es pasiva, no push).</w:t>
+            </w:r>
+          </w:p>
+        </w:tc>
+      </w:tr>
+    </w:tbl>
+    <w:p/>
+    <w:p>
+      <w:pPr>
+        <w:pStyle w:val="Heading2"/>
+      </w:pPr>
+      <w:r>
+        <w:t>Gráfico del caso de uso</w:t>
+      </w:r>
+    </w:p>
+    <w:p>
+      <w:r>
+        <w:rPr>
+          <w:rFonts w:ascii="Consolas" w:hAnsi="Consolas"/>
+          <w:sz w:val="18"/>
+        </w:rPr>
+        <w:t>Actor: Usuario (permiso "Gestionar catálogo de vinos") ──&gt; (Proponer Alta de Vino)</w:t>
+        <w:br/>
+        <w:t>Actor: Administrador (permiso "Autorizar catálogo de vinos") ──&gt; (Autorizar Alta de Vino)</w:t>
+        <w:br/>
+        <w:br/>
+        <w:t>(Proponer Alta de Vino) ── «precede» ──&gt; (Autorizar Alta de Vino)</w:t>
+        <w:br/>
+        <w:br/>
+        <w:t>El caso de uso está modelado como un único CU con dos flujos secuenciales (propone / autoriza) porque comparten el mismo objeto de negocio (el vino pendiente) y la misma regla de separación de funciones (RN-01).</w:t>
+      </w:r>
+    </w:p>
+    <w:p/>
+    <w:p>
+      <w:pPr>
+        <w:pStyle w:val="Heading2"/>
+      </w:pPr>
+      <w:r>
+        <w:t>Flujo principal</w:t>
+      </w:r>
+    </w:p>
+    <w:p>
+      <w:pPr>
+        <w:pStyle w:val="ListNumber"/>
+      </w:pPr>
+      <w:r>
+        <w:t>El Usuario abre frmCatalogoVinos y presiona "Nuevo vino".</w:t>
+      </w:r>
+    </w:p>
+    <w:p>
+      <w:pPr>
+        <w:pStyle w:val="ListNumber"/>
+      </w:pPr>
+      <w:r>
+        <w:t>El sistema abre frmNuevoVino y carga el combo de bodegas habilitadas.</w:t>
+      </w:r>
+    </w:p>
+    <w:p>
+      <w:pPr>
+        <w:pStyle w:val="ListNumber"/>
+      </w:pPr>
+      <w:r>
+        <w:t>El Usuario ingresa código/SKU, nombre, bodega, varietal, añada, precio y stock mínimo (maridaje y puntaje son opcionales).</w:t>
+      </w:r>
+    </w:p>
+    <w:p>
+      <w:pPr>
+        <w:pStyle w:val="ListNumber"/>
+      </w:pPr>
+      <w:r>
+        <w:t>El Usuario presiona Aceptar.</w:t>
+      </w:r>
+    </w:p>
+    <w:p>
+      <w:pPr>
+        <w:pStyle w:val="ListNumber"/>
+      </w:pPr>
+      <w:r>
+        <w:t>El sistema valida que los campos obligatorios estén completos.</w:t>
+      </w:r>
+    </w:p>
+    <w:p>
+      <w:pPr>
+        <w:pStyle w:val="ListNumber"/>
+      </w:pPr>
+      <w:r>
+        <w:t>El sistema verifica que el código no exista previamente en VINO.</w:t>
+      </w:r>
+    </w:p>
+    <w:p>
+      <w:pPr>
+        <w:pStyle w:val="ListNumber"/>
+      </w:pPr>
+      <w:r>
+        <w:t>El sistema inserta el vino con AUTORIZADO_POR = NULL y CREADO_POR = Id del Usuario.</w:t>
+      </w:r>
+    </w:p>
+    <w:p>
+      <w:pPr>
+        <w:pStyle w:val="ListNumber"/>
+      </w:pPr>
+      <w:r>
+        <w:t>El sistema informa que el vino quedó pendiente de autorización.</w:t>
+      </w:r>
+    </w:p>
+    <w:p>
+      <w:pPr>
+        <w:pStyle w:val="ListNumber"/>
+      </w:pPr>
+      <w:r>
+        <w:t>Un Administrador abre frmAutorizarVinos y visualiza los vinos pendientes (AUTORIZADO_POR IS NULL).</w:t>
+      </w:r>
+    </w:p>
+    <w:p>
+      <w:pPr>
+        <w:pStyle w:val="ListNumber"/>
+      </w:pPr>
+      <w:r>
+        <w:t>El Administrador selecciona un vino y presiona Autorizar.</w:t>
+      </w:r>
+    </w:p>
+    <w:p>
+      <w:pPr>
+        <w:pStyle w:val="ListNumber"/>
+      </w:pPr>
+      <w:r>
+        <w:t>El sistema verifica que el Administrador sea distinto del Usuario que propuso el alta (RN-01).</w:t>
+      </w:r>
+    </w:p>
+    <w:p>
+      <w:pPr>
+        <w:pStyle w:val="ListNumber"/>
+      </w:pPr>
+      <w:r>
+        <w:t>El sistema completa AUTORIZADO_POR y FECHA_AUTORIZACION.</w:t>
+      </w:r>
+    </w:p>
+    <w:p>
+      <w:pPr>
+        <w:pStyle w:val="ListNumber"/>
+      </w:pPr>
+      <w:r>
+        <w:t>El vino queda visible en el catálogo publicado.</w:t>
+      </w:r>
+    </w:p>
+    <w:p>
+      <w:pPr>
+        <w:pStyle w:val="Heading2"/>
+      </w:pPr>
+      <w:r>
+        <w:t>Flujos alternativos</w:t>
+      </w:r>
+    </w:p>
+    <w:p>
+      <w:pPr>
+        <w:pStyle w:val="Heading3"/>
+      </w:pPr>
+      <w:r>
+        <w:t>5a. Datos obligatorios incompletos</w:t>
+      </w:r>
+    </w:p>
+    <w:p>
+      <w:pPr>
+        <w:pStyle w:val="ListBullet"/>
+      </w:pPr>
+      <w:r>
+        <w:t>El sistema muestra "Completá los datos obligatorios del vino."</w:t>
+      </w:r>
+    </w:p>
+    <w:p>
+      <w:pPr>
+        <w:pStyle w:val="ListBullet"/>
+      </w:pPr>
+      <w:r>
+        <w:t>El caso de uso vuelve al paso 3.</w:t>
+      </w:r>
+    </w:p>
+    <w:p>
+      <w:pPr>
+        <w:pStyle w:val="Heading3"/>
+      </w:pPr>
+      <w:r>
+        <w:t>6a. Código de vino duplicado</w:t>
+      </w:r>
+    </w:p>
+    <w:p>
+      <w:pPr>
+        <w:pStyle w:val="ListBullet"/>
+      </w:pPr>
+      <w:r>
+        <w:t>El sistema muestra "Ya existe un vino con ese código."</w:t>
+      </w:r>
+    </w:p>
+    <w:p>
+      <w:pPr>
+        <w:pStyle w:val="ListBullet"/>
+      </w:pPr>
+      <w:r>
+        <w:t>El caso de uso vuelve al paso 3.</w:t>
+      </w:r>
+    </w:p>
+    <w:p>
+      <w:pPr>
+        <w:pStyle w:val="Heading3"/>
+      </w:pPr>
+      <w:r>
+        <w:t>11a. Autoautorización bloqueada (RN-01)</w:t>
+      </w:r>
+    </w:p>
+    <w:p>
+      <w:pPr>
+        <w:pStyle w:val="ListBullet"/>
+      </w:pPr>
+      <w:r>
+        <w:t>El sistema muestra "No podés autorizar un vino que vos mismo diste de alta."</w:t>
+      </w:r>
+    </w:p>
+    <w:p>
+      <w:pPr>
+        <w:pStyle w:val="ListBullet"/>
+      </w:pPr>
+      <w:r>
+        <w:t>El caso de uso vuelve al paso 10.</w:t>
+      </w:r>
+    </w:p>
+    <w:p>
+      <w:pPr>
+        <w:pStyle w:val="Heading2"/>
+      </w:pPr>
+      <w:r>
+        <w:t>Excepciones</w:t>
+      </w:r>
+    </w:p>
+    <w:tbl>
+      <w:tblPr>
+        <w:tblStyle w:val="LightGrid-Accent1"/>
+        <w:tblW w:type="auto" w:w="0"/>
+        <w:tblLook w:firstColumn="1" w:firstRow="1" w:lastColumn="0" w:lastRow="0" w:noHBand="0" w:noVBand="1" w:val="04A0"/>
+      </w:tblPr>
+      <w:tblGrid>
+        <w:gridCol w:w="3135"/>
+        <w:gridCol w:w="3135"/>
+        <w:gridCol w:w="3135"/>
+      </w:tblGrid>
+      <w:tr>
+        <w:tc>
+          <w:tcPr>
+            <w:tcW w:type="dxa" w:w="3135"/>
+            <w:shd w:val="clear" w:color="auto" w:fill="DAE3F3"/>
+          </w:tcPr>
+          <w:p>
+            <w:r>
+              <w:rPr>
+                <w:b/>
+              </w:rPr>
+              <w:t>Código</w:t>
+            </w:r>
+          </w:p>
+        </w:tc>
+        <w:tc>
+          <w:tcPr>
+            <w:tcW w:type="dxa" w:w="3135"/>
+            <w:shd w:val="clear" w:color="auto" w:fill="DAE3F3"/>
+          </w:tcPr>
+          <w:p>
+            <w:r>
+              <w:rPr>
+                <w:b/>
+              </w:rPr>
+              <w:t>Descripción</w:t>
+            </w:r>
+          </w:p>
+        </w:tc>
+        <w:tc>
+          <w:tcPr>
+            <w:tcW w:type="dxa" w:w="3135"/>
+            <w:shd w:val="clear" w:color="auto" w:fill="DAE3F3"/>
+          </w:tcPr>
+          <w:p>
+            <w:r>
+              <w:rPr>
+                <w:b/>
+              </w:rPr>
+              <w:t>Manejo</w:t>
+            </w:r>
+          </w:p>
+        </w:tc>
+      </w:tr>
+      <w:tr>
+        <w:tc>
+          <w:tcPr>
+            <w:tcW w:type="dxa" w:w="3135"/>
+          </w:tcPr>
+          <w:p>
+            <w:r>
+              <w:t>EX-01</w:t>
+            </w:r>
+          </w:p>
+        </w:tc>
+        <w:tc>
+          <w:tcPr>
+            <w:tcW w:type="dxa" w:w="3135"/>
+          </w:tcPr>
+          <w:p>
+            <w:r>
+              <w:t>Error de conexión con la base de datos durante el alta o la autorización.</w:t>
+            </w:r>
+          </w:p>
+        </w:tc>
+        <w:tc>
+          <w:tcPr>
+            <w:tcW w:type="dxa" w:w="3135"/>
+          </w:tcPr>
+          <w:p>
+            <w:r>
+              <w:t>Mensaje genérico al Usuario/Administrador; no se persiste ningún cambio parcial.</w:t>
+            </w:r>
+          </w:p>
+        </w:tc>
+      </w:tr>
+    </w:tbl>
+    <w:p/>
+    <w:p>
+      <w:pPr>
+        <w:pStyle w:val="Heading2"/>
+      </w:pPr>
+      <w:r>
+        <w:t>Reglas de negocio</w:t>
+      </w:r>
+    </w:p>
+    <w:tbl>
+      <w:tblPr>
+        <w:tblStyle w:val="LightGrid-Accent1"/>
+        <w:tblW w:type="auto" w:w="0"/>
+        <w:tblLook w:firstColumn="1" w:firstRow="1" w:lastColumn="0" w:lastRow="0" w:noHBand="0" w:noVBand="1" w:val="04A0"/>
+      </w:tblPr>
+      <w:tblGrid>
+        <w:gridCol w:w="4703"/>
+        <w:gridCol w:w="4703"/>
+      </w:tblGrid>
+      <w:tr>
+        <w:tc>
+          <w:tcPr>
+            <w:tcW w:type="dxa" w:w="4703"/>
+            <w:shd w:val="clear" w:color="auto" w:fill="DAE3F3"/>
+          </w:tcPr>
+          <w:p>
+            <w:r>
+              <w:rPr>
+                <w:b/>
+              </w:rPr>
+              <w:t>Código</w:t>
+            </w:r>
+          </w:p>
+        </w:tc>
+        <w:tc>
+          <w:tcPr>
+            <w:tcW w:type="dxa" w:w="4703"/>
+            <w:shd w:val="clear" w:color="auto" w:fill="DAE3F3"/>
+          </w:tcPr>
+          <w:p>
+            <w:r>
+              <w:rPr>
+                <w:b/>
+              </w:rPr>
+              <w:t>Regla</w:t>
+            </w:r>
+          </w:p>
+        </w:tc>
+      </w:tr>
+      <w:tr>
+        <w:tc>
+          <w:tcPr>
+            <w:tcW w:type="dxa" w:w="4703"/>
+          </w:tcPr>
+          <w:p>
+            <w:r>
+              <w:t>RN-01</w:t>
+            </w:r>
+          </w:p>
+        </w:tc>
+        <w:tc>
+          <w:tcPr>
+            <w:tcW w:type="dxa" w:w="4703"/>
+          </w:tcPr>
+          <w:p>
+            <w:r>
+              <w:t>Separación de funciones: AUTORIZADO_POR nunca puede ser igual a CREADO_POR.</w:t>
+            </w:r>
+          </w:p>
+        </w:tc>
+      </w:tr>
+      <w:tr>
+        <w:tc>
+          <w:tcPr>
+            <w:tcW w:type="dxa" w:w="4703"/>
+          </w:tcPr>
+          <w:p>
+            <w:r>
+              <w:t>RN-02</w:t>
+            </w:r>
+          </w:p>
+        </w:tc>
+        <w:tc>
+          <w:tcPr>
+            <w:tcW w:type="dxa" w:w="4703"/>
+          </w:tcPr>
+          <w:p>
+            <w:r>
+              <w:t>El vino no es visible ni vendible en el catálogo hasta que AUTORIZADO_POR IS NOT NULL y ESTADO = 'Activo'.</w:t>
+            </w:r>
+          </w:p>
+        </w:tc>
+      </w:tr>
+      <w:tr>
+        <w:tc>
+          <w:tcPr>
+            <w:tcW w:type="dxa" w:w="4703"/>
+          </w:tcPr>
+          <w:p>
+            <w:r>
+              <w:t>RN-03</w:t>
+            </w:r>
+          </w:p>
+        </w:tc>
+        <w:tc>
+          <w:tcPr>
+            <w:tcW w:type="dxa" w:w="4703"/>
+          </w:tcPr>
+          <w:p>
+            <w:r>
+              <w:t>El código/SKU del vino es único en todo el catálogo.</w:t>
+            </w:r>
+          </w:p>
+        </w:tc>
+      </w:tr>
+    </w:tbl>
+    <w:p/>
+    <w:p>
+      <w:pPr>
+        <w:pStyle w:val="Heading2"/>
+      </w:pPr>
+      <w:r>
+        <w:t>Relaciones con otros casos de uso</w:t>
+      </w:r>
+    </w:p>
+    <w:tbl>
+      <w:tblPr>
+        <w:tblStyle w:val="LightGrid-Accent1"/>
+        <w:tblW w:type="auto" w:w="0"/>
+        <w:tblLook w:firstColumn="1" w:firstRow="1" w:lastColumn="0" w:lastRow="0" w:noHBand="0" w:noVBand="1" w:val="04A0"/>
+      </w:tblPr>
+      <w:tblGrid>
+        <w:gridCol w:w="3135"/>
+        <w:gridCol w:w="3135"/>
+        <w:gridCol w:w="3135"/>
+      </w:tblGrid>
+      <w:tr>
+        <w:tc>
+          <w:tcPr>
+            <w:tcW w:type="dxa" w:w="3135"/>
+            <w:shd w:val="clear" w:color="auto" w:fill="DAE3F3"/>
+          </w:tcPr>
+          <w:p>
+            <w:r>
+              <w:rPr>
+                <w:b/>
+              </w:rPr>
+              <w:t>Tipo</w:t>
+            </w:r>
+          </w:p>
+        </w:tc>
+        <w:tc>
+          <w:tcPr>
+            <w:tcW w:type="dxa" w:w="3135"/>
+            <w:shd w:val="clear" w:color="auto" w:fill="DAE3F3"/>
+          </w:tcPr>
+          <w:p>
+            <w:r>
+              <w:rPr>
+                <w:b/>
+              </w:rPr>
+              <w:t>Destino</w:t>
+            </w:r>
+          </w:p>
+        </w:tc>
+        <w:tc>
+          <w:tcPr>
+            <w:tcW w:type="dxa" w:w="3135"/>
+            <w:shd w:val="clear" w:color="auto" w:fill="DAE3F3"/>
+          </w:tcPr>
+          <w:p>
+            <w:r>
+              <w:rPr>
+                <w:b/>
+              </w:rPr>
+              <w:t>Condición</w:t>
+            </w:r>
+          </w:p>
+        </w:tc>
+      </w:tr>
+      <w:tr>
+        <w:tc>
+          <w:tcPr>
+            <w:tcW w:type="dxa" w:w="3135"/>
+          </w:tcPr>
+          <w:p>
+            <w:r>
+              <w:t>«extend» de</w:t>
+            </w:r>
+          </w:p>
+        </w:tc>
+        <w:tc>
+          <w:tcPr>
+            <w:tcW w:type="dxa" w:w="3135"/>
+          </w:tcPr>
+          <w:p>
+            <w:r>
+              <w:t>CU-22 Registrar Movimiento de Stock</w:t>
+            </w:r>
+          </w:p>
+        </w:tc>
+        <w:tc>
+          <w:tcPr>
+            <w:tcW w:type="dxa" w:w="3135"/>
+          </w:tcPr>
+          <w:p>
+            <w:r>
+              <w:t>Un vino recién publicado suele recibir su primera entrada de stock.</w:t>
+            </w:r>
+          </w:p>
+        </w:tc>
+      </w:tr>
+    </w:tbl>
+    <w:p/>
+    <w:p>
+      <w:pPr>
+        <w:pStyle w:val="Heading2"/>
+      </w:pPr>
+      <w:r>
+        <w:t>Diagrama de clases afectadas</w:t>
+      </w:r>
+    </w:p>
+    <w:p>
+      <w:r>
+        <w:drawing>
+          <wp:inline xmlns:a="http://schemas.openxmlformats.org/drawingml/2006/main" xmlns:pic="http://schemas.openxmlformats.org/drawingml/2006/picture">
+            <wp:extent cx="5400000" cy="1462718"/>
+            <wp:docPr id="1" name="Picture 1"/>
+            <wp:cNvGraphicFramePr>
+              <a:graphicFrameLocks noChangeAspect="1"/>
+            </wp:cNvGraphicFramePr>
+            <a:graphic>
+              <a:graphicData uri="http://schemas.openxmlformats.org/drawingml/2006/picture">
+                <pic:pic>
+                  <pic:nvPicPr>
+                    <pic:cNvPr id="0" name="DiagramaClases_CatalogoStock.png"/>
+                    <pic:cNvPicPr/>
+                  </pic:nvPicPr>
+                  <pic:blipFill>
+                    <a:blip r:embed="rId9"/>
+                    <a:stretch>
+                      <a:fillRect/>
+                    </a:stretch>
+                  </pic:blipFill>
+                  <pic:spPr>
+                    <a:xfrm>
+                      <a:off x="0" y="0"/>
+                      <a:ext cx="5400000" cy="1462718"/>
+                    </a:xfrm>
+                    <a:prstGeom prst="rect"/>
+                  </pic:spPr>
+                </pic:pic>
+              </a:graphicData>
+            </a:graphic>
+          </wp:inline>
+        </w:drawing>
+      </w:r>
+    </w:p>
+    <w:p/>
+    <w:p>
+      <w:pPr>
+        <w:pStyle w:val="Heading2"/>
+      </w:pPr>
+      <w:r>
+        <w:t>Diagrama de secuencia</w:t>
+      </w:r>
+    </w:p>
+    <w:p>
+      <w:r>
+        <w:drawing>
+          <wp:inline xmlns:a="http://schemas.openxmlformats.org/drawingml/2006/main" xmlns:pic="http://schemas.openxmlformats.org/drawingml/2006/picture">
+            <wp:extent cx="5400000" cy="5495318"/>
+            <wp:docPr id="2" name="Picture 2"/>
+            <wp:cNvGraphicFramePr>
+              <a:graphicFrameLocks noChangeAspect="1"/>
+            </wp:cNvGraphicFramePr>
+            <a:graphic>
+              <a:graphicData uri="http://schemas.openxmlformats.org/drawingml/2006/picture">
+                <pic:pic>
+                  <pic:nvPicPr>
+                    <pic:cNvPr id="0" name="DiagramaSecuencia_CU21_ProponerYAutorizarAltaVino.png"/>
+                    <pic:cNvPicPr/>
+                  </pic:nvPicPr>
+                  <pic:blipFill>
+                    <a:blip r:embed="rId10"/>
+                    <a:stretch>
+                      <a:fillRect/>
+                    </a:stretch>
+                  </pic:blipFill>
+                  <pic:spPr>
+                    <a:xfrm>
+                      <a:off x="0" y="0"/>
+                      <a:ext cx="5400000" cy="5495318"/>
+                    </a:xfrm>
+                    <a:prstGeom prst="rect"/>
+                  </pic:spPr>
+                </pic:pic>
+              </a:graphicData>
+            </a:graphic>
+          </wp:inline>
+        </w:drawing>
+      </w:r>
+    </w:p>
+    <w:p/>
+    <w:p>
+      <w:pPr>
+        <w:pStyle w:val="Heading2"/>
+      </w:pPr>
+      <w:r>
+        <w:t>DER — entidades afectadas</w:t>
+      </w:r>
+    </w:p>
+    <w:p>
+      <w:r>
+        <w:drawing>
+          <wp:inline xmlns:a="http://schemas.openxmlformats.org/drawingml/2006/main" xmlns:pic="http://schemas.openxmlformats.org/drawingml/2006/picture">
+            <wp:extent cx="5400000" cy="2336185"/>
+            <wp:docPr id="3" name="Picture 3"/>
+            <wp:cNvGraphicFramePr>
+              <a:graphicFrameLocks noChangeAspect="1"/>
+            </wp:cNvGraphicFramePr>
+            <a:graphic>
+              <a:graphicData uri="http://schemas.openxmlformats.org/drawingml/2006/picture">
+                <pic:pic>
+                  <pic:nvPicPr>
+                    <pic:cNvPr id="0" name="DER.png"/>
+                    <pic:cNvPicPr/>
+                  </pic:nvPicPr>
+                  <pic:blipFill>
+                    <a:blip r:embed="rId11"/>
+                    <a:stretch>
+                      <a:fillRect/>
+                    </a:stretch>
+                  </pic:blipFill>
+                  <pic:spPr>
+                    <a:xfrm>
+                      <a:off x="0" y="0"/>
+                      <a:ext cx="5400000" cy="2336185"/>
+                    </a:xfrm>
+                    <a:prstGeom prst="rect"/>
+                  </pic:spPr>
+                </pic:pic>
+              </a:graphicData>
+            </a:graphic>
+          </wp:inline>
+        </w:drawing>
+      </w:r>
+    </w:p>
+    <w:p/>
+    <w:p>
+      <w:r>
+        <w:t>Entidades afectadas: VINO, BODEGA, USUARIO</w:t>
+      </w:r>
+    </w:p>
+    <w:p>
+      <w:pPr>
+        <w:pStyle w:val="Heading2"/>
+      </w:pPr>
+      <w:r>
+        <w:t>Prototipo de interfaz de usuario</w:t>
+      </w:r>
+    </w:p>
+    <w:p>
+      <w:r>
+        <w:rPr>
+          <w:rFonts w:ascii="Consolas" w:hAnsi="Consolas"/>
+          <w:sz w:val="16"/>
+        </w:rPr>
+        <w:t>frmNuevoVino (WinForms — MaterialForm)</w:t>
+        <w:br/>
+        <w:t>+-------------------------------------------+</w:t>
+        <w:br/>
+        <w:t>|  Nuevo Vino                          [x]   |</w:t>
+        <w:br/>
+        <w:t>+---------------------------------------------+</w:t>
+        <w:br/>
+        <w:t>| Codigo/SKU:      [____________]              |</w:t>
+        <w:br/>
+        <w:t>| Nombre:          [____________]              |</w:t>
+        <w:br/>
+        <w:t>| Bodega:          [ ComboBox  v]              |</w:t>
+        <w:br/>
+        <w:t>| Varietal:        [____________]              |</w:t>
+        <w:br/>
+        <w:t>| Aniada:          [____]                      |</w:t>
+        <w:br/>
+        <w:t>| Precio:          [____________]              |</w:t>
+        <w:br/>
+        <w:t>| Stock minimo:    [____]                      |</w:t>
+        <w:br/>
+        <w:t>| Maridaje:        [____________] (opcional)   |</w:t>
+        <w:br/>
+        <w:t>| Puntaje:         [____] (opcional)           |</w:t>
+        <w:br/>
+        <w:t>|                                               |</w:t>
+        <w:br/>
+        <w:t>|              [ Aceptar ]  [ Cancelar ]        |</w:t>
+        <w:br/>
+        <w:t>+-----------------------------------------------+</w:t>
+        <w:br/>
+        <w:br/>
+        <w:t>frmAutorizarVinos (WinForms — MaterialForm)</w:t>
+        <w:br/>
+        <w:t>+-------------------------------------------------+</w:t>
+        <w:br/>
+        <w:t>|  Vinos pendientes de autorizacion         [x]    |</w:t>
+        <w:br/>
+        <w:t>+---------------------------------------------------+</w:t>
+        <w:br/>
+        <w:t>| [DataGridView: Codigo | Nombre | Bodega |          |</w:t>
+        <w:br/>
+        <w:t>|  Cargado por | Fecha alta]                         |</w:t>
+        <w:br/>
+        <w:t>|                                                     |</w:t>
+        <w:br/>
+        <w:t>|              [ Autorizar ]  [ Rechazar ]           |</w:t>
+        <w:br/>
+        <w:t>+-----------------------------------------------------+</w:t>
+      </w:r>
+    </w:p>
+    <w:p>
+      <w:pPr>
+        <w:pStyle w:val="Heading2"/>
+      </w:pPr>
+      <w:r>
+        <w:t>Observaciones</w:t>
+      </w:r>
+    </w:p>
+    <w:p>
+      <w:r>
+        <w:t>El vino no elimina físicamente en ningún momento del ciclo de vida (RN-04 del dominio) — solo cambia de estado; ver CU-23 para la descontinuación.</w:t>
+      </w:r>
+    </w:p>
+    <w:p>
+      <w:r>
+        <w:br w:type="page"/>
+      </w:r>
+    </w:p>
+    <w:p>
+      <w:pPr>
+        <w:pStyle w:val="Heading1"/>
+      </w:pPr>
+      <w:r>
+        <w:t>CU-22 — Registrar Movimiento de Stock</w:t>
+      </w:r>
+    </w:p>
+    <w:tbl>
+      <w:tblPr>
+        <w:tblStyle w:val="LightGrid-Accent1"/>
+        <w:tblW w:type="auto" w:w="0"/>
+        <w:tblLook w:firstColumn="1" w:firstRow="1" w:lastColumn="0" w:lastRow="0" w:noHBand="0" w:noVBand="1" w:val="04A0"/>
+      </w:tblPr>
+      <w:tblGrid>
+        <w:gridCol w:w="4703"/>
+        <w:gridCol w:w="4703"/>
+      </w:tblGrid>
+      <w:tr>
+        <w:tc>
+          <w:tcPr>
+            <w:tcW w:type="dxa" w:w="4703"/>
+            <w:shd w:val="clear" w:color="auto" w:fill="DAE3F3"/>
+          </w:tcPr>
+          <w:p>
+            <w:r>
+              <w:rPr>
+                <w:b/>
+              </w:rPr>
+              <w:t>Versión</w:t>
+            </w:r>
+          </w:p>
+        </w:tc>
+        <w:tc>
+          <w:tcPr>
+            <w:tcW w:type="dxa" w:w="4703"/>
+          </w:tcPr>
+          <w:p>
+            <w:r>
+              <w:t>1.0</w:t>
+            </w:r>
+          </w:p>
+        </w:tc>
+      </w:tr>
+      <w:tr>
+        <w:tc>
+          <w:tcPr>
+            <w:tcW w:type="dxa" w:w="4703"/>
+            <w:shd w:val="clear" w:color="auto" w:fill="DAE3F3"/>
+          </w:tcPr>
+          <w:p>
+            <w:r>
+              <w:rPr>
+                <w:b/>
+              </w:rPr>
+              <w:t>Fecha</w:t>
+            </w:r>
+          </w:p>
+        </w:tc>
+        <w:tc>
+          <w:tcPr>
+            <w:tcW w:type="dxa" w:w="4703"/>
+          </w:tcPr>
+          <w:p>
+            <w:r>
+              <w:t>30/08/2026</w:t>
+            </w:r>
+          </w:p>
+        </w:tc>
+      </w:tr>
+      <w:tr>
+        <w:tc>
+          <w:tcPr>
+            <w:tcW w:type="dxa" w:w="4703"/>
+            <w:shd w:val="clear" w:color="auto" w:fill="DAE3F3"/>
+          </w:tcPr>
+          <w:p>
+            <w:r>
+              <w:rPr>
+                <w:b/>
+              </w:rPr>
+              <w:t>Autor</w:t>
+            </w:r>
+          </w:p>
+        </w:tc>
+        <w:tc>
+          <w:tcPr>
+            <w:tcW w:type="dxa" w:w="4703"/>
+          </w:tcPr>
+          <w:p>
+            <w:r>
+              <w:t>Equipo TP — Ingeniería de Software</w:t>
+            </w:r>
+          </w:p>
+        </w:tc>
+      </w:tr>
+    </w:tbl>
+    <w:p/>
+    <w:tbl>
+      <w:tblPr>
+        <w:tblStyle w:val="LightGrid-Accent1"/>
+        <w:tblW w:type="auto" w:w="0"/>
+        <w:tblLook w:firstColumn="1" w:firstRow="1" w:lastColumn="0" w:lastRow="0" w:noHBand="0" w:noVBand="1" w:val="04A0"/>
+      </w:tblPr>
+      <w:tblGrid>
+        <w:gridCol w:w="4703"/>
+        <w:gridCol w:w="4703"/>
+      </w:tblGrid>
+      <w:tr>
+        <w:tc>
+          <w:tcPr>
+            <w:tcW w:type="dxa" w:w="4703"/>
+            <w:shd w:val="clear" w:color="auto" w:fill="DAE3F3"/>
+          </w:tcPr>
+          <w:p>
+            <w:r>
+              <w:rPr>
+                <w:b/>
+              </w:rPr>
+              <w:t>Identificador</w:t>
+            </w:r>
+          </w:p>
+        </w:tc>
+        <w:tc>
+          <w:tcPr>
+            <w:tcW w:type="dxa" w:w="4703"/>
+          </w:tcPr>
+          <w:p>
+            <w:r>
+              <w:t>CU-22</w:t>
+            </w:r>
+          </w:p>
+        </w:tc>
+      </w:tr>
+      <w:tr>
+        <w:tc>
+          <w:tcPr>
+            <w:tcW w:type="dxa" w:w="4703"/>
+            <w:shd w:val="clear" w:color="auto" w:fill="DAE3F3"/>
+          </w:tcPr>
+          <w:p>
+            <w:r>
+              <w:rPr>
+                <w:b/>
+              </w:rPr>
+              <w:t>Nombre</w:t>
+            </w:r>
+          </w:p>
+        </w:tc>
+        <w:tc>
+          <w:tcPr>
+            <w:tcW w:type="dxa" w:w="4703"/>
+          </w:tcPr>
+          <w:p>
+            <w:r>
+              <w:t>Registrar Movimiento de Stock</w:t>
+            </w:r>
+          </w:p>
+        </w:tc>
+      </w:tr>
+      <w:tr>
+        <w:tc>
+          <w:tcPr>
+            <w:tcW w:type="dxa" w:w="4703"/>
+            <w:shd w:val="clear" w:color="auto" w:fill="DAE3F3"/>
+          </w:tcPr>
+          <w:p>
+            <w:r>
+              <w:rPr>
+                <w:b/>
+              </w:rPr>
+              <w:t>Actor primario</w:t>
+            </w:r>
+          </w:p>
+        </w:tc>
+        <w:tc>
+          <w:tcPr>
+            <w:tcW w:type="dxa" w:w="4703"/>
+          </w:tcPr>
+          <w:p>
+            <w:r>
+              <w:t>Usuario</w:t>
+            </w:r>
+          </w:p>
+        </w:tc>
+      </w:tr>
+      <w:tr>
+        <w:tc>
+          <w:tcPr>
+            <w:tcW w:type="dxa" w:w="4703"/>
+            <w:shd w:val="clear" w:color="auto" w:fill="DAE3F3"/>
+          </w:tcPr>
+          <w:p>
+            <w:r>
+              <w:rPr>
+                <w:b/>
+              </w:rPr>
+              <w:t>Frecuencia</w:t>
+            </w:r>
+          </w:p>
+        </w:tc>
+        <w:tc>
+          <w:tcPr>
+            <w:tcW w:type="dxa" w:w="4703"/>
+          </w:tcPr>
+          <w:p>
+            <w:r>
+              <w:t>Alta</w:t>
+            </w:r>
+          </w:p>
+        </w:tc>
+      </w:tr>
+      <w:tr>
+        <w:tc>
+          <w:tcPr>
+            <w:tcW w:type="dxa" w:w="4703"/>
+            <w:shd w:val="clear" w:color="auto" w:fill="DAE3F3"/>
+          </w:tcPr>
+          <w:p>
+            <w:r>
+              <w:rPr>
+                <w:b/>
+              </w:rPr>
+              <w:t>Prioridad</w:t>
+            </w:r>
+          </w:p>
+        </w:tc>
+        <w:tc>
+          <w:tcPr>
+            <w:tcW w:type="dxa" w:w="4703"/>
+          </w:tcPr>
+          <w:p>
+            <w:r>
+              <w:t>Alta</w:t>
+            </w:r>
+          </w:p>
+        </w:tc>
+      </w:tr>
+    </w:tbl>
+    <w:p/>
+    <w:p>
+      <w:pPr>
+        <w:pStyle w:val="Heading2"/>
+      </w:pPr>
+      <w:r>
+        <w:t>Historial de revisión</w:t>
+      </w:r>
+    </w:p>
+    <w:tbl>
+      <w:tblPr>
+        <w:tblStyle w:val="LightGrid-Accent1"/>
+        <w:tblW w:type="auto" w:w="0"/>
+        <w:tblLook w:firstColumn="1" w:firstRow="1" w:lastColumn="0" w:lastRow="0" w:noHBand="0" w:noVBand="1" w:val="04A0"/>
+      </w:tblPr>
+      <w:tblGrid>
+        <w:gridCol w:w="2351"/>
+        <w:gridCol w:w="2351"/>
+        <w:gridCol w:w="2351"/>
+        <w:gridCol w:w="2351"/>
+      </w:tblGrid>
+      <w:tr>
+        <w:tc>
+          <w:tcPr>
+            <w:tcW w:type="dxa" w:w="2351"/>
+            <w:shd w:val="clear" w:color="auto" w:fill="DAE3F3"/>
+          </w:tcPr>
+          <w:p>
+            <w:r>
+              <w:rPr>
+                <w:b/>
+              </w:rPr>
+              <w:t>Versión</w:t>
+            </w:r>
+          </w:p>
+        </w:tc>
+        <w:tc>
+          <w:tcPr>
+            <w:tcW w:type="dxa" w:w="2351"/>
+            <w:shd w:val="clear" w:color="auto" w:fill="DAE3F3"/>
+          </w:tcPr>
+          <w:p>
+            <w:r>
+              <w:rPr>
+                <w:b/>
+              </w:rPr>
+              <w:t>Fecha</w:t>
+            </w:r>
+          </w:p>
+        </w:tc>
+        <w:tc>
+          <w:tcPr>
+            <w:tcW w:type="dxa" w:w="2351"/>
+            <w:shd w:val="clear" w:color="auto" w:fill="DAE3F3"/>
+          </w:tcPr>
+          <w:p>
+            <w:r>
+              <w:rPr>
+                <w:b/>
+              </w:rPr>
+              <w:t>Autor</w:t>
+            </w:r>
+          </w:p>
+        </w:tc>
+        <w:tc>
+          <w:tcPr>
+            <w:tcW w:type="dxa" w:w="2351"/>
+            <w:shd w:val="clear" w:color="auto" w:fill="DAE3F3"/>
+          </w:tcPr>
+          <w:p>
+            <w:r>
+              <w:rPr>
+                <w:b/>
+              </w:rPr>
+              <w:t>Descripción</w:t>
+            </w:r>
+          </w:p>
+        </w:tc>
+      </w:tr>
+      <w:tr>
+        <w:tc>
+          <w:tcPr>
+            <w:tcW w:type="dxa" w:w="2351"/>
+          </w:tcPr>
+          <w:p>
+            <w:r>
+              <w:t>1.0</w:t>
+            </w:r>
+          </w:p>
+        </w:tc>
+        <w:tc>
+          <w:tcPr>
+            <w:tcW w:type="dxa" w:w="2351"/>
+          </w:tcPr>
+          <w:p>
+            <w:r>
+              <w:t>30/08/2026</w:t>
+            </w:r>
+          </w:p>
+        </w:tc>
+        <w:tc>
+          <w:tcPr>
+            <w:tcW w:type="dxa" w:w="2351"/>
+          </w:tcPr>
+          <w:p>
+            <w:r>
+              <w:t>Equipo TP</w:t>
+            </w:r>
+          </w:p>
+        </w:tc>
+        <w:tc>
+          <w:tcPr>
+            <w:tcW w:type="dxa" w:w="2351"/>
+          </w:tcPr>
+          <w:p>
+            <w:r>
+              <w:t>Versión inicial — Entrega 1 (análisis y diseño). Fusiona las propuestas previas CU-23 (entrada) y CU-24 (salida) en un único caso de uso con flujo principal y alternativo.</w:t>
+            </w:r>
+          </w:p>
+        </w:tc>
+      </w:tr>
+    </w:tbl>
+    <w:p/>
+    <w:p>
+      <w:pPr>
+        <w:pStyle w:val="Heading2"/>
+      </w:pPr>
+      <w:r>
+        <w:t>Objetivo</w:t>
+      </w:r>
+    </w:p>
+    <w:p>
+      <w:r>
+        <w:t>Registrar toda variación de stock de un vino (entrada por compra a bodega/proveedor, salida por pedido) como un movimiento inmutable de kardex, del cual el stock actual es un valor derivado y reconciliable (RN-02 del dominio).</w:t>
+      </w:r>
+    </w:p>
+    <w:p>
+      <w:pPr>
+        <w:pStyle w:val="Heading2"/>
+      </w:pPr>
+      <w:r>
+        <w:t>Precondiciones</w:t>
+      </w:r>
+    </w:p>
+    <w:p>
+      <w:pPr>
+        <w:pStyle w:val="ListBullet"/>
+      </w:pPr>
+      <w:r>
+        <w:t>El Usuario inició sesión correctamente y tiene el permiso "Gestionar catálogo de vinos".</w:t>
+      </w:r>
+    </w:p>
+    <w:p>
+      <w:pPr>
+        <w:pStyle w:val="ListBullet"/>
+      </w:pPr>
+      <w:r>
+        <w:t>El vino sobre el que se registra el movimiento existe en VINO.</w:t>
+      </w:r>
+    </w:p>
+    <w:p>
+      <w:pPr>
+        <w:pStyle w:val="Heading2"/>
+      </w:pPr>
+      <w:r>
+        <w:t>Postcondiciones</w:t>
+      </w:r>
+    </w:p>
+    <w:p>
+      <w:pPr>
+        <w:pStyle w:val="Heading3"/>
+      </w:pPr>
+      <w:r>
+        <w:t>En caso de éxito</w:t>
+      </w:r>
+    </w:p>
+    <w:p>
+      <w:pPr>
+        <w:pStyle w:val="ListBullet"/>
+      </w:pPr>
+      <w:r>
+        <w:t>Se crea un registro en MOVIMIENTO_STOCK (fecha, tipo, cantidad, motivo, responsable, referencia).</w:t>
+      </w:r>
+    </w:p>
+    <w:p>
+      <w:pPr>
+        <w:pStyle w:val="ListBullet"/>
+      </w:pPr>
+      <w:r>
+        <w:t>El stock actual derivado del vino queda actualizado (SUM(Entrada) - SUM(Salida)).</w:t>
+      </w:r>
+    </w:p>
+    <w:p>
+      <w:pPr>
+        <w:pStyle w:val="Heading3"/>
+      </w:pPr>
+      <w:r>
+        <w:t>En caso de fallo</w:t>
+      </w:r>
+    </w:p>
+    <w:p>
+      <w:pPr>
+        <w:pStyle w:val="ListBullet"/>
+      </w:pPr>
+      <w:r>
+        <w:t>Si la salida dejaría el stock resultante por debajo de cero: el movimiento se rechaza y no se persiste (RN-03).</w:t>
+      </w:r>
+    </w:p>
+    <w:p>
+      <w:pPr>
+        <w:pStyle w:val="Heading2"/>
+      </w:pPr>
+      <w:r>
+        <w:t>Evento disparador</w:t>
+      </w:r>
+    </w:p>
+    <w:p>
+      <w:r>
+        <w:t>El Usuario abre frmMovimientoStock, selecciona un vino y registra una entrada o una salida.</w:t>
+      </w:r>
+    </w:p>
+    <w:p>
+      <w:pPr>
+        <w:pStyle w:val="Heading2"/>
+      </w:pPr>
+      <w:r>
+        <w:t>Puntos de extensión</w:t>
+      </w:r>
+    </w:p>
+    <w:tbl>
+      <w:tblPr>
+        <w:tblStyle w:val="LightGrid-Accent1"/>
+        <w:tblW w:type="auto" w:w="0"/>
+        <w:tblLook w:firstColumn="1" w:firstRow="1" w:lastColumn="0" w:lastRow="0" w:noHBand="0" w:noVBand="1" w:val="04A0"/>
+      </w:tblPr>
+      <w:tblGrid>
+        <w:gridCol w:w="4703"/>
+        <w:gridCol w:w="4703"/>
+      </w:tblGrid>
+      <w:tr>
+        <w:tc>
+          <w:tcPr>
+            <w:tcW w:type="dxa" w:w="4703"/>
+            <w:shd w:val="clear" w:color="auto" w:fill="DAE3F3"/>
+          </w:tcPr>
+          <w:p>
+            <w:r>
+              <w:rPr>
+                <w:b/>
+              </w:rPr>
+              <w:t>Paso</w:t>
+            </w:r>
+          </w:p>
+        </w:tc>
+        <w:tc>
+          <w:tcPr>
+            <w:tcW w:type="dxa" w:w="4703"/>
+            <w:shd w:val="clear" w:color="auto" w:fill="DAE3F3"/>
+          </w:tcPr>
+          <w:p>
+            <w:r>
+              <w:rPr>
+                <w:b/>
+              </w:rPr>
+              <w:t>Extensión posible</w:t>
+            </w:r>
+          </w:p>
+        </w:tc>
+      </w:tr>
+      <w:tr>
+        <w:tc>
+          <w:tcPr>
+            <w:tcW w:type="dxa" w:w="4703"/>
+          </w:tcPr>
+          <w:p>
+            <w:r>
+              <w:t>Tras cualquier movimiento registrado</w:t>
+            </w:r>
+          </w:p>
+        </w:tc>
+        <w:tc>
+          <w:tcPr>
+            <w:tcW w:type="dxa" w:w="4703"/>
+          </w:tcPr>
+          <w:p>
+            <w:r>
+              <w:t>Recalcular y notificar si el vino queda por debajo de STOCK_MINIMO — la notificación activa es fuera de alcance; ver CU de soporte Consultar Alerta de Stock Mínimo (consulta pasiva).</w:t>
+            </w:r>
+          </w:p>
+        </w:tc>
+      </w:tr>
+    </w:tbl>
+    <w:p/>
+    <w:p>
+      <w:pPr>
+        <w:pStyle w:val="Heading2"/>
+      </w:pPr>
+      <w:r>
+        <w:t>Gráfico del caso de uso</w:t>
+      </w:r>
+    </w:p>
+    <w:p>
+      <w:r>
+        <w:rPr>
+          <w:rFonts w:ascii="Consolas" w:hAnsi="Consolas"/>
+          <w:sz w:val="18"/>
+        </w:rPr>
+        <w:t>Actor: Usuario (permiso "Gestionar catálogo de vinos")</w:t>
+        <w:br/>
+        <w:t xml:space="preserve">  ──&gt; (Registrar Movimiento de Stock)</w:t>
+        <w:br/>
+        <w:br/>
+        <w:t>(Registrar Movimiento de Stock) incluye dos variantes internas:</w:t>
+        <w:br/>
+        <w:t xml:space="preserve">  - Entrada por compra a bodega/proveedor (flujo principal)</w:t>
+        <w:br/>
+        <w:t xml:space="preserve">  - Salida por pedido, con rechazo si el stock resultante es negativo (flujo alternativo)</w:t>
+      </w:r>
+    </w:p>
+    <w:p/>
+    <w:p>
+      <w:pPr>
+        <w:pStyle w:val="Heading2"/>
+      </w:pPr>
+      <w:r>
+        <w:t>Flujo principal</w:t>
+      </w:r>
+    </w:p>
+    <w:p>
+      <w:pPr>
+        <w:pStyle w:val="ListNumber"/>
+      </w:pPr>
+      <w:r>
+        <w:t>El Usuario abre frmMovimientoStock y selecciona un vino.</w:t>
+      </w:r>
+    </w:p>
+    <w:p>
+      <w:pPr>
+        <w:pStyle w:val="ListNumber"/>
+      </w:pPr>
+      <w:r>
+        <w:t>El sistema calcula y muestra el stock actual (derivado del kardex).</w:t>
+      </w:r>
+    </w:p>
+    <w:p>
+      <w:pPr>
+        <w:pStyle w:val="ListNumber"/>
+      </w:pPr>
+      <w:r>
+        <w:t>El Usuario ingresa tipo = Entrada, cantidad, motivo (compra) y referencia, y presiona Registrar.</w:t>
+      </w:r>
+    </w:p>
+    <w:p>
+      <w:pPr>
+        <w:pStyle w:val="ListNumber"/>
+      </w:pPr>
+      <w:r>
+        <w:t>El sistema valida que la cantidad sea mayor a cero.</w:t>
+      </w:r>
+    </w:p>
+    <w:p>
+      <w:pPr>
+        <w:pStyle w:val="ListNumber"/>
+      </w:pPr>
+      <w:r>
+        <w:t>El sistema inserta el movimiento en MOVIMIENTO_STOCK con tipo Entrada.</w:t>
+      </w:r>
+    </w:p>
+    <w:p>
+      <w:pPr>
+        <w:pStyle w:val="ListNumber"/>
+      </w:pPr>
+      <w:r>
+        <w:t>El sistema recalcula el stock actual y refresca la pantalla.</w:t>
+      </w:r>
+    </w:p>
+    <w:p>
+      <w:pPr>
+        <w:pStyle w:val="Heading2"/>
+      </w:pPr>
+      <w:r>
+        <w:t>Flujos alternativos</w:t>
+      </w:r>
+    </w:p>
+    <w:p>
+      <w:pPr>
+        <w:pStyle w:val="Heading3"/>
+      </w:pPr>
+      <w:r>
+        <w:t>4a. Cantidad menor o igual a cero</w:t>
+      </w:r>
+    </w:p>
+    <w:p>
+      <w:pPr>
+        <w:pStyle w:val="ListBullet"/>
+      </w:pPr>
+      <w:r>
+        <w:t>El sistema muestra "La cantidad debe ser mayor a cero."</w:t>
+      </w:r>
+    </w:p>
+    <w:p>
+      <w:pPr>
+        <w:pStyle w:val="ListBullet"/>
+      </w:pPr>
+      <w:r>
+        <w:t>El caso de uso vuelve al paso 3.</w:t>
+      </w:r>
+    </w:p>
+    <w:p>
+      <w:pPr>
+        <w:pStyle w:val="Heading3"/>
+      </w:pPr>
+      <w:r>
+        <w:t>3b. Salida de stock por pedido</w:t>
+      </w:r>
+    </w:p>
+    <w:p>
+      <w:pPr>
+        <w:pStyle w:val="ListBullet"/>
+      </w:pPr>
+      <w:r>
+        <w:t>El Usuario selecciona tipo = Salida, ingresa cantidad y motivo (pedido), y presiona Registrar.</w:t>
+      </w:r>
+    </w:p>
+    <w:p>
+      <w:pPr>
+        <w:pStyle w:val="ListBullet"/>
+      </w:pPr>
+      <w:r>
+        <w:t>El sistema calcula el stock resultante (stock actual - cantidad).</w:t>
+      </w:r>
+    </w:p>
+    <w:p>
+      <w:pPr>
+        <w:pStyle w:val="ListBullet"/>
+      </w:pPr>
+      <w:r>
+        <w:t>Si el resultado es negativo (RN-03), el sistema rechaza el movimiento y muestra "No hay stock suficiente para esta salida."; no se persiste ningún registro.</w:t>
+      </w:r>
+    </w:p>
+    <w:p>
+      <w:pPr>
+        <w:pStyle w:val="ListBullet"/>
+      </w:pPr>
+      <w:r>
+        <w:t>Si el resultado es válido, el sistema inserta el movimiento con tipo Salida y refresca el stock actual.</w:t>
+      </w:r>
+    </w:p>
+    <w:p>
+      <w:pPr>
+        <w:pStyle w:val="Heading2"/>
+      </w:pPr>
+      <w:r>
+        <w:t>Reglas de negocio</w:t>
+      </w:r>
+    </w:p>
+    <w:tbl>
+      <w:tblPr>
+        <w:tblStyle w:val="LightGrid-Accent1"/>
+        <w:tblW w:type="auto" w:w="0"/>
+        <w:tblLook w:firstColumn="1" w:firstRow="1" w:lastColumn="0" w:lastRow="0" w:noHBand="0" w:noVBand="1" w:val="04A0"/>
+      </w:tblPr>
+      <w:tblGrid>
+        <w:gridCol w:w="4703"/>
+        <w:gridCol w:w="4703"/>
+      </w:tblGrid>
+      <w:tr>
+        <w:tc>
+          <w:tcPr>
+            <w:tcW w:type="dxa" w:w="4703"/>
+            <w:shd w:val="clear" w:color="auto" w:fill="DAE3F3"/>
+          </w:tcPr>
+          <w:p>
+            <w:r>
+              <w:rPr>
+                <w:b/>
+              </w:rPr>
+              <w:t>Código</w:t>
+            </w:r>
+          </w:p>
+        </w:tc>
+        <w:tc>
+          <w:tcPr>
+            <w:tcW w:type="dxa" w:w="4703"/>
+            <w:shd w:val="clear" w:color="auto" w:fill="DAE3F3"/>
+          </w:tcPr>
+          <w:p>
+            <w:r>
+              <w:rPr>
+                <w:b/>
+              </w:rPr>
+              <w:t>Regla</w:t>
+            </w:r>
+          </w:p>
+        </w:tc>
+      </w:tr>
+      <w:tr>
+        <w:tc>
+          <w:tcPr>
+            <w:tcW w:type="dxa" w:w="4703"/>
+          </w:tcPr>
+          <w:p>
+            <w:r>
+              <w:t>RN-01</w:t>
+            </w:r>
+          </w:p>
+        </w:tc>
+        <w:tc>
+          <w:tcPr>
+            <w:tcW w:type="dxa" w:w="4703"/>
+          </w:tcPr>
+          <w:p>
+            <w:r>
+              <w:t>MOVIMIENTO_STOCK es append-only: no se permiten UPDATE ni DELETE sobre movimientos ya registrados.</w:t>
+            </w:r>
+          </w:p>
+        </w:tc>
+      </w:tr>
+      <w:tr>
+        <w:tc>
+          <w:tcPr>
+            <w:tcW w:type="dxa" w:w="4703"/>
+          </w:tcPr>
+          <w:p>
+            <w:r>
+              <w:t>RN-02</w:t>
+            </w:r>
+          </w:p>
+        </w:tc>
+        <w:tc>
+          <w:tcPr>
+            <w:tcW w:type="dxa" w:w="4703"/>
+          </w:tcPr>
+          <w:p>
+            <w:r>
+              <w:t>El stock actual de un vino nunca se almacena directamente — se deriva de SUM(Entrada) - SUM(Salida) del kardex.</w:t>
+            </w:r>
+          </w:p>
+        </w:tc>
+      </w:tr>
+      <w:tr>
+        <w:tc>
+          <w:tcPr>
+            <w:tcW w:type="dxa" w:w="4703"/>
+          </w:tcPr>
+          <w:p>
+            <w:r>
+              <w:t>RN-03</w:t>
+            </w:r>
+          </w:p>
+        </w:tc>
+        <w:tc>
+          <w:tcPr>
+            <w:tcW w:type="dxa" w:w="4703"/>
+          </w:tcPr>
+          <w:p>
+            <w:r>
+              <w:t>Toda salida que dejaría el stock resultante por debajo de cero se rechaza; no hay reservas ni backorder en esta fase.</w:t>
+            </w:r>
+          </w:p>
+        </w:tc>
+      </w:tr>
+    </w:tbl>
+    <w:p/>
+    <w:p>
+      <w:pPr>
+        <w:pStyle w:val="Heading2"/>
+      </w:pPr>
+      <w:r>
+        <w:t>Relaciones con otros casos de uso</w:t>
+      </w:r>
+    </w:p>
+    <w:tbl>
+      <w:tblPr>
+        <w:tblStyle w:val="LightGrid-Accent1"/>
+        <w:tblW w:type="auto" w:w="0"/>
+        <w:tblLook w:firstColumn="1" w:firstRow="1" w:lastColumn="0" w:lastRow="0" w:noHBand="0" w:noVBand="1" w:val="04A0"/>
+      </w:tblPr>
+      <w:tblGrid>
+        <w:gridCol w:w="3135"/>
+        <w:gridCol w:w="3135"/>
+        <w:gridCol w:w="3135"/>
+      </w:tblGrid>
+      <w:tr>
+        <w:tc>
+          <w:tcPr>
+            <w:tcW w:type="dxa" w:w="3135"/>
+            <w:shd w:val="clear" w:color="auto" w:fill="DAE3F3"/>
+          </w:tcPr>
+          <w:p>
+            <w:r>
+              <w:rPr>
+                <w:b/>
+              </w:rPr>
+              <w:t>Tipo</w:t>
+            </w:r>
+          </w:p>
+        </w:tc>
+        <w:tc>
+          <w:tcPr>
+            <w:tcW w:type="dxa" w:w="3135"/>
+            <w:shd w:val="clear" w:color="auto" w:fill="DAE3F3"/>
+          </w:tcPr>
+          <w:p>
+            <w:r>
+              <w:rPr>
+                <w:b/>
+              </w:rPr>
+              <w:t>Destino</w:t>
+            </w:r>
+          </w:p>
+        </w:tc>
+        <w:tc>
+          <w:tcPr>
+            <w:tcW w:type="dxa" w:w="3135"/>
+            <w:shd w:val="clear" w:color="auto" w:fill="DAE3F3"/>
+          </w:tcPr>
+          <w:p>
+            <w:r>
+              <w:rPr>
+                <w:b/>
+              </w:rPr>
+              <w:t>Condición</w:t>
+            </w:r>
+          </w:p>
+        </w:tc>
+      </w:tr>
+      <w:tr>
+        <w:tc>
+          <w:tcPr>
+            <w:tcW w:type="dxa" w:w="3135"/>
+          </w:tcPr>
+          <w:p>
+            <w:r>
+              <w:t>«extend» de</w:t>
+            </w:r>
+          </w:p>
+        </w:tc>
+        <w:tc>
+          <w:tcPr>
+            <w:tcW w:type="dxa" w:w="3135"/>
+          </w:tcPr>
+          <w:p>
+            <w:r>
+              <w:t>CU-21 Proponer y Autorizar Alta de Vino</w:t>
+            </w:r>
+          </w:p>
+        </w:tc>
+        <w:tc>
+          <w:tcPr>
+            <w:tcW w:type="dxa" w:w="3135"/>
+          </w:tcPr>
+          <w:p>
+            <w:r>
+              <w:t>Un vino recién autorizado puede recibir su primera entrada de stock.</w:t>
+            </w:r>
+          </w:p>
+        </w:tc>
+      </w:tr>
+    </w:tbl>
+    <w:p/>
+    <w:p>
+      <w:pPr>
+        <w:pStyle w:val="Heading2"/>
+      </w:pPr>
+      <w:r>
+        <w:t>Diagrama de clases afectadas</w:t>
+      </w:r>
+    </w:p>
+    <w:p>
+      <w:r>
+        <w:drawing>
+          <wp:inline xmlns:a="http://schemas.openxmlformats.org/drawingml/2006/main" xmlns:pic="http://schemas.openxmlformats.org/drawingml/2006/picture">
+            <wp:extent cx="5400000" cy="1462718"/>
+            <wp:docPr id="4" name="Picture 4"/>
+            <wp:cNvGraphicFramePr>
+              <a:graphicFrameLocks noChangeAspect="1"/>
+            </wp:cNvGraphicFramePr>
+            <a:graphic>
+              <a:graphicData uri="http://schemas.openxmlformats.org/drawingml/2006/picture">
+                <pic:pic>
+                  <pic:nvPicPr>
+                    <pic:cNvPr id="0" name="DiagramaClases_CatalogoStock.png"/>
+                    <pic:cNvPicPr/>
+                  </pic:nvPicPr>
+                  <pic:blipFill>
+                    <a:blip r:embed="rId9"/>
+                    <a:stretch>
+                      <a:fillRect/>
+                    </a:stretch>
+                  </pic:blipFill>
+                  <pic:spPr>
+                    <a:xfrm>
+                      <a:off x="0" y="0"/>
+                      <a:ext cx="5400000" cy="1462718"/>
+                    </a:xfrm>
+                    <a:prstGeom prst="rect"/>
+                  </pic:spPr>
+                </pic:pic>
+              </a:graphicData>
+            </a:graphic>
+          </wp:inline>
+        </w:drawing>
+      </w:r>
+    </w:p>
+    <w:p/>
+    <w:p>
+      <w:pPr>
+        <w:pStyle w:val="Heading2"/>
+      </w:pPr>
+      <w:r>
+        <w:t>Diagrama de secuencia</w:t>
+      </w:r>
+    </w:p>
+    <w:p>
+      <w:r>
+        <w:drawing>
+          <wp:inline xmlns:a="http://schemas.openxmlformats.org/drawingml/2006/main" xmlns:pic="http://schemas.openxmlformats.org/drawingml/2006/picture">
+            <wp:extent cx="5400000" cy="6588000"/>
+            <wp:docPr id="5" name="Picture 5"/>
+            <wp:cNvGraphicFramePr>
+              <a:graphicFrameLocks noChangeAspect="1"/>
+            </wp:cNvGraphicFramePr>
+            <a:graphic>
+              <a:graphicData uri="http://schemas.openxmlformats.org/drawingml/2006/picture">
+                <pic:pic>
+                  <pic:nvPicPr>
+                    <pic:cNvPr id="0" name="DiagramaSecuencia_CU22_RegistrarMovimientoStock.png"/>
+                    <pic:cNvPicPr/>
+                  </pic:nvPicPr>
+                  <pic:blipFill>
+                    <a:blip r:embed="rId12"/>
+                    <a:stretch>
+                      <a:fillRect/>
+                    </a:stretch>
+                  </pic:blipFill>
+                  <pic:spPr>
+                    <a:xfrm>
+                      <a:off x="0" y="0"/>
+                      <a:ext cx="5400000" cy="6588000"/>
+                    </a:xfrm>
+                    <a:prstGeom prst="rect"/>
+                  </pic:spPr>
+                </pic:pic>
+              </a:graphicData>
+            </a:graphic>
+          </wp:inline>
+        </w:drawing>
+      </w:r>
+    </w:p>
+    <w:p/>
+    <w:p>
+      <w:pPr>
+        <w:pStyle w:val="Heading2"/>
+      </w:pPr>
+      <w:r>
+        <w:t>DER — entidades afectadas</w:t>
+      </w:r>
+    </w:p>
+    <w:p>
+      <w:r>
+        <w:drawing>
+          <wp:inline xmlns:a="http://schemas.openxmlformats.org/drawingml/2006/main" xmlns:pic="http://schemas.openxmlformats.org/drawingml/2006/picture">
+            <wp:extent cx="5400000" cy="2336185"/>
+            <wp:docPr id="6" name="Picture 6"/>
+            <wp:cNvGraphicFramePr>
+              <a:graphicFrameLocks noChangeAspect="1"/>
+            </wp:cNvGraphicFramePr>
+            <a:graphic>
+              <a:graphicData uri="http://schemas.openxmlformats.org/drawingml/2006/picture">
+                <pic:pic>
+                  <pic:nvPicPr>
+                    <pic:cNvPr id="0" name="DER.png"/>
+                    <pic:cNvPicPr/>
+                  </pic:nvPicPr>
+                  <pic:blipFill>
+                    <a:blip r:embed="rId11"/>
+                    <a:stretch>
+                      <a:fillRect/>
+                    </a:stretch>
+                  </pic:blipFill>
+                  <pic:spPr>
+                    <a:xfrm>
+                      <a:off x="0" y="0"/>
+                      <a:ext cx="5400000" cy="2336185"/>
+                    </a:xfrm>
+                    <a:prstGeom prst="rect"/>
+                  </pic:spPr>
+                </pic:pic>
+              </a:graphicData>
+            </a:graphic>
+          </wp:inline>
+        </w:drawing>
+      </w:r>
+    </w:p>
+    <w:p/>
+    <w:p>
+      <w:r>
+        <w:t>Entidades afectadas: VINO, MOVIMIENTO_STOCK</w:t>
+      </w:r>
+    </w:p>
+    <w:p>
+      <w:pPr>
+        <w:pStyle w:val="Heading2"/>
+      </w:pPr>
+      <w:r>
+        <w:t>Prototipo de interfaz de usuario</w:t>
+      </w:r>
+    </w:p>
+    <w:p>
+      <w:r>
+        <w:rPr>
+          <w:rFonts w:ascii="Consolas" w:hAnsi="Consolas"/>
+          <w:sz w:val="16"/>
+        </w:rPr>
+        <w:t>frmMovimientoStock (WinForms — MaterialForm)</w:t>
+        <w:br/>
+        <w:t>+-----------------------------------------------------+</w:t>
+        <w:br/>
+        <w:t>|  Movimiento de Stock                          [x]    |</w:t>
+        <w:br/>
+        <w:t>+-------------------------------------------------------+</w:t>
+        <w:br/>
+        <w:t>| Vino:            [ ComboBox  v]                        |</w:t>
+        <w:br/>
+        <w:t>| Stock actual:    123 unidades  (solo lectura)           |</w:t>
+        <w:br/>
+        <w:t>|                                                         |</w:t>
+        <w:br/>
+        <w:t>| Tipo:            (o) Entrada   ( ) Salida               |</w:t>
+        <w:br/>
+        <w:t>| Cantidad:        [____]                                |</w:t>
+        <w:br/>
+        <w:t>| Motivo:          [____________]                        |</w:t>
+        <w:br/>
+        <w:t>| Referencia:      [____________] (opcional)             |</w:t>
+        <w:br/>
+        <w:t>|                                                         |</w:t>
+        <w:br/>
+        <w:t>|              [ Registrar ]  [ Cancelar ]               |</w:t>
+        <w:br/>
+        <w:t>+---------------------------------------------------------+</w:t>
+      </w:r>
+    </w:p>
+    <w:p>
+      <w:pPr>
+        <w:pStyle w:val="Heading2"/>
+      </w:pPr>
+      <w:r>
+        <w:t>Observaciones</w:t>
+      </w:r>
+    </w:p>
+    <w:p>
+      <w:r>
+        <w:t>RESPONSABLE se guarda como snapshot del login (VARCHAR), sin FK a USUARIO — mismo criterio que USUARIO_HISTORIAL: el registro histórico sobrevive a la baja del usuario.</w:t>
+      </w:r>
+    </w:p>
+    <w:p>
+      <w:r>
+        <w:br w:type="page"/>
+      </w:r>
+    </w:p>
+    <w:p>
+      <w:pPr>
+        <w:pStyle w:val="Heading1"/>
+      </w:pPr>
+      <w:r>
+        <w:t>CU-23 — Solicitar y Autorizar Descontinuación de Vino</w:t>
+      </w:r>
+    </w:p>
+    <w:tbl>
+      <w:tblPr>
+        <w:tblStyle w:val="LightGrid-Accent1"/>
+        <w:tblW w:type="auto" w:w="0"/>
+        <w:tblLook w:firstColumn="1" w:firstRow="1" w:lastColumn="0" w:lastRow="0" w:noHBand="0" w:noVBand="1" w:val="04A0"/>
+      </w:tblPr>
+      <w:tblGrid>
+        <w:gridCol w:w="4703"/>
+        <w:gridCol w:w="4703"/>
+      </w:tblGrid>
+      <w:tr>
+        <w:tc>
+          <w:tcPr>
+            <w:tcW w:type="dxa" w:w="4703"/>
+            <w:shd w:val="clear" w:color="auto" w:fill="DAE3F3"/>
+          </w:tcPr>
+          <w:p>
+            <w:r>
+              <w:rPr>
+                <w:b/>
+              </w:rPr>
+              <w:t>Versión</w:t>
+            </w:r>
+          </w:p>
+        </w:tc>
+        <w:tc>
+          <w:tcPr>
+            <w:tcW w:type="dxa" w:w="4703"/>
+          </w:tcPr>
+          <w:p>
+            <w:r>
+              <w:t>1.0</w:t>
+            </w:r>
+          </w:p>
+        </w:tc>
+      </w:tr>
+      <w:tr>
+        <w:tc>
+          <w:tcPr>
+            <w:tcW w:type="dxa" w:w="4703"/>
+            <w:shd w:val="clear" w:color="auto" w:fill="DAE3F3"/>
+          </w:tcPr>
+          <w:p>
+            <w:r>
+              <w:rPr>
+                <w:b/>
+              </w:rPr>
+              <w:t>Fecha</w:t>
+            </w:r>
+          </w:p>
+        </w:tc>
+        <w:tc>
+          <w:tcPr>
+            <w:tcW w:type="dxa" w:w="4703"/>
+          </w:tcPr>
+          <w:p>
+            <w:r>
+              <w:t>30/08/2026</w:t>
+            </w:r>
+          </w:p>
+        </w:tc>
+      </w:tr>
+      <w:tr>
+        <w:tc>
+          <w:tcPr>
+            <w:tcW w:type="dxa" w:w="4703"/>
+            <w:shd w:val="clear" w:color="auto" w:fill="DAE3F3"/>
+          </w:tcPr>
+          <w:p>
+            <w:r>
+              <w:rPr>
+                <w:b/>
+              </w:rPr>
+              <w:t>Autor</w:t>
+            </w:r>
+          </w:p>
+        </w:tc>
+        <w:tc>
+          <w:tcPr>
+            <w:tcW w:type="dxa" w:w="4703"/>
+          </w:tcPr>
+          <w:p>
+            <w:r>
+              <w:t>Equipo TP — Ingeniería de Software</w:t>
+            </w:r>
+          </w:p>
+        </w:tc>
+      </w:tr>
+    </w:tbl>
+    <w:p/>
+    <w:tbl>
+      <w:tblPr>
+        <w:tblStyle w:val="LightGrid-Accent1"/>
+        <w:tblW w:type="auto" w:w="0"/>
+        <w:tblLook w:firstColumn="1" w:firstRow="1" w:lastColumn="0" w:lastRow="0" w:noHBand="0" w:noVBand="1" w:val="04A0"/>
+      </w:tblPr>
+      <w:tblGrid>
+        <w:gridCol w:w="4703"/>
+        <w:gridCol w:w="4703"/>
+      </w:tblGrid>
+      <w:tr>
+        <w:tc>
+          <w:tcPr>
+            <w:tcW w:type="dxa" w:w="4703"/>
+            <w:shd w:val="clear" w:color="auto" w:fill="DAE3F3"/>
+          </w:tcPr>
+          <w:p>
+            <w:r>
+              <w:rPr>
+                <w:b/>
+              </w:rPr>
+              <w:t>Identificador</w:t>
+            </w:r>
+          </w:p>
+        </w:tc>
+        <w:tc>
+          <w:tcPr>
+            <w:tcW w:type="dxa" w:w="4703"/>
+          </w:tcPr>
+          <w:p>
+            <w:r>
+              <w:t>CU-23</w:t>
+            </w:r>
+          </w:p>
+        </w:tc>
+      </w:tr>
+      <w:tr>
+        <w:tc>
+          <w:tcPr>
+            <w:tcW w:type="dxa" w:w="4703"/>
+            <w:shd w:val="clear" w:color="auto" w:fill="DAE3F3"/>
+          </w:tcPr>
+          <w:p>
+            <w:r>
+              <w:rPr>
+                <w:b/>
+              </w:rPr>
+              <w:t>Nombre</w:t>
+            </w:r>
+          </w:p>
+        </w:tc>
+        <w:tc>
+          <w:tcPr>
+            <w:tcW w:type="dxa" w:w="4703"/>
+          </w:tcPr>
+          <w:p>
+            <w:r>
+              <w:t>Solicitar y Autorizar Descontinuación de Vino</w:t>
+            </w:r>
+          </w:p>
+        </w:tc>
+      </w:tr>
+      <w:tr>
+        <w:tc>
+          <w:tcPr>
+            <w:tcW w:type="dxa" w:w="4703"/>
+            <w:shd w:val="clear" w:color="auto" w:fill="DAE3F3"/>
+          </w:tcPr>
+          <w:p>
+            <w:r>
+              <w:rPr>
+                <w:b/>
+              </w:rPr>
+              <w:t>Actor primario</w:t>
+            </w:r>
+          </w:p>
+        </w:tc>
+        <w:tc>
+          <w:tcPr>
+            <w:tcW w:type="dxa" w:w="4703"/>
+          </w:tcPr>
+          <w:p>
+            <w:r>
+              <w:t>Usuario</w:t>
+            </w:r>
+          </w:p>
+        </w:tc>
+      </w:tr>
+      <w:tr>
+        <w:tc>
+          <w:tcPr>
+            <w:tcW w:type="dxa" w:w="4703"/>
+            <w:shd w:val="clear" w:color="auto" w:fill="DAE3F3"/>
+          </w:tcPr>
+          <w:p>
+            <w:r>
+              <w:rPr>
+                <w:b/>
+              </w:rPr>
+              <w:t>Actor secundario</w:t>
+            </w:r>
+          </w:p>
+        </w:tc>
+        <w:tc>
+          <w:tcPr>
+            <w:tcW w:type="dxa" w:w="4703"/>
+          </w:tcPr>
+          <w:p>
+            <w:r>
+              <w:t>Administrador (autoriza, en el flujo alternativo 8)</w:t>
+            </w:r>
+          </w:p>
+        </w:tc>
+      </w:tr>
+      <w:tr>
+        <w:tc>
+          <w:tcPr>
+            <w:tcW w:type="dxa" w:w="4703"/>
+            <w:shd w:val="clear" w:color="auto" w:fill="DAE3F3"/>
+          </w:tcPr>
+          <w:p>
+            <w:r>
+              <w:rPr>
+                <w:b/>
+              </w:rPr>
+              <w:t>Frecuencia</w:t>
+            </w:r>
+          </w:p>
+        </w:tc>
+        <w:tc>
+          <w:tcPr>
+            <w:tcW w:type="dxa" w:w="4703"/>
+          </w:tcPr>
+          <w:p>
+            <w:r>
+              <w:t>Baja</w:t>
+            </w:r>
+          </w:p>
+        </w:tc>
+      </w:tr>
+      <w:tr>
+        <w:tc>
+          <w:tcPr>
+            <w:tcW w:type="dxa" w:w="4703"/>
+            <w:shd w:val="clear" w:color="auto" w:fill="DAE3F3"/>
+          </w:tcPr>
+          <w:p>
+            <w:r>
+              <w:rPr>
+                <w:b/>
+              </w:rPr>
+              <w:t>Prioridad</w:t>
+            </w:r>
+          </w:p>
+        </w:tc>
+        <w:tc>
+          <w:tcPr>
+            <w:tcW w:type="dxa" w:w="4703"/>
+          </w:tcPr>
+          <w:p>
+            <w:r>
+              <w:t>Media</w:t>
+            </w:r>
+          </w:p>
+        </w:tc>
+      </w:tr>
+    </w:tbl>
+    <w:p/>
+    <w:p>
+      <w:pPr>
+        <w:pStyle w:val="Heading2"/>
+      </w:pPr>
+      <w:r>
+        <w:t>Historial de revisión</w:t>
+      </w:r>
+    </w:p>
+    <w:tbl>
+      <w:tblPr>
+        <w:tblStyle w:val="LightGrid-Accent1"/>
+        <w:tblW w:type="auto" w:w="0"/>
+        <w:tblLook w:firstColumn="1" w:firstRow="1" w:lastColumn="0" w:lastRow="0" w:noHBand="0" w:noVBand="1" w:val="04A0"/>
+      </w:tblPr>
+      <w:tblGrid>
+        <w:gridCol w:w="2351"/>
+        <w:gridCol w:w="2351"/>
+        <w:gridCol w:w="2351"/>
+        <w:gridCol w:w="2351"/>
+      </w:tblGrid>
+      <w:tr>
+        <w:tc>
+          <w:tcPr>
+            <w:tcW w:type="dxa" w:w="2351"/>
+            <w:shd w:val="clear" w:color="auto" w:fill="DAE3F3"/>
+          </w:tcPr>
+          <w:p>
+            <w:r>
+              <w:rPr>
+                <w:b/>
+              </w:rPr>
+              <w:t>Versión</w:t>
+            </w:r>
+          </w:p>
+        </w:tc>
+        <w:tc>
+          <w:tcPr>
+            <w:tcW w:type="dxa" w:w="2351"/>
+            <w:shd w:val="clear" w:color="auto" w:fill="DAE3F3"/>
+          </w:tcPr>
+          <w:p>
+            <w:r>
+              <w:rPr>
+                <w:b/>
+              </w:rPr>
+              <w:t>Fecha</w:t>
+            </w:r>
+          </w:p>
+        </w:tc>
+        <w:tc>
+          <w:tcPr>
+            <w:tcW w:type="dxa" w:w="2351"/>
+            <w:shd w:val="clear" w:color="auto" w:fill="DAE3F3"/>
+          </w:tcPr>
+          <w:p>
+            <w:r>
+              <w:rPr>
+                <w:b/>
+              </w:rPr>
+              <w:t>Autor</w:t>
+            </w:r>
+          </w:p>
+        </w:tc>
+        <w:tc>
+          <w:tcPr>
+            <w:tcW w:type="dxa" w:w="2351"/>
+            <w:shd w:val="clear" w:color="auto" w:fill="DAE3F3"/>
+          </w:tcPr>
+          <w:p>
+            <w:r>
+              <w:rPr>
+                <w:b/>
+              </w:rPr>
+              <w:t>Descripción</w:t>
+            </w:r>
+          </w:p>
+        </w:tc>
+      </w:tr>
+      <w:tr>
+        <w:tc>
+          <w:tcPr>
+            <w:tcW w:type="dxa" w:w="2351"/>
+          </w:tcPr>
+          <w:p>
+            <w:r>
+              <w:t>1.0</w:t>
+            </w:r>
+          </w:p>
+        </w:tc>
+        <w:tc>
+          <w:tcPr>
+            <w:tcW w:type="dxa" w:w="2351"/>
+          </w:tcPr>
+          <w:p>
+            <w:r>
+              <w:t>30/08/2026</w:t>
+            </w:r>
+          </w:p>
+        </w:tc>
+        <w:tc>
+          <w:tcPr>
+            <w:tcW w:type="dxa" w:w="2351"/>
+          </w:tcPr>
+          <w:p>
+            <w:r>
+              <w:t>Equipo TP</w:t>
+            </w:r>
+          </w:p>
+        </w:tc>
+        <w:tc>
+          <w:tcPr>
+            <w:tcW w:type="dxa" w:w="2351"/>
+          </w:tcPr>
+          <w:p>
+            <w:r>
+              <w:t>Versión inicial — Entrega 1 (análisis y diseño). Fusiona las propuestas previas CU-26 (solicitar) y CU-27 (autorizar) en un único caso de uso, simétrico a CU-21.</w:t>
+            </w:r>
+          </w:p>
+        </w:tc>
+      </w:tr>
+    </w:tbl>
+    <w:p/>
+    <w:p>
+      <w:pPr>
+        <w:pStyle w:val="Heading2"/>
+      </w:pPr>
+      <w:r>
+        <w:t>Objetivo</w:t>
+      </w:r>
+    </w:p>
+    <w:p>
+      <w:r>
+        <w:t>Permitir que un Usuario proponga la descontinuación de un vino del catálogo y que un Administrador distinto la autorice, aplicando el mismo criterio de separación de funciones que el alta (RN-01), sin eliminar físicamente el registro (RN-04).</w:t>
+      </w:r>
+    </w:p>
+    <w:p>
+      <w:pPr>
+        <w:pStyle w:val="Heading2"/>
+      </w:pPr>
+      <w:r>
+        <w:t>Precondiciones</w:t>
+      </w:r>
+    </w:p>
+    <w:p>
+      <w:pPr>
+        <w:pStyle w:val="ListBullet"/>
+      </w:pPr>
+      <w:r>
+        <w:t>El vino a descontinuar existe, está Activo y autorizado en el catálogo.</w:t>
+      </w:r>
+    </w:p>
+    <w:p>
+      <w:pPr>
+        <w:pStyle w:val="ListBullet"/>
+      </w:pPr>
+      <w:r>
+        <w:t>El Usuario que solicita la baja inició sesión correctamente y tiene el permiso "Gestionar catálogo de vinos".</w:t>
+      </w:r>
+    </w:p>
+    <w:p>
+      <w:pPr>
+        <w:pStyle w:val="ListBullet"/>
+      </w:pPr>
+      <w:r>
+        <w:t>Para la autorización: el Administrador inició sesión correctamente, tiene el permiso "Autorizar catálogo de vinos" y es distinto del Usuario que solicitó la baja.</w:t>
+      </w:r>
+    </w:p>
+    <w:p>
+      <w:pPr>
+        <w:pStyle w:val="Heading2"/>
+      </w:pPr>
+      <w:r>
+        <w:t>Postcondiciones</w:t>
+      </w:r>
+    </w:p>
+    <w:p>
+      <w:pPr>
+        <w:pStyle w:val="Heading3"/>
+      </w:pPr>
+      <w:r>
+        <w:t>En caso de éxito</w:t>
+      </w:r>
+    </w:p>
+    <w:p>
+      <w:pPr>
+        <w:pStyle w:val="ListBullet"/>
+      </w:pPr>
+      <w:r>
+        <w:t>El vino queda con BAJA_SOLICITADA_POR y FECHA_SOLICITUD_BAJA completos mientras está pendiente de autorización.</w:t>
+      </w:r>
+    </w:p>
+    <w:p>
+      <w:pPr>
+        <w:pStyle w:val="ListBullet"/>
+      </w:pPr>
+      <w:r>
+        <w:t>Tras la autorización, ESTADO pasa a 'Descontinuado', y DESCONTINUADO_POR / FECHA_DESCONTINUACION quedan completos.</w:t>
+      </w:r>
+    </w:p>
+    <w:p>
+      <w:pPr>
+        <w:pStyle w:val="ListBullet"/>
+      </w:pPr>
+      <w:r>
+        <w:t>El vino deja de listarse en el catálogo vendible, pero el registro nunca se elimina físicamente (RN-04).</w:t>
+      </w:r>
+    </w:p>
+    <w:p>
+      <w:pPr>
+        <w:pStyle w:val="Heading3"/>
+      </w:pPr>
+      <w:r>
+        <w:t>En caso de fallo</w:t>
+      </w:r>
+    </w:p>
+    <w:p>
+      <w:pPr>
+        <w:pStyle w:val="ListBullet"/>
+      </w:pPr>
+      <w:r>
+        <w:t>Si el Administrador que intenta autorizar es el mismo Usuario que solicitó la baja: el sistema rechaza la operación (RN-01) y el vino permanece Activo.</w:t>
+      </w:r>
+    </w:p>
+    <w:p>
+      <w:pPr>
+        <w:pStyle w:val="Heading2"/>
+      </w:pPr>
+      <w:r>
+        <w:t>Evento disparador</w:t>
+      </w:r>
+    </w:p>
+    <w:p>
+      <w:r>
+        <w:t>El Usuario selecciona un vino activo en frmCatalogoVinos y presiona "Solicitar descontinuación"; un Administrador presiona "Autorizar baja" sobre una solicitud pendiente en frmAutorizarVinos para completar el caso de uso.</w:t>
+      </w:r>
+    </w:p>
+    <w:p>
+      <w:pPr>
+        <w:pStyle w:val="Heading2"/>
+      </w:pPr>
+      <w:r>
+        <w:t>Puntos de extensión</w:t>
+      </w:r>
+    </w:p>
+    <w:tbl>
+      <w:tblPr>
+        <w:tblStyle w:val="LightGrid-Accent1"/>
+        <w:tblW w:type="auto" w:w="0"/>
+        <w:tblLook w:firstColumn="1" w:firstRow="1" w:lastColumn="0" w:lastRow="0" w:noHBand="0" w:noVBand="1" w:val="04A0"/>
+      </w:tblPr>
+      <w:tblGrid>
+        <w:gridCol w:w="4703"/>
+        <w:gridCol w:w="4703"/>
+      </w:tblGrid>
+      <w:tr>
+        <w:tc>
+          <w:tcPr>
+            <w:tcW w:type="dxa" w:w="4703"/>
+            <w:shd w:val="clear" w:color="auto" w:fill="DAE3F3"/>
+          </w:tcPr>
+          <w:p>
+            <w:r>
+              <w:rPr>
+                <w:b/>
+              </w:rPr>
+              <w:t>Paso</w:t>
+            </w:r>
+          </w:p>
+        </w:tc>
+        <w:tc>
+          <w:tcPr>
+            <w:tcW w:type="dxa" w:w="4703"/>
+            <w:shd w:val="clear" w:color="auto" w:fill="DAE3F3"/>
+          </w:tcPr>
+          <w:p>
+            <w:r>
+              <w:rPr>
+                <w:b/>
+              </w:rPr>
+              <w:t>Extensión posible</w:t>
+            </w:r>
+          </w:p>
+        </w:tc>
+      </w:tr>
+      <w:tr>
+        <w:tc>
+          <w:tcPr>
+            <w:tcW w:type="dxa" w:w="4703"/>
+          </w:tcPr>
+          <w:p>
+            <w:r>
+              <w:t>Tras el paso 10 (vino descontinuado)</w:t>
+            </w:r>
+          </w:p>
+        </w:tc>
+        <w:tc>
+          <w:tcPr>
+            <w:tcW w:type="dxa" w:w="4703"/>
+          </w:tcPr>
+          <w:p>
+            <w:r>
+              <w:t>Notificación al Usuario que solicitó la baja — fuera de alcance de esta entrega.</w:t>
+            </w:r>
+          </w:p>
+        </w:tc>
+      </w:tr>
+    </w:tbl>
+    <w:p/>
+    <w:p>
+      <w:pPr>
+        <w:pStyle w:val="Heading2"/>
+      </w:pPr>
+      <w:r>
+        <w:t>Gráfico del caso de uso</w:t>
+      </w:r>
+    </w:p>
+    <w:p>
+      <w:r>
+        <w:rPr>
+          <w:rFonts w:ascii="Consolas" w:hAnsi="Consolas"/>
+          <w:sz w:val="18"/>
+        </w:rPr>
+        <w:t>Actor: Usuario (permiso "Gestionar catálogo de vinos") ──&gt; (Solicitar Descontinuación de Vino)</w:t>
+        <w:br/>
+        <w:t>Actor: Administrador (permiso "Autorizar catálogo de vinos") ──&gt; (Autorizar Descontinuación de Vino)</w:t>
+        <w:br/>
+        <w:br/>
+        <w:t>(Solicitar Descontinuación de Vino) ── «precede» ──&gt; (Autorizar Descontinuación de Vino)</w:t>
+        <w:br/>
+        <w:br/>
+        <w:t>Patrón idéntico al de CU-21 (Proponer y Autorizar Alta), aplicado al retiro del catálogo.</w:t>
+      </w:r>
+    </w:p>
+    <w:p/>
+    <w:p>
+      <w:pPr>
+        <w:pStyle w:val="Heading2"/>
+      </w:pPr>
+      <w:r>
+        <w:t>Flujo principal</w:t>
+      </w:r>
+    </w:p>
+    <w:p>
+      <w:pPr>
+        <w:pStyle w:val="ListNumber"/>
+      </w:pPr>
+      <w:r>
+        <w:t>El Usuario selecciona un vino activo en frmCatalogoVinos y presiona "Solicitar descontinuación".</w:t>
+      </w:r>
+    </w:p>
+    <w:p>
+      <w:pPr>
+        <w:pStyle w:val="ListNumber"/>
+      </w:pPr>
+      <w:r>
+        <w:t>El sistema registra BAJA_SOLICITADA_POR = Id del Usuario y FECHA_SOLICITUD_BAJA = fecha actual.</w:t>
+      </w:r>
+    </w:p>
+    <w:p>
+      <w:pPr>
+        <w:pStyle w:val="ListNumber"/>
+      </w:pPr>
+      <w:r>
+        <w:t>El sistema informa que la descontinuación quedó pendiente de autorización.</w:t>
+      </w:r>
+    </w:p>
+    <w:p>
+      <w:pPr>
+        <w:pStyle w:val="ListNumber"/>
+      </w:pPr>
+      <w:r>
+        <w:t>Un Administrador abre frmAutorizarVinos y visualiza las solicitudes pendientes (BAJA_SOLICITADA_POR IS NOT NULL AND DESCONTINUADO_POR IS NULL).</w:t>
+      </w:r>
+    </w:p>
+    <w:p>
+      <w:pPr>
+        <w:pStyle w:val="ListNumber"/>
+      </w:pPr>
+      <w:r>
+        <w:t>El Administrador selecciona un vino y presiona "Autorizar baja".</w:t>
+      </w:r>
+    </w:p>
+    <w:p>
+      <w:pPr>
+        <w:pStyle w:val="ListNumber"/>
+      </w:pPr>
+      <w:r>
+        <w:t>El sistema verifica que el Administrador sea distinto del Usuario que solicitó la baja (RN-01).</w:t>
+      </w:r>
+    </w:p>
+    <w:p>
+      <w:pPr>
+        <w:pStyle w:val="ListNumber"/>
+      </w:pPr>
+      <w:r>
+        <w:t>El sistema actualiza ESTADO a 'Descontinuado' y completa DESCONTINUADO_POR y FECHA_DESCONTINUACION.</w:t>
+      </w:r>
+    </w:p>
+    <w:p>
+      <w:pPr>
+        <w:pStyle w:val="ListNumber"/>
+      </w:pPr>
+      <w:r>
+        <w:t>El vino deja de listarse en el catálogo vendible.</w:t>
+      </w:r>
+    </w:p>
+    <w:p>
+      <w:pPr>
+        <w:pStyle w:val="Heading2"/>
+      </w:pPr>
+      <w:r>
+        <w:t>Flujos alternativos</w:t>
+      </w:r>
+    </w:p>
+    <w:p>
+      <w:pPr>
+        <w:pStyle w:val="Heading3"/>
+      </w:pPr>
+      <w:r>
+        <w:t>6a. Autoautorización bloqueada (RN-01)</w:t>
+      </w:r>
+    </w:p>
+    <w:p>
+      <w:pPr>
+        <w:pStyle w:val="ListBullet"/>
+      </w:pPr>
+      <w:r>
+        <w:t>El sistema muestra "No podés autorizar una descontinuación que vos mismo solicitaste."</w:t>
+      </w:r>
+    </w:p>
+    <w:p>
+      <w:pPr>
+        <w:pStyle w:val="ListBullet"/>
+      </w:pPr>
+      <w:r>
+        <w:t>El caso de uso vuelve al paso 5.</w:t>
+      </w:r>
+    </w:p>
+    <w:p>
+      <w:pPr>
+        <w:pStyle w:val="Heading2"/>
+      </w:pPr>
+      <w:r>
+        <w:t>Reglas de negocio</w:t>
+      </w:r>
+    </w:p>
+    <w:tbl>
+      <w:tblPr>
+        <w:tblStyle w:val="LightGrid-Accent1"/>
+        <w:tblW w:type="auto" w:w="0"/>
+        <w:tblLook w:firstColumn="1" w:firstRow="1" w:lastColumn="0" w:lastRow="0" w:noHBand="0" w:noVBand="1" w:val="04A0"/>
+      </w:tblPr>
+      <w:tblGrid>
+        <w:gridCol w:w="4703"/>
+        <w:gridCol w:w="4703"/>
+      </w:tblGrid>
+      <w:tr>
+        <w:tc>
+          <w:tcPr>
+            <w:tcW w:type="dxa" w:w="4703"/>
+            <w:shd w:val="clear" w:color="auto" w:fill="DAE3F3"/>
+          </w:tcPr>
+          <w:p>
+            <w:r>
+              <w:rPr>
+                <w:b/>
+              </w:rPr>
+              <w:t>Código</w:t>
+            </w:r>
+          </w:p>
+        </w:tc>
+        <w:tc>
+          <w:tcPr>
+            <w:tcW w:type="dxa" w:w="4703"/>
+            <w:shd w:val="clear" w:color="auto" w:fill="DAE3F3"/>
+          </w:tcPr>
+          <w:p>
+            <w:r>
+              <w:rPr>
+                <w:b/>
+              </w:rPr>
+              <w:t>Regla</w:t>
+            </w:r>
+          </w:p>
+        </w:tc>
+      </w:tr>
+      <w:tr>
+        <w:tc>
+          <w:tcPr>
+            <w:tcW w:type="dxa" w:w="4703"/>
+          </w:tcPr>
+          <w:p>
+            <w:r>
+              <w:t>RN-01</w:t>
+            </w:r>
+          </w:p>
+        </w:tc>
+        <w:tc>
+          <w:tcPr>
+            <w:tcW w:type="dxa" w:w="4703"/>
+          </w:tcPr>
+          <w:p>
+            <w:r>
+              <w:t>Separación de funciones: DESCONTINUADO_POR nunca puede ser igual a BAJA_SOLICITADA_POR.</w:t>
+            </w:r>
+          </w:p>
+        </w:tc>
+      </w:tr>
+      <w:tr>
+        <w:tc>
+          <w:tcPr>
+            <w:tcW w:type="dxa" w:w="4703"/>
+          </w:tcPr>
+          <w:p>
+            <w:r>
+              <w:t>RN-04</w:t>
+            </w:r>
+          </w:p>
+        </w:tc>
+        <w:tc>
+          <w:tcPr>
+            <w:tcW w:type="dxa" w:w="4703"/>
+          </w:tcPr>
+          <w:p>
+            <w:r>
+              <w:t>El vino nunca se elimina físicamente; la descontinuación es siempre un cambio de ESTADO, preservando integridad referencial con movimientos de stock históricos.</w:t>
+            </w:r>
+          </w:p>
+        </w:tc>
+      </w:tr>
+    </w:tbl>
+    <w:p/>
+    <w:p>
+      <w:pPr>
+        <w:pStyle w:val="Heading2"/>
+      </w:pPr>
+      <w:r>
+        <w:t>Diagrama de clases afectadas</w:t>
+      </w:r>
+    </w:p>
+    <w:p>
+      <w:r>
+        <w:drawing>
+          <wp:inline xmlns:a="http://schemas.openxmlformats.org/drawingml/2006/main" xmlns:pic="http://schemas.openxmlformats.org/drawingml/2006/picture">
+            <wp:extent cx="5400000" cy="1462718"/>
+            <wp:docPr id="7" name="Picture 7"/>
+            <wp:cNvGraphicFramePr>
+              <a:graphicFrameLocks noChangeAspect="1"/>
+            </wp:cNvGraphicFramePr>
+            <a:graphic>
+              <a:graphicData uri="http://schemas.openxmlformats.org/drawingml/2006/picture">
+                <pic:pic>
+                  <pic:nvPicPr>
+                    <pic:cNvPr id="0" name="DiagramaClases_CatalogoStock.png"/>
+                    <pic:cNvPicPr/>
+                  </pic:nvPicPr>
+                  <pic:blipFill>
+                    <a:blip r:embed="rId9"/>
+                    <a:stretch>
+                      <a:fillRect/>
+                    </a:stretch>
+                  </pic:blipFill>
+                  <pic:spPr>
+                    <a:xfrm>
+                      <a:off x="0" y="0"/>
+                      <a:ext cx="5400000" cy="1462718"/>
+                    </a:xfrm>
+                    <a:prstGeom prst="rect"/>
+                  </pic:spPr>
+                </pic:pic>
+              </a:graphicData>
+            </a:graphic>
+          </wp:inline>
+        </w:drawing>
+      </w:r>
+    </w:p>
+    <w:p/>
+    <w:p>
+      <w:pPr>
+        <w:pStyle w:val="Heading2"/>
+      </w:pPr>
+      <w:r>
+        <w:t>Diagrama de secuencia</w:t>
+      </w:r>
+    </w:p>
+    <w:p>
+      <w:r>
+        <w:drawing>
+          <wp:inline xmlns:a="http://schemas.openxmlformats.org/drawingml/2006/main" xmlns:pic="http://schemas.openxmlformats.org/drawingml/2006/picture">
+            <wp:extent cx="5400000" cy="4098172"/>
+            <wp:docPr id="8" name="Picture 8"/>
+            <wp:cNvGraphicFramePr>
+              <a:graphicFrameLocks noChangeAspect="1"/>
+            </wp:cNvGraphicFramePr>
+            <a:graphic>
+              <a:graphicData uri="http://schemas.openxmlformats.org/drawingml/2006/picture">
+                <pic:pic>
+                  <pic:nvPicPr>
+                    <pic:cNvPr id="0" name="DiagramaSecuencia_CU23_SolicitarYAutorizarDescontinuacion.png"/>
+                    <pic:cNvPicPr/>
+                  </pic:nvPicPr>
+                  <pic:blipFill>
+                    <a:blip r:embed="rId13"/>
+                    <a:stretch>
+                      <a:fillRect/>
+                    </a:stretch>
+                  </pic:blipFill>
+                  <pic:spPr>
+                    <a:xfrm>
+                      <a:off x="0" y="0"/>
+                      <a:ext cx="5400000" cy="4098172"/>
+                    </a:xfrm>
+                    <a:prstGeom prst="rect"/>
+                  </pic:spPr>
+                </pic:pic>
+              </a:graphicData>
+            </a:graphic>
+          </wp:inline>
+        </w:drawing>
+      </w:r>
+    </w:p>
+    <w:p/>
+    <w:p>
+      <w:pPr>
+        <w:pStyle w:val="Heading2"/>
+      </w:pPr>
+      <w:r>
+        <w:t>DER — entidades afectadas</w:t>
+      </w:r>
+    </w:p>
+    <w:p>
+      <w:r>
+        <w:drawing>
+          <wp:inline xmlns:a="http://schemas.openxmlformats.org/drawingml/2006/main" xmlns:pic="http://schemas.openxmlformats.org/drawingml/2006/picture">
+            <wp:extent cx="5400000" cy="2336185"/>
+            <wp:docPr id="9" name="Picture 9"/>
+            <wp:cNvGraphicFramePr>
+              <a:graphicFrameLocks noChangeAspect="1"/>
+            </wp:cNvGraphicFramePr>
+            <a:graphic>
+              <a:graphicData uri="http://schemas.openxmlformats.org/drawingml/2006/picture">
+                <pic:pic>
+                  <pic:nvPicPr>
+                    <pic:cNvPr id="0" name="DER.png"/>
+                    <pic:cNvPicPr/>
+                  </pic:nvPicPr>
+                  <pic:blipFill>
+                    <a:blip r:embed="rId11"/>
+                    <a:stretch>
+                      <a:fillRect/>
+                    </a:stretch>
+                  </pic:blipFill>
+                  <pic:spPr>
+                    <a:xfrm>
+                      <a:off x="0" y="0"/>
+                      <a:ext cx="5400000" cy="2336185"/>
+                    </a:xfrm>
+                    <a:prstGeom prst="rect"/>
+                  </pic:spPr>
+                </pic:pic>
+              </a:graphicData>
+            </a:graphic>
+          </wp:inline>
+        </w:drawing>
+      </w:r>
+    </w:p>
+    <w:p/>
+    <w:p>
+      <w:r>
+        <w:t>Entidades afectadas: VINO, USUARIO</w:t>
+      </w:r>
+    </w:p>
+    <w:p>
+      <w:pPr>
+        <w:pStyle w:val="Heading2"/>
+      </w:pPr>
+      <w:r>
+        <w:t>Prototipo de interfaz de usuario</w:t>
+      </w:r>
+    </w:p>
+    <w:p>
+      <w:r>
+        <w:rPr>
+          <w:rFonts w:ascii="Consolas" w:hAnsi="Consolas"/>
+          <w:sz w:val="16"/>
+        </w:rPr>
+        <w:t>frmCatalogoVinos (WinForms — MaterialForm)</w:t>
+        <w:br/>
+        <w:t>+-------------------------------------------------------+</w:t>
+        <w:br/>
+        <w:t>|  Catalogo de Vinos                                [x]  |</w:t>
+        <w:br/>
+        <w:t>+---------------------------------------------------------+</w:t>
+        <w:br/>
+        <w:t>| [DataGridView: Codigo | Nombre | Bodega | Estado |       |</w:t>
+        <w:br/>
+        <w:t>|  Autorizado por | Fecha alta]                            |</w:t>
+        <w:br/>
+        <w:t>|                                                           |</w:t>
+        <w:br/>
+        <w:t>|  [ Nuevo vino ]  [ Solicitar descontinuacion ]           |</w:t>
+        <w:br/>
+        <w:t>+-------------------------------------------------------------+</w:t>
+        <w:br/>
+        <w:br/>
+        <w:t>frmAutorizarVinos — pestana "Descontinuaciones pendientes"</w:t>
+        <w:br/>
+        <w:t>+---------------------------------------------------------+</w:t>
+        <w:br/>
+        <w:t>| [DataGridView: Codigo | Nombre | Solicitado por |         |</w:t>
+        <w:br/>
+        <w:t>|  Fecha solicitud]                                         |</w:t>
+        <w:br/>
+        <w:t>|                                                            |</w:t>
+        <w:br/>
+        <w:t>|              [ Autorizar baja ]  [ Rechazar ]            |</w:t>
+        <w:br/>
+        <w:t>+----------------------------------------------------------+</w:t>
+      </w:r>
+    </w:p>
+    <w:p>
+      <w:pPr>
+        <w:pStyle w:val="Heading2"/>
+      </w:pPr>
+      <w:r>
+        <w:t>Observaciones</w:t>
+      </w:r>
+    </w:p>
+    <w:p>
+      <w:r>
+        <w:t>Simétrico a CU-21 (Proponer y Autorizar Alta): mismo patrón de propone/autoriza, misma regla de separación de funciones, aplicado al extremo opuesto del ciclo de vida del vino.</w:t>
+      </w:r>
+    </w:p>
+    <w:p>
+      <w:r>
+        <w:br w:type="page"/>
+      </w:r>
+    </w:p>
+    <w:p>
+      <w:pPr>
+        <w:pStyle w:val="Heading1"/>
+      </w:pPr>
+      <w:r>
+        <w:t>CU-S1 — Consultar Alerta de Stock Mínimo</w:t>
+      </w:r>
+    </w:p>
+    <w:tbl>
+      <w:tblPr>
+        <w:tblStyle w:val="LightGrid-Accent1"/>
+        <w:tblW w:type="auto" w:w="0"/>
+        <w:tblLook w:firstColumn="1" w:firstRow="1" w:lastColumn="0" w:lastRow="0" w:noHBand="0" w:noVBand="1" w:val="04A0"/>
+      </w:tblPr>
+      <w:tblGrid>
+        <w:gridCol w:w="4703"/>
+        <w:gridCol w:w="4703"/>
+      </w:tblGrid>
+      <w:tr>
+        <w:tc>
+          <w:tcPr>
+            <w:tcW w:type="dxa" w:w="4703"/>
+            <w:shd w:val="clear" w:color="auto" w:fill="DAE3F3"/>
+          </w:tcPr>
+          <w:p>
+            <w:r>
+              <w:rPr>
+                <w:b/>
+              </w:rPr>
+              <w:t>Identificador</w:t>
+            </w:r>
+          </w:p>
+        </w:tc>
+        <w:tc>
+          <w:tcPr>
+            <w:tcW w:type="dxa" w:w="4703"/>
+          </w:tcPr>
+          <w:p>
+            <w:r>
+              <w:t>CU-S1</w:t>
+            </w:r>
+          </w:p>
+        </w:tc>
+      </w:tr>
+      <w:tr>
+        <w:tc>
+          <w:tcPr>
+            <w:tcW w:type="dxa" w:w="4703"/>
+            <w:shd w:val="clear" w:color="auto" w:fill="DAE3F3"/>
+          </w:tcPr>
+          <w:p>
+            <w:r>
+              <w:rPr>
+                <w:b/>
+              </w:rPr>
+              <w:t>Nombre</w:t>
+            </w:r>
+          </w:p>
+        </w:tc>
+        <w:tc>
+          <w:tcPr>
+            <w:tcW w:type="dxa" w:w="4703"/>
+          </w:tcPr>
+          <w:p>
+            <w:r>
+              <w:t>Consultar Alerta de Stock Mínimo</w:t>
+            </w:r>
+          </w:p>
+        </w:tc>
+      </w:tr>
+      <w:tr>
+        <w:tc>
+          <w:tcPr>
+            <w:tcW w:type="dxa" w:w="4703"/>
+            <w:shd w:val="clear" w:color="auto" w:fill="DAE3F3"/>
+          </w:tcPr>
+          <w:p>
+            <w:r>
+              <w:rPr>
+                <w:b/>
+              </w:rPr>
+              <w:t>Actor primario</w:t>
+            </w:r>
+          </w:p>
+        </w:tc>
+        <w:tc>
+          <w:tcPr>
+            <w:tcW w:type="dxa" w:w="4703"/>
+          </w:tcPr>
+          <w:p>
+            <w:r>
+              <w:t>Usuario</w:t>
+            </w:r>
+          </w:p>
+        </w:tc>
+      </w:tr>
+      <w:tr>
+        <w:tc>
+          <w:tcPr>
+            <w:tcW w:type="dxa" w:w="4703"/>
+            <w:shd w:val="clear" w:color="auto" w:fill="DAE3F3"/>
+          </w:tcPr>
+          <w:p>
+            <w:r>
+              <w:rPr>
+                <w:b/>
+              </w:rPr>
+              <w:t>Frecuencia</w:t>
+            </w:r>
+          </w:p>
+        </w:tc>
+        <w:tc>
+          <w:tcPr>
+            <w:tcW w:type="dxa" w:w="4703"/>
+          </w:tcPr>
+          <w:p>
+            <w:r>
+              <w:t>Media</w:t>
+            </w:r>
+          </w:p>
+        </w:tc>
+      </w:tr>
+      <w:tr>
+        <w:tc>
+          <w:tcPr>
+            <w:tcW w:type="dxa" w:w="4703"/>
+            <w:shd w:val="clear" w:color="auto" w:fill="DAE3F3"/>
+          </w:tcPr>
+          <w:p>
+            <w:r>
+              <w:rPr>
+                <w:b/>
+              </w:rPr>
+              <w:t>Prioridad</w:t>
+            </w:r>
+          </w:p>
+        </w:tc>
+        <w:tc>
+          <w:tcPr>
+            <w:tcW w:type="dxa" w:w="4703"/>
+          </w:tcPr>
+          <w:p>
+            <w:r>
+              <w:t>Media</w:t>
+            </w:r>
+          </w:p>
+        </w:tc>
+      </w:tr>
+    </w:tbl>
+    <w:p/>
+    <w:p>
+      <w:pPr>
+        <w:pStyle w:val="Heading2"/>
+      </w:pPr>
+      <w:r>
+        <w:t>Objetivo</w:t>
+      </w:r>
+    </w:p>
+    <w:p>
+      <w:r>
+        <w:t>Permitir que el Usuario con el permiso "Gestionar catálogo de vinos" consulte, bajo demanda, los vinos cuyo stock actual esté por debajo de su STOCK_MINIMO configurado. Es una consulta pasiva (Decisión D9 del diseño): no hay un push automático al iniciar sesión, dado que la aplicación es WinForms de escritorio sin scheduler.</w:t>
+      </w:r>
+    </w:p>
+    <w:p>
+      <w:pPr>
+        <w:pStyle w:val="Heading2"/>
+      </w:pPr>
+      <w:r>
+        <w:t>Precondiciones</w:t>
+      </w:r>
+    </w:p>
+    <w:p>
+      <w:pPr>
+        <w:pStyle w:val="ListBullet"/>
+      </w:pPr>
+      <w:r>
+        <w:t>El Usuario inició sesión correctamente y tiene el permiso "Gestionar catálogo de vinos".</w:t>
+      </w:r>
+    </w:p>
+    <w:p>
+      <w:pPr>
+        <w:pStyle w:val="Heading2"/>
+      </w:pPr>
+      <w:r>
+        <w:t>Postcondiciones</w:t>
+      </w:r>
+    </w:p>
+    <w:p>
+      <w:pPr>
+        <w:pStyle w:val="Heading3"/>
+      </w:pPr>
+      <w:r>
+        <w:t>En caso de éxito</w:t>
+      </w:r>
+    </w:p>
+    <w:p>
+      <w:pPr>
+        <w:pStyle w:val="ListBullet"/>
+      </w:pPr>
+      <w:r>
+        <w:t>Se muestra al Usuario la lista de vinos con stock actual menor a su STOCK_MINIMO.</w:t>
+      </w:r>
+    </w:p>
+    <w:p>
+      <w:pPr>
+        <w:pStyle w:val="Heading2"/>
+      </w:pPr>
+      <w:r>
+        <w:t>Evento disparador</w:t>
+      </w:r>
+    </w:p>
+    <w:p>
+      <w:r>
+        <w:t>El Usuario selecciona "Alerta de stock mínimo" en el menú principal.</w:t>
+      </w:r>
+    </w:p>
+    <w:p>
+      <w:pPr>
+        <w:pStyle w:val="Heading2"/>
+      </w:pPr>
+      <w:r>
+        <w:t>Flujo principal</w:t>
+      </w:r>
+    </w:p>
+    <w:p>
+      <w:pPr>
+        <w:pStyle w:val="ListNumber"/>
+      </w:pPr>
+      <w:r>
+        <w:t>El Usuario abre frmAlertaStockMinimo.</w:t>
+      </w:r>
+    </w:p>
+    <w:p>
+      <w:pPr>
+        <w:pStyle w:val="ListNumber"/>
+      </w:pPr>
+      <w:r>
+        <w:t>El sistema calcula el stock actual de cada vino (derivado del kardex de MOVIMIENTO_STOCK).</w:t>
+      </w:r>
+    </w:p>
+    <w:p>
+      <w:pPr>
+        <w:pStyle w:val="ListNumber"/>
+      </w:pPr>
+      <w:r>
+        <w:t>El sistema filtra los vinos cuyo stock actual es menor a su STOCK_MINIMO.</w:t>
+      </w:r>
+    </w:p>
+    <w:p>
+      <w:pPr>
+        <w:pStyle w:val="ListNumber"/>
+      </w:pPr>
+      <w:r>
+        <w:t>El sistema muestra la lista de vinos pendientes de reposición.</w:t>
+      </w:r>
+    </w:p>
+    <w:p>
+      <w:pPr>
+        <w:pStyle w:val="Heading2"/>
+      </w:pPr>
+      <w:r>
+        <w:t>Flujos alternativos</w:t>
+      </w:r>
+    </w:p>
+    <w:p>
+      <w:pPr>
+        <w:pStyle w:val="Heading3"/>
+      </w:pPr>
+      <w:r>
+        <w:t>3a. Ningún vino está por debajo de su stock mínimo</w:t>
+      </w:r>
+    </w:p>
+    <w:p>
+      <w:pPr>
+        <w:pStyle w:val="ListBullet"/>
+      </w:pPr>
+      <w:r>
+        <w:t>El sistema muestra la grilla vacía con el mensaje "No hay vinos con stock bajo mínimo."</w:t>
+      </w:r>
+    </w:p>
+    <w:p>
+      <w:pPr>
+        <w:pStyle w:val="Heading2"/>
+      </w:pPr>
+      <w:r>
+        <w:t>Reglas de negocio</w:t>
+      </w:r>
+    </w:p>
+    <w:tbl>
+      <w:tblPr>
+        <w:tblStyle w:val="LightGrid-Accent1"/>
+        <w:tblW w:type="auto" w:w="0"/>
+        <w:tblLook w:firstColumn="1" w:firstRow="1" w:lastColumn="0" w:lastRow="0" w:noHBand="0" w:noVBand="1" w:val="04A0"/>
+      </w:tblPr>
+      <w:tblGrid>
+        <w:gridCol w:w="4703"/>
+        <w:gridCol w:w="4703"/>
+      </w:tblGrid>
+      <w:tr>
+        <w:tc>
+          <w:tcPr>
+            <w:tcW w:type="dxa" w:w="4703"/>
+            <w:shd w:val="clear" w:color="auto" w:fill="DAE3F3"/>
+          </w:tcPr>
+          <w:p>
+            <w:r>
+              <w:rPr>
+                <w:b/>
+              </w:rPr>
+              <w:t>Código</w:t>
+            </w:r>
+          </w:p>
+        </w:tc>
+        <w:tc>
+          <w:tcPr>
+            <w:tcW w:type="dxa" w:w="4703"/>
+            <w:shd w:val="clear" w:color="auto" w:fill="DAE3F3"/>
+          </w:tcPr>
+          <w:p>
+            <w:r>
+              <w:rPr>
+                <w:b/>
+              </w:rPr>
+              <w:t>Regla</w:t>
+            </w:r>
+          </w:p>
+        </w:tc>
+      </w:tr>
+      <w:tr>
+        <w:tc>
+          <w:tcPr>
+            <w:tcW w:type="dxa" w:w="4703"/>
+          </w:tcPr>
+          <w:p>
+            <w:r>
+              <w:t>RN-01</w:t>
+            </w:r>
+          </w:p>
+        </w:tc>
+        <w:tc>
+          <w:tcPr>
+            <w:tcW w:type="dxa" w:w="4703"/>
+          </w:tcPr>
+          <w:p>
+            <w:r>
+              <w:t>La alerta es una consulta pasiva bajo demanda, no una notificación activa al iniciar sesión.</w:t>
+            </w:r>
+          </w:p>
+        </w:tc>
+      </w:tr>
+    </w:tbl>
+    <w:p/>
+    <w:p>
+      <w:pPr>
+        <w:pStyle w:val="Heading2"/>
+      </w:pPr>
+      <w:r>
+        <w:t>Relaciones con otros casos de uso</w:t>
+      </w:r>
+    </w:p>
+    <w:tbl>
+      <w:tblPr>
+        <w:tblStyle w:val="LightGrid-Accent1"/>
+        <w:tblW w:type="auto" w:w="0"/>
+        <w:tblLook w:firstColumn="1" w:firstRow="1" w:lastColumn="0" w:lastRow="0" w:noHBand="0" w:noVBand="1" w:val="04A0"/>
+      </w:tblPr>
+      <w:tblGrid>
+        <w:gridCol w:w="3135"/>
+        <w:gridCol w:w="3135"/>
+        <w:gridCol w:w="3135"/>
+      </w:tblGrid>
+      <w:tr>
+        <w:tc>
+          <w:tcPr>
+            <w:tcW w:type="dxa" w:w="3135"/>
+            <w:shd w:val="clear" w:color="auto" w:fill="DAE3F3"/>
+          </w:tcPr>
+          <w:p>
+            <w:r>
+              <w:rPr>
+                <w:b/>
+              </w:rPr>
+              <w:t>Tipo</w:t>
+            </w:r>
+          </w:p>
+        </w:tc>
+        <w:tc>
+          <w:tcPr>
+            <w:tcW w:type="dxa" w:w="3135"/>
+            <w:shd w:val="clear" w:color="auto" w:fill="DAE3F3"/>
+          </w:tcPr>
+          <w:p>
+            <w:r>
+              <w:rPr>
+                <w:b/>
+              </w:rPr>
+              <w:t>Destino</w:t>
+            </w:r>
+          </w:p>
+        </w:tc>
+        <w:tc>
+          <w:tcPr>
+            <w:tcW w:type="dxa" w:w="3135"/>
+            <w:shd w:val="clear" w:color="auto" w:fill="DAE3F3"/>
+          </w:tcPr>
+          <w:p>
+            <w:r>
+              <w:rPr>
+                <w:b/>
+              </w:rPr>
+              <w:t>Condición</w:t>
+            </w:r>
+          </w:p>
+        </w:tc>
+      </w:tr>
+      <w:tr>
+        <w:tc>
+          <w:tcPr>
+            <w:tcW w:type="dxa" w:w="3135"/>
+          </w:tcPr>
+          <w:p>
+            <w:r>
+              <w:t>«extend» de</w:t>
+            </w:r>
+          </w:p>
+        </w:tc>
+        <w:tc>
+          <w:tcPr>
+            <w:tcW w:type="dxa" w:w="3135"/>
+          </w:tcPr>
+          <w:p>
+            <w:r>
+              <w:t>CU-22 Registrar Movimiento de Stock</w:t>
+            </w:r>
+          </w:p>
+        </w:tc>
+        <w:tc>
+          <w:tcPr>
+            <w:tcW w:type="dxa" w:w="3135"/>
+          </w:tcPr>
+          <w:p>
+            <w:r>
+              <w:t>Se consulta habitualmente después de registrar salidas de stock.</w:t>
+            </w:r>
+          </w:p>
+        </w:tc>
+      </w:tr>
+    </w:tbl>
+    <w:p/>
+    <w:p>
+      <w:pPr>
+        <w:pStyle w:val="Heading2"/>
+      </w:pPr>
+      <w:r>
+        <w:t>Observaciones</w:t>
+      </w:r>
+    </w:p>
+    <w:p>
+      <w:r>
+        <w:t>Especificación simple — no requiere diagrama de secuencia completo ni DER dedicado (ver diseño: solo los 3 CU principales llevan modelado completo).</w:t>
+      </w:r>
+    </w:p>
     <w:sectPr>
       <w:pgSz w:w="12240" w:h="15840"/>
       <w:pgMar w:top="1417" w:right="1417" w:bottom="1417" w:left="1417" w:header="720" w:footer="720" w:gutter="0"/>

</xml_diff>

<commit_message>
docs: sync N02 curation diagrams and CasosDeUso with CU-28..31
DER, DiagramaClases and CasosDeUso.docx never got committed when N02
(curacion-cajas-mensuales) was archived. Adds the missing diagram set
(ModeloConceptual, DiagramaActividad, DiagramaClases, secuencias CU-28/29)
and regenerates the docx to include CU-28..31.
</commit_message>
<xml_diff>
--- a/DIAGRAMAS/CasosDeUso.docx
+++ b/DIAGRAMAS/CasosDeUso.docx
@@ -14,7 +14,7 @@
       <w:r>
         <w:t>Sistema de Gestión de Usuarios — TP Ingeniería de Software.</w:t>
         <w:br/>
-        <w:t>Documento de descripción de los 27 casos de uso identificados: CU-01..CU-20 (esqueleto base — usuarios, roles/permisos, idiomas, bitácora, integridad) y CU-21..CU-25 y CU-27 (Proponer/Autorizar Alta, Registrar Movimiento de Stock, Solicitar/Autorizar Descontinuación, Registrar Ajuste de Inventario) más el caso de soporte CU-26 Consultar Alerta de Stock Mínimo, del dominio de Gestión de Catálogo y Stock de Vinos (Entrega N01).</w:t>
+        <w:t>Documento de descripción de los 31 casos de uso identificados: CU-01..CU-20 (esqueleto base — usuarios, roles/permisos, idiomas, bitácora, integridad) y CU-21..CU-25 y CU-27 (Proponer/Autorizar Alta, Registrar Movimiento de Stock, Solicitar/Autorizar Descontinuación, Registrar Ajuste de Inventario) más el caso de soporte CU-26 Consultar Alerta de Stock Mínimo, del dominio de Gestión de Catálogo y Stock de Vinos (Entrega N01); y CU-28..CU-31 (Armar Caja Mensual, Registrar Sustitución por Falta de Stock, Actualizar Perfil de Socio, Despachar Caja), del dominio de Curación y Armado de Cajas Mensuales, Club de Socios (Entrega N02).</w:t>
       </w:r>
     </w:p>
     <w:p>
@@ -1024,6 +1024,134 @@
           <w:p>
             <w:r>
               <w:t>Registrar Ajuste de Inventario</w:t>
+            </w:r>
+          </w:p>
+        </w:tc>
+        <w:tc>
+          <w:tcPr>
+            <w:tcW w:type="dxa" w:w="3135"/>
+          </w:tcPr>
+          <w:p>
+            <w:r>
+              <w:t>Usuario</w:t>
+            </w:r>
+          </w:p>
+        </w:tc>
+      </w:tr>
+      <w:tr>
+        <w:tc>
+          <w:tcPr>
+            <w:tcW w:type="dxa" w:w="3135"/>
+          </w:tcPr>
+          <w:p>
+            <w:r>
+              <w:t>CU-28</w:t>
+            </w:r>
+          </w:p>
+        </w:tc>
+        <w:tc>
+          <w:tcPr>
+            <w:tcW w:type="dxa" w:w="3135"/>
+          </w:tcPr>
+          <w:p>
+            <w:r>
+              <w:t>Armar Caja Mensual</w:t>
+            </w:r>
+          </w:p>
+        </w:tc>
+        <w:tc>
+          <w:tcPr>
+            <w:tcW w:type="dxa" w:w="3135"/>
+          </w:tcPr>
+          <w:p>
+            <w:r>
+              <w:t>Usuario</w:t>
+            </w:r>
+          </w:p>
+        </w:tc>
+      </w:tr>
+      <w:tr>
+        <w:tc>
+          <w:tcPr>
+            <w:tcW w:type="dxa" w:w="3135"/>
+          </w:tcPr>
+          <w:p>
+            <w:r>
+              <w:t>CU-29</w:t>
+            </w:r>
+          </w:p>
+        </w:tc>
+        <w:tc>
+          <w:tcPr>
+            <w:tcW w:type="dxa" w:w="3135"/>
+          </w:tcPr>
+          <w:p>
+            <w:r>
+              <w:t>Registrar Sustitución por Falta de Stock</w:t>
+            </w:r>
+          </w:p>
+        </w:tc>
+        <w:tc>
+          <w:tcPr>
+            <w:tcW w:type="dxa" w:w="3135"/>
+          </w:tcPr>
+          <w:p>
+            <w:r>
+              <w:t>Usuario</w:t>
+            </w:r>
+          </w:p>
+        </w:tc>
+      </w:tr>
+      <w:tr>
+        <w:tc>
+          <w:tcPr>
+            <w:tcW w:type="dxa" w:w="3135"/>
+          </w:tcPr>
+          <w:p>
+            <w:r>
+              <w:t>CU-30</w:t>
+            </w:r>
+          </w:p>
+        </w:tc>
+        <w:tc>
+          <w:tcPr>
+            <w:tcW w:type="dxa" w:w="3135"/>
+          </w:tcPr>
+          <w:p>
+            <w:r>
+              <w:t>Actualizar Perfil de Socio</w:t>
+            </w:r>
+          </w:p>
+        </w:tc>
+        <w:tc>
+          <w:tcPr>
+            <w:tcW w:type="dxa" w:w="3135"/>
+          </w:tcPr>
+          <w:p>
+            <w:r>
+              <w:t>Usuario</w:t>
+            </w:r>
+          </w:p>
+        </w:tc>
+      </w:tr>
+      <w:tr>
+        <w:tc>
+          <w:tcPr>
+            <w:tcW w:type="dxa" w:w="3135"/>
+          </w:tcPr>
+          <w:p>
+            <w:r>
+              <w:t>CU-31</w:t>
+            </w:r>
+          </w:p>
+        </w:tc>
+        <w:tc>
+          <w:tcPr>
+            <w:tcW w:type="dxa" w:w="3135"/>
+          </w:tcPr>
+          <w:p>
+            <w:r>
+              <w:t>Despachar Caja</w:t>
             </w:r>
           </w:p>
         </w:tc>
@@ -13199,7 +13327,7 @@
       <w:r>
         <w:drawing>
           <wp:inline xmlns:a="http://schemas.openxmlformats.org/drawingml/2006/main" xmlns:pic="http://schemas.openxmlformats.org/drawingml/2006/picture">
-            <wp:extent cx="5400000" cy="3218040"/>
+            <wp:extent cx="5400000" cy="4204392"/>
             <wp:docPr id="3" name="Picture 3"/>
             <wp:cNvGraphicFramePr>
               <a:graphicFrameLocks noChangeAspect="1"/>
@@ -13220,7 +13348,7 @@
                   <pic:spPr>
                     <a:xfrm>
                       <a:off x="0" y="0"/>
-                      <a:ext cx="5400000" cy="3218040"/>
+                      <a:ext cx="5400000" cy="4204392"/>
                     </a:xfrm>
                     <a:prstGeom prst="rect"/>
                   </pic:spPr>
@@ -14325,7 +14453,7 @@
       <w:r>
         <w:drawing>
           <wp:inline xmlns:a="http://schemas.openxmlformats.org/drawingml/2006/main" xmlns:pic="http://schemas.openxmlformats.org/drawingml/2006/picture">
-            <wp:extent cx="5400000" cy="3218040"/>
+            <wp:extent cx="5400000" cy="4204392"/>
             <wp:docPr id="6" name="Picture 6"/>
             <wp:cNvGraphicFramePr>
               <a:graphicFrameLocks noChangeAspect="1"/>
@@ -14346,7 +14474,7 @@
                   <pic:spPr>
                     <a:xfrm>
                       <a:off x="0" y="0"/>
-                      <a:ext cx="5400000" cy="3218040"/>
+                      <a:ext cx="5400000" cy="4204392"/>
                     </a:xfrm>
                     <a:prstGeom prst="rect"/>
                   </pic:spPr>
@@ -15379,7 +15507,7 @@
       <w:r>
         <w:drawing>
           <wp:inline xmlns:a="http://schemas.openxmlformats.org/drawingml/2006/main" xmlns:pic="http://schemas.openxmlformats.org/drawingml/2006/picture">
-            <wp:extent cx="5400000" cy="3218040"/>
+            <wp:extent cx="5400000" cy="4204392"/>
             <wp:docPr id="9" name="Picture 9"/>
             <wp:cNvGraphicFramePr>
               <a:graphicFrameLocks noChangeAspect="1"/>
@@ -15400,7 +15528,7 @@
                   <pic:spPr>
                     <a:xfrm>
                       <a:off x="0" y="0"/>
-                      <a:ext cx="5400000" cy="3218040"/>
+                      <a:ext cx="5400000" cy="4204392"/>
                     </a:xfrm>
                     <a:prstGeom prst="rect"/>
                   </pic:spPr>
@@ -16453,7 +16581,7 @@
       <w:r>
         <w:drawing>
           <wp:inline xmlns:a="http://schemas.openxmlformats.org/drawingml/2006/main" xmlns:pic="http://schemas.openxmlformats.org/drawingml/2006/picture">
-            <wp:extent cx="5400000" cy="3218040"/>
+            <wp:extent cx="5400000" cy="4204392"/>
             <wp:docPr id="12" name="Picture 12"/>
             <wp:cNvGraphicFramePr>
               <a:graphicFrameLocks noChangeAspect="1"/>
@@ -16474,7 +16602,7 @@
                   <pic:spPr>
                     <a:xfrm>
                       <a:off x="0" y="0"/>
-                      <a:ext cx="5400000" cy="3218040"/>
+                      <a:ext cx="5400000" cy="4204392"/>
                     </a:xfrm>
                     <a:prstGeom prst="rect"/>
                   </pic:spPr>
@@ -17565,7 +17693,7 @@
       <w:r>
         <w:drawing>
           <wp:inline xmlns:a="http://schemas.openxmlformats.org/drawingml/2006/main" xmlns:pic="http://schemas.openxmlformats.org/drawingml/2006/picture">
-            <wp:extent cx="5400000" cy="3218040"/>
+            <wp:extent cx="5400000" cy="4204392"/>
             <wp:docPr id="15" name="Picture 15"/>
             <wp:cNvGraphicFramePr>
               <a:graphicFrameLocks noChangeAspect="1"/>
@@ -17586,7 +17714,7 @@
                   <pic:spPr>
                     <a:xfrm>
                       <a:off x="0" y="0"/>
-                      <a:ext cx="5400000" cy="3218040"/>
+                      <a:ext cx="5400000" cy="4204392"/>
                     </a:xfrm>
                     <a:prstGeom prst="rect"/>
                   </pic:spPr>
@@ -19111,7 +19239,7 @@
       <w:r>
         <w:drawing>
           <wp:inline xmlns:a="http://schemas.openxmlformats.org/drawingml/2006/main" xmlns:pic="http://schemas.openxmlformats.org/drawingml/2006/picture">
-            <wp:extent cx="5400000" cy="3218040"/>
+            <wp:extent cx="5400000" cy="4204392"/>
             <wp:docPr id="18" name="Picture 18"/>
             <wp:cNvGraphicFramePr>
               <a:graphicFrameLocks noChangeAspect="1"/>
@@ -19132,7 +19260,7 @@
                   <pic:spPr>
                     <a:xfrm>
                       <a:off x="0" y="0"/>
-                      <a:ext cx="5400000" cy="3218040"/>
+                      <a:ext cx="5400000" cy="4204392"/>
                     </a:xfrm>
                     <a:prstGeom prst="rect"/>
                   </pic:spPr>
@@ -19201,6 +19329,3840 @@
     <w:p>
       <w:r>
         <w:t>RESPONSABLE se guarda como snapshot del login (VARCHAR), sin FK a USUARIO — mismo criterio que USUARIO_HISTORIAL: el registro histórico sobrevive a la baja del usuario.</w:t>
+      </w:r>
+    </w:p>
+    <w:p>
+      <w:r>
+        <w:br w:type="page"/>
+      </w:r>
+    </w:p>
+    <w:p>
+      <w:pPr>
+        <w:pStyle w:val="Heading1"/>
+      </w:pPr>
+      <w:r>
+        <w:t>CU-28 — Armar Caja Mensual</w:t>
+      </w:r>
+    </w:p>
+    <w:tbl>
+      <w:tblPr>
+        <w:tblStyle w:val="LightGrid-Accent1"/>
+        <w:tblW w:type="auto" w:w="0"/>
+        <w:tblLook w:firstColumn="1" w:firstRow="1" w:lastColumn="0" w:lastRow="0" w:noHBand="0" w:noVBand="1" w:val="04A0"/>
+      </w:tblPr>
+      <w:tblGrid>
+        <w:gridCol w:w="4703"/>
+        <w:gridCol w:w="4703"/>
+      </w:tblGrid>
+      <w:tr>
+        <w:tc>
+          <w:tcPr>
+            <w:tcW w:type="dxa" w:w="4703"/>
+            <w:shd w:val="clear" w:color="auto" w:fill="DAE3F3"/>
+          </w:tcPr>
+          <w:p>
+            <w:r>
+              <w:rPr>
+                <w:b/>
+              </w:rPr>
+              <w:t>Versión</w:t>
+            </w:r>
+          </w:p>
+        </w:tc>
+        <w:tc>
+          <w:tcPr>
+            <w:tcW w:type="dxa" w:w="4703"/>
+          </w:tcPr>
+          <w:p>
+            <w:r>
+              <w:t>1.0</w:t>
+            </w:r>
+          </w:p>
+        </w:tc>
+      </w:tr>
+      <w:tr>
+        <w:tc>
+          <w:tcPr>
+            <w:tcW w:type="dxa" w:w="4703"/>
+            <w:shd w:val="clear" w:color="auto" w:fill="DAE3F3"/>
+          </w:tcPr>
+          <w:p>
+            <w:r>
+              <w:rPr>
+                <w:b/>
+              </w:rPr>
+              <w:t>Fecha</w:t>
+            </w:r>
+          </w:p>
+        </w:tc>
+        <w:tc>
+          <w:tcPr>
+            <w:tcW w:type="dxa" w:w="4703"/>
+          </w:tcPr>
+          <w:p>
+            <w:r>
+              <w:t>18/09/2026</w:t>
+            </w:r>
+          </w:p>
+        </w:tc>
+      </w:tr>
+      <w:tr>
+        <w:tc>
+          <w:tcPr>
+            <w:tcW w:type="dxa" w:w="4703"/>
+            <w:shd w:val="clear" w:color="auto" w:fill="DAE3F3"/>
+          </w:tcPr>
+          <w:p>
+            <w:r>
+              <w:rPr>
+                <w:b/>
+              </w:rPr>
+              <w:t>Autor</w:t>
+            </w:r>
+          </w:p>
+        </w:tc>
+        <w:tc>
+          <w:tcPr>
+            <w:tcW w:type="dxa" w:w="4703"/>
+          </w:tcPr>
+          <w:p>
+            <w:r>
+              <w:t>Equipo TP — Ingeniería de Software</w:t>
+            </w:r>
+          </w:p>
+        </w:tc>
+      </w:tr>
+    </w:tbl>
+    <w:p/>
+    <w:tbl>
+      <w:tblPr>
+        <w:tblStyle w:val="LightGrid-Accent1"/>
+        <w:tblW w:type="auto" w:w="0"/>
+        <w:tblLook w:firstColumn="1" w:firstRow="1" w:lastColumn="0" w:lastRow="0" w:noHBand="0" w:noVBand="1" w:val="04A0"/>
+      </w:tblPr>
+      <w:tblGrid>
+        <w:gridCol w:w="4703"/>
+        <w:gridCol w:w="4703"/>
+      </w:tblGrid>
+      <w:tr>
+        <w:tc>
+          <w:tcPr>
+            <w:tcW w:type="dxa" w:w="4703"/>
+            <w:shd w:val="clear" w:color="auto" w:fill="DAE3F3"/>
+          </w:tcPr>
+          <w:p>
+            <w:r>
+              <w:rPr>
+                <w:b/>
+              </w:rPr>
+              <w:t>Identificador</w:t>
+            </w:r>
+          </w:p>
+        </w:tc>
+        <w:tc>
+          <w:tcPr>
+            <w:tcW w:type="dxa" w:w="4703"/>
+          </w:tcPr>
+          <w:p>
+            <w:r>
+              <w:t>CU-28</w:t>
+            </w:r>
+          </w:p>
+        </w:tc>
+      </w:tr>
+      <w:tr>
+        <w:tc>
+          <w:tcPr>
+            <w:tcW w:type="dxa" w:w="4703"/>
+            <w:shd w:val="clear" w:color="auto" w:fill="DAE3F3"/>
+          </w:tcPr>
+          <w:p>
+            <w:r>
+              <w:rPr>
+                <w:b/>
+              </w:rPr>
+              <w:t>Nombre</w:t>
+            </w:r>
+          </w:p>
+        </w:tc>
+        <w:tc>
+          <w:tcPr>
+            <w:tcW w:type="dxa" w:w="4703"/>
+          </w:tcPr>
+          <w:p>
+            <w:r>
+              <w:t>Armar Caja Mensual</w:t>
+            </w:r>
+          </w:p>
+        </w:tc>
+      </w:tr>
+      <w:tr>
+        <w:tc>
+          <w:tcPr>
+            <w:tcW w:type="dxa" w:w="4703"/>
+            <w:shd w:val="clear" w:color="auto" w:fill="DAE3F3"/>
+          </w:tcPr>
+          <w:p>
+            <w:r>
+              <w:rPr>
+                <w:b/>
+              </w:rPr>
+              <w:t>Actor primario</w:t>
+            </w:r>
+          </w:p>
+        </w:tc>
+        <w:tc>
+          <w:tcPr>
+            <w:tcW w:type="dxa" w:w="4703"/>
+          </w:tcPr>
+          <w:p>
+            <w:r>
+              <w:t>Usuario</w:t>
+            </w:r>
+          </w:p>
+        </w:tc>
+      </w:tr>
+      <w:tr>
+        <w:tc>
+          <w:tcPr>
+            <w:tcW w:type="dxa" w:w="4703"/>
+            <w:shd w:val="clear" w:color="auto" w:fill="DAE3F3"/>
+          </w:tcPr>
+          <w:p>
+            <w:r>
+              <w:rPr>
+                <w:b/>
+              </w:rPr>
+              <w:t>Frecuencia</w:t>
+            </w:r>
+          </w:p>
+        </w:tc>
+        <w:tc>
+          <w:tcPr>
+            <w:tcW w:type="dxa" w:w="4703"/>
+          </w:tcPr>
+          <w:p>
+            <w:r>
+              <w:t>Alta</w:t>
+            </w:r>
+          </w:p>
+        </w:tc>
+      </w:tr>
+      <w:tr>
+        <w:tc>
+          <w:tcPr>
+            <w:tcW w:type="dxa" w:w="4703"/>
+            <w:shd w:val="clear" w:color="auto" w:fill="DAE3F3"/>
+          </w:tcPr>
+          <w:p>
+            <w:r>
+              <w:rPr>
+                <w:b/>
+              </w:rPr>
+              <w:t>Prioridad</w:t>
+            </w:r>
+          </w:p>
+        </w:tc>
+        <w:tc>
+          <w:tcPr>
+            <w:tcW w:type="dxa" w:w="4703"/>
+          </w:tcPr>
+          <w:p>
+            <w:r>
+              <w:t>Alta</w:t>
+            </w:r>
+          </w:p>
+        </w:tc>
+      </w:tr>
+    </w:tbl>
+    <w:p/>
+    <w:p>
+      <w:pPr>
+        <w:pStyle w:val="Heading2"/>
+      </w:pPr>
+      <w:r>
+        <w:t>Historial de revisión</w:t>
+      </w:r>
+    </w:p>
+    <w:tbl>
+      <w:tblPr>
+        <w:tblStyle w:val="LightGrid-Accent1"/>
+        <w:tblW w:type="auto" w:w="0"/>
+        <w:tblLook w:firstColumn="1" w:firstRow="1" w:lastColumn="0" w:lastRow="0" w:noHBand="0" w:noVBand="1" w:val="04A0"/>
+      </w:tblPr>
+      <w:tblGrid>
+        <w:gridCol w:w="2351"/>
+        <w:gridCol w:w="2351"/>
+        <w:gridCol w:w="2351"/>
+        <w:gridCol w:w="2351"/>
+      </w:tblGrid>
+      <w:tr>
+        <w:tc>
+          <w:tcPr>
+            <w:tcW w:type="dxa" w:w="2351"/>
+            <w:shd w:val="clear" w:color="auto" w:fill="DAE3F3"/>
+          </w:tcPr>
+          <w:p>
+            <w:r>
+              <w:rPr>
+                <w:b/>
+              </w:rPr>
+              <w:t>Versión</w:t>
+            </w:r>
+          </w:p>
+        </w:tc>
+        <w:tc>
+          <w:tcPr>
+            <w:tcW w:type="dxa" w:w="2351"/>
+            <w:shd w:val="clear" w:color="auto" w:fill="DAE3F3"/>
+          </w:tcPr>
+          <w:p>
+            <w:r>
+              <w:rPr>
+                <w:b/>
+              </w:rPr>
+              <w:t>Fecha</w:t>
+            </w:r>
+          </w:p>
+        </w:tc>
+        <w:tc>
+          <w:tcPr>
+            <w:tcW w:type="dxa" w:w="2351"/>
+            <w:shd w:val="clear" w:color="auto" w:fill="DAE3F3"/>
+          </w:tcPr>
+          <w:p>
+            <w:r>
+              <w:rPr>
+                <w:b/>
+              </w:rPr>
+              <w:t>Autor</w:t>
+            </w:r>
+          </w:p>
+        </w:tc>
+        <w:tc>
+          <w:tcPr>
+            <w:tcW w:type="dxa" w:w="2351"/>
+            <w:shd w:val="clear" w:color="auto" w:fill="DAE3F3"/>
+          </w:tcPr>
+          <w:p>
+            <w:r>
+              <w:rPr>
+                <w:b/>
+              </w:rPr>
+              <w:t>Descripción</w:t>
+            </w:r>
+          </w:p>
+        </w:tc>
+      </w:tr>
+      <w:tr>
+        <w:tc>
+          <w:tcPr>
+            <w:tcW w:type="dxa" w:w="2351"/>
+          </w:tcPr>
+          <w:p>
+            <w:r>
+              <w:t>1.0</w:t>
+            </w:r>
+          </w:p>
+        </w:tc>
+        <w:tc>
+          <w:tcPr>
+            <w:tcW w:type="dxa" w:w="2351"/>
+          </w:tcPr>
+          <w:p>
+            <w:r>
+              <w:t>18/09/2026</w:t>
+            </w:r>
+          </w:p>
+        </w:tc>
+        <w:tc>
+          <w:tcPr>
+            <w:tcW w:type="dxa" w:w="2351"/>
+          </w:tcPr>
+          <w:p>
+            <w:r>
+              <w:t>Equipo TP</w:t>
+            </w:r>
+          </w:p>
+        </w:tc>
+        <w:tc>
+          <w:tcPr>
+            <w:tcW w:type="dxa" w:w="2351"/>
+          </w:tcPr>
+          <w:p>
+            <w:r>
+              <w:t>Versión inicial — Entrega 2 (análisis y diseño). Dominio de curación y armado de cajas mensuales, Club de Socios.</w:t>
+            </w:r>
+          </w:p>
+        </w:tc>
+      </w:tr>
+    </w:tbl>
+    <w:p/>
+    <w:p>
+      <w:pPr>
+        <w:pStyle w:val="Heading2"/>
+      </w:pPr>
+      <w:r>
+        <w:t>Objetivo</w:t>
+      </w:r>
+    </w:p>
+    <w:p>
+      <w:r>
+        <w:t>Permitir que un Usuario con el permiso "Armar cajas mensuales" (rol Curador de Producto) arme una caja mensual para un socio y un período, con líneas tomadas solo del catálogo gobernado (RN-06) y sin exceder el presupuesto mensual del socio (RN-05).</w:t>
+      </w:r>
+    </w:p>
+    <w:p>
+      <w:pPr>
+        <w:pStyle w:val="Heading2"/>
+      </w:pPr>
+      <w:r>
+        <w:t>Precondiciones</w:t>
+      </w:r>
+    </w:p>
+    <w:p>
+      <w:pPr>
+        <w:pStyle w:val="ListBullet"/>
+      </w:pPr>
+      <w:r>
+        <w:t>El Usuario inició sesión correctamente y tiene el permiso "Armar cajas mensuales".</w:t>
+      </w:r>
+    </w:p>
+    <w:p>
+      <w:pPr>
+        <w:pStyle w:val="ListBullet"/>
+      </w:pPr>
+      <w:r>
+        <w:t>Existe al menos un socio activo con perfil vigente (presupuesto mensual cargado).</w:t>
+      </w:r>
+    </w:p>
+    <w:p>
+      <w:pPr>
+        <w:pStyle w:val="ListBullet"/>
+      </w:pPr>
+      <w:r>
+        <w:t>Existe al menos un vino que cumple RN-06 (Activo, autorizado, con stock derivado &gt; 0).</w:t>
+      </w:r>
+    </w:p>
+    <w:p>
+      <w:pPr>
+        <w:pStyle w:val="Heading2"/>
+      </w:pPr>
+      <w:r>
+        <w:t>Postcondiciones</w:t>
+      </w:r>
+    </w:p>
+    <w:p>
+      <w:pPr>
+        <w:pStyle w:val="Heading3"/>
+      </w:pPr>
+      <w:r>
+        <w:t>En caso de éxito</w:t>
+      </w:r>
+    </w:p>
+    <w:p>
+      <w:pPr>
+        <w:pStyle w:val="ListBullet"/>
+      </w:pPr>
+      <w:r>
+        <w:t>Se crea una CAJA_MENSUAL en estado Armada, con presupuesto congelado (PRESUPUESTO_SNAPSHOT).</w:t>
+      </w:r>
+    </w:p>
+    <w:p>
+      <w:pPr>
+        <w:pStyle w:val="ListBullet"/>
+      </w:pPr>
+      <w:r>
+        <w:t>Cada línea CAJA_VINO queda con NOMBRE_SNAPSHOT y PRECIO_SNAPSHOT congelados (RN-04).</w:t>
+      </w:r>
+    </w:p>
+    <w:p>
+      <w:pPr>
+        <w:pStyle w:val="Heading3"/>
+      </w:pPr>
+      <w:r>
+        <w:t>En caso de fallo</w:t>
+      </w:r>
+    </w:p>
+    <w:p>
+      <w:pPr>
+        <w:pStyle w:val="ListBullet"/>
+      </w:pPr>
+      <w:r>
+        <w:t>Si la suma de las líneas supera el presupuesto del socio: no se persiste ninguna línea ni la caja.</w:t>
+      </w:r>
+    </w:p>
+    <w:p>
+      <w:pPr>
+        <w:pStyle w:val="ListBullet"/>
+      </w:pPr>
+      <w:r>
+        <w:t>Si el socio ya tiene una caja no cancelada para ese período: se rechaza el armado.</w:t>
+      </w:r>
+    </w:p>
+    <w:p>
+      <w:pPr>
+        <w:pStyle w:val="ListBullet"/>
+      </w:pPr>
+      <w:r>
+        <w:t>Si una línea dejó de cumplir RN-06 durante la selección: se rechaza el armado.</w:t>
+      </w:r>
+    </w:p>
+    <w:p>
+      <w:pPr>
+        <w:pStyle w:val="Heading2"/>
+      </w:pPr>
+      <w:r>
+        <w:t>Evento disparador</w:t>
+      </w:r>
+    </w:p>
+    <w:p>
+      <w:r>
+        <w:t>El Usuario presiona "Armar caja mensual" en frmArmarCaja.</w:t>
+      </w:r>
+    </w:p>
+    <w:p>
+      <w:pPr>
+        <w:pStyle w:val="Heading2"/>
+      </w:pPr>
+      <w:r>
+        <w:t>Puntos de extensión</w:t>
+      </w:r>
+    </w:p>
+    <w:tbl>
+      <w:tblPr>
+        <w:tblStyle w:val="LightGrid-Accent1"/>
+        <w:tblW w:type="auto" w:w="0"/>
+        <w:tblLook w:firstColumn="1" w:firstRow="1" w:lastColumn="0" w:lastRow="0" w:noHBand="0" w:noVBand="1" w:val="04A0"/>
+      </w:tblPr>
+      <w:tblGrid>
+        <w:gridCol w:w="4703"/>
+        <w:gridCol w:w="4703"/>
+      </w:tblGrid>
+      <w:tr>
+        <w:tc>
+          <w:tcPr>
+            <w:tcW w:type="dxa" w:w="4703"/>
+            <w:shd w:val="clear" w:color="auto" w:fill="DAE3F3"/>
+          </w:tcPr>
+          <w:p>
+            <w:r>
+              <w:rPr>
+                <w:b/>
+              </w:rPr>
+              <w:t>Paso</w:t>
+            </w:r>
+          </w:p>
+        </w:tc>
+        <w:tc>
+          <w:tcPr>
+            <w:tcW w:type="dxa" w:w="4703"/>
+            <w:shd w:val="clear" w:color="auto" w:fill="DAE3F3"/>
+          </w:tcPr>
+          <w:p>
+            <w:r>
+              <w:rPr>
+                <w:b/>
+              </w:rPr>
+              <w:t>Extensión posible</w:t>
+            </w:r>
+          </w:p>
+        </w:tc>
+      </w:tr>
+      <w:tr>
+        <w:tc>
+          <w:tcPr>
+            <w:tcW w:type="dxa" w:w="4703"/>
+          </w:tcPr>
+          <w:p>
+            <w:r>
+              <w:t>Tras el paso 8 (caja armada)</w:t>
+            </w:r>
+          </w:p>
+        </w:tc>
+        <w:tc>
+          <w:tcPr>
+            <w:tcW w:type="dxa" w:w="4703"/>
+          </w:tcPr>
+          <w:p>
+            <w:r>
+              <w:t>Continúa en CU-29 Registrar Sustitución por Falta de Stock (si el picking detecta faltantes) y en CU-31 Despachar Caja.</w:t>
+            </w:r>
+          </w:p>
+        </w:tc>
+      </w:tr>
+    </w:tbl>
+    <w:p/>
+    <w:p>
+      <w:pPr>
+        <w:pStyle w:val="Heading2"/>
+      </w:pPr>
+      <w:r>
+        <w:t>Gráfico del caso de uso</w:t>
+      </w:r>
+    </w:p>
+    <w:p>
+      <w:r>
+        <w:rPr>
+          <w:rFonts w:ascii="Consolas" w:hAnsi="Consolas"/>
+          <w:sz w:val="18"/>
+        </w:rPr>
+        <w:t>Actor: Usuario (permiso "Armar cajas mensuales") ──&gt; (Armar Caja Mensual)</w:t>
+        <w:br/>
+        <w:br/>
+        <w:t>(Armar Caja Mensual) ── «precede» ──&gt; (Registrar Sustitución, CU-29)</w:t>
+        <w:br/>
+        <w:t>(Armar Caja Mensual) ── «precede» ──&gt; (Despachar Caja, CU-31)</w:t>
+      </w:r>
+    </w:p>
+    <w:p/>
+    <w:p>
+      <w:pPr>
+        <w:pStyle w:val="Heading2"/>
+      </w:pPr>
+      <w:r>
+        <w:t>Flujo principal</w:t>
+      </w:r>
+    </w:p>
+    <w:p>
+      <w:pPr>
+        <w:pStyle w:val="ListNumber"/>
+      </w:pPr>
+      <w:r>
+        <w:t>El Usuario abre "Armar caja mensual" en frmArmarCaja.</w:t>
+      </w:r>
+    </w:p>
+    <w:p>
+      <w:pPr>
+        <w:pStyle w:val="ListNumber"/>
+      </w:pPr>
+      <w:r>
+        <w:t>El sistema lista los socios activos.</w:t>
+      </w:r>
+    </w:p>
+    <w:p>
+      <w:pPr>
+        <w:pStyle w:val="ListNumber"/>
+      </w:pPr>
+      <w:r>
+        <w:t>El Usuario selecciona un socio y un período (formato YYYY-MM).</w:t>
+      </w:r>
+    </w:p>
+    <w:p>
+      <w:pPr>
+        <w:pStyle w:val="ListNumber"/>
+      </w:pPr>
+      <w:r>
+        <w:t>El sistema lista los vinos candidatos que cumplen RN-06, ordenados con los varietales preferidos del socio primero (RN-05.2, ranking, no filtro).</w:t>
+      </w:r>
+    </w:p>
+    <w:p>
+      <w:pPr>
+        <w:pStyle w:val="ListNumber"/>
+      </w:pPr>
+      <w:r>
+        <w:t>El sistema muestra el presupuesto mensual del socio y el total de la caja en $0.</w:t>
+      </w:r>
+    </w:p>
+    <w:p>
+      <w:pPr>
+        <w:pStyle w:val="ListNumber"/>
+      </w:pPr>
+      <w:r>
+        <w:t>El Usuario agrega vinos con su cantidad; el sistema recalcula el total en cada línea y deshabilita "Confirmar" si se supera el presupuesto.</w:t>
+      </w:r>
+    </w:p>
+    <w:p>
+      <w:pPr>
+        <w:pStyle w:val="ListNumber"/>
+      </w:pPr>
+      <w:r>
+        <w:t>El Usuario presiona "Confirmar armado".</w:t>
+      </w:r>
+    </w:p>
+    <w:p>
+      <w:pPr>
+        <w:pStyle w:val="ListNumber"/>
+      </w:pPr>
+      <w:r>
+        <w:t>El sistema valida el total contra el presupuesto (RN-05.1), la unicidad del período (RN-08) y que cada línea siga cumpliendo RN-06, e inserta la caja y sus líneas en una única transacción, dejándola en estado Armada.</w:t>
+      </w:r>
+    </w:p>
+    <w:p>
+      <w:pPr>
+        <w:pStyle w:val="ListNumber"/>
+      </w:pPr>
+      <w:r>
+        <w:t>El sistema informa que la caja quedó armada.</w:t>
+      </w:r>
+    </w:p>
+    <w:p>
+      <w:pPr>
+        <w:pStyle w:val="Heading2"/>
+      </w:pPr>
+      <w:r>
+        <w:t>Flujos alternativos</w:t>
+      </w:r>
+    </w:p>
+    <w:p>
+      <w:pPr>
+        <w:pStyle w:val="Heading3"/>
+      </w:pPr>
+      <w:r>
+        <w:t>8a. El total supera el presupuesto mensual (RN-05.1)</w:t>
+      </w:r>
+    </w:p>
+    <w:p>
+      <w:pPr>
+        <w:pStyle w:val="ListBullet"/>
+      </w:pPr>
+      <w:r>
+        <w:t>El sistema muestra "El total de la caja supera el presupuesto mensual del socio."</w:t>
+      </w:r>
+    </w:p>
+    <w:p>
+      <w:pPr>
+        <w:pStyle w:val="ListBullet"/>
+      </w:pPr>
+      <w:r>
+        <w:t>El caso de uso vuelve al paso 6.</w:t>
+      </w:r>
+    </w:p>
+    <w:p>
+      <w:pPr>
+        <w:pStyle w:val="Heading3"/>
+      </w:pPr>
+      <w:r>
+        <w:t>8b. Ya existe una caja no cancelada del socio para el período (RN-08)</w:t>
+      </w:r>
+    </w:p>
+    <w:p>
+      <w:pPr>
+        <w:pStyle w:val="ListBullet"/>
+      </w:pPr>
+      <w:r>
+        <w:t>El sistema muestra "El socio ya tiene una caja armada para ese período."</w:t>
+      </w:r>
+    </w:p>
+    <w:p>
+      <w:pPr>
+        <w:pStyle w:val="ListBullet"/>
+      </w:pPr>
+      <w:r>
+        <w:t>El caso de uso vuelve al paso 3.</w:t>
+      </w:r>
+    </w:p>
+    <w:p>
+      <w:pPr>
+        <w:pStyle w:val="Heading3"/>
+      </w:pPr>
+      <w:r>
+        <w:t>8c. Una línea dejó de cumplir RN-06 durante la selección</w:t>
+      </w:r>
+    </w:p>
+    <w:p>
+      <w:pPr>
+        <w:pStyle w:val="ListBullet"/>
+      </w:pPr>
+      <w:r>
+        <w:t>El sistema muestra "El vino seleccionado no está disponible para armado."</w:t>
+      </w:r>
+    </w:p>
+    <w:p>
+      <w:pPr>
+        <w:pStyle w:val="ListBullet"/>
+      </w:pPr>
+      <w:r>
+        <w:t>El caso de uso vuelve al paso 6.</w:t>
+      </w:r>
+    </w:p>
+    <w:p>
+      <w:pPr>
+        <w:pStyle w:val="Heading2"/>
+      </w:pPr>
+      <w:r>
+        <w:t>Excepciones</w:t>
+      </w:r>
+    </w:p>
+    <w:tbl>
+      <w:tblPr>
+        <w:tblStyle w:val="LightGrid-Accent1"/>
+        <w:tblW w:type="auto" w:w="0"/>
+        <w:tblLook w:firstColumn="1" w:firstRow="1" w:lastColumn="0" w:lastRow="0" w:noHBand="0" w:noVBand="1" w:val="04A0"/>
+      </w:tblPr>
+      <w:tblGrid>
+        <w:gridCol w:w="3135"/>
+        <w:gridCol w:w="3135"/>
+        <w:gridCol w:w="3135"/>
+      </w:tblGrid>
+      <w:tr>
+        <w:tc>
+          <w:tcPr>
+            <w:tcW w:type="dxa" w:w="3135"/>
+            <w:shd w:val="clear" w:color="auto" w:fill="DAE3F3"/>
+          </w:tcPr>
+          <w:p>
+            <w:r>
+              <w:rPr>
+                <w:b/>
+              </w:rPr>
+              <w:t>Código</w:t>
+            </w:r>
+          </w:p>
+        </w:tc>
+        <w:tc>
+          <w:tcPr>
+            <w:tcW w:type="dxa" w:w="3135"/>
+            <w:shd w:val="clear" w:color="auto" w:fill="DAE3F3"/>
+          </w:tcPr>
+          <w:p>
+            <w:r>
+              <w:rPr>
+                <w:b/>
+              </w:rPr>
+              <w:t>Descripción</w:t>
+            </w:r>
+          </w:p>
+        </w:tc>
+        <w:tc>
+          <w:tcPr>
+            <w:tcW w:type="dxa" w:w="3135"/>
+            <w:shd w:val="clear" w:color="auto" w:fill="DAE3F3"/>
+          </w:tcPr>
+          <w:p>
+            <w:r>
+              <w:rPr>
+                <w:b/>
+              </w:rPr>
+              <w:t>Manejo</w:t>
+            </w:r>
+          </w:p>
+        </w:tc>
+      </w:tr>
+      <w:tr>
+        <w:tc>
+          <w:tcPr>
+            <w:tcW w:type="dxa" w:w="3135"/>
+          </w:tcPr>
+          <w:p>
+            <w:r>
+              <w:t>EX-01</w:t>
+            </w:r>
+          </w:p>
+        </w:tc>
+        <w:tc>
+          <w:tcPr>
+            <w:tcW w:type="dxa" w:w="3135"/>
+          </w:tcPr>
+          <w:p>
+            <w:r>
+              <w:t>Error de conexión con la base de datos durante el armado.</w:t>
+            </w:r>
+          </w:p>
+        </w:tc>
+        <w:tc>
+          <w:tcPr>
+            <w:tcW w:type="dxa" w:w="3135"/>
+          </w:tcPr>
+          <w:p>
+            <w:r>
+              <w:t>Mensaje genérico al Usuario; la transacción se revierte, no queda ninguna línea parcial.</w:t>
+            </w:r>
+          </w:p>
+        </w:tc>
+      </w:tr>
+    </w:tbl>
+    <w:p/>
+    <w:p>
+      <w:pPr>
+        <w:pStyle w:val="Heading2"/>
+      </w:pPr>
+      <w:r>
+        <w:t>Reglas de negocio</w:t>
+      </w:r>
+    </w:p>
+    <w:tbl>
+      <w:tblPr>
+        <w:tblStyle w:val="LightGrid-Accent1"/>
+        <w:tblW w:type="auto" w:w="0"/>
+        <w:tblLook w:firstColumn="1" w:firstRow="1" w:lastColumn="0" w:lastRow="0" w:noHBand="0" w:noVBand="1" w:val="04A0"/>
+      </w:tblPr>
+      <w:tblGrid>
+        <w:gridCol w:w="4703"/>
+        <w:gridCol w:w="4703"/>
+      </w:tblGrid>
+      <w:tr>
+        <w:tc>
+          <w:tcPr>
+            <w:tcW w:type="dxa" w:w="4703"/>
+            <w:shd w:val="clear" w:color="auto" w:fill="DAE3F3"/>
+          </w:tcPr>
+          <w:p>
+            <w:r>
+              <w:rPr>
+                <w:b/>
+              </w:rPr>
+              <w:t>Código</w:t>
+            </w:r>
+          </w:p>
+        </w:tc>
+        <w:tc>
+          <w:tcPr>
+            <w:tcW w:type="dxa" w:w="4703"/>
+            <w:shd w:val="clear" w:color="auto" w:fill="DAE3F3"/>
+          </w:tcPr>
+          <w:p>
+            <w:r>
+              <w:rPr>
+                <w:b/>
+              </w:rPr>
+              <w:t>Regla</w:t>
+            </w:r>
+          </w:p>
+        </w:tc>
+      </w:tr>
+      <w:tr>
+        <w:tc>
+          <w:tcPr>
+            <w:tcW w:type="dxa" w:w="4703"/>
+          </w:tcPr>
+          <w:p>
+            <w:r>
+              <w:t>RN-04</w:t>
+            </w:r>
+          </w:p>
+        </w:tc>
+        <w:tc>
+          <w:tcPr>
+            <w:tcW w:type="dxa" w:w="4703"/>
+          </w:tcPr>
+          <w:p>
+            <w:r>
+              <w:t>Cada línea de caja congela NOMBRE y PRECIO del vino al momento del armado (snapshot).</w:t>
+            </w:r>
+          </w:p>
+        </w:tc>
+      </w:tr>
+      <w:tr>
+        <w:tc>
+          <w:tcPr>
+            <w:tcW w:type="dxa" w:w="4703"/>
+          </w:tcPr>
+          <w:p>
+            <w:r>
+              <w:t>RN-05</w:t>
+            </w:r>
+          </w:p>
+        </w:tc>
+        <w:tc>
+          <w:tcPr>
+            <w:tcW w:type="dxa" w:w="4703"/>
+          </w:tcPr>
+          <w:p>
+            <w:r>
+              <w:t>La suma de las líneas no puede exceder el presupuesto del socio (tope duro, RN-05.1); los varietales preferidos solo ordenan candidatos, nunca excluyen (RN-05.2).</w:t>
+            </w:r>
+          </w:p>
+        </w:tc>
+      </w:tr>
+      <w:tr>
+        <w:tc>
+          <w:tcPr>
+            <w:tcW w:type="dxa" w:w="4703"/>
+          </w:tcPr>
+          <w:p>
+            <w:r>
+              <w:t>RN-06</w:t>
+            </w:r>
+          </w:p>
+        </w:tc>
+        <w:tc>
+          <w:tcPr>
+            <w:tcW w:type="dxa" w:w="4703"/>
+          </w:tcPr>
+          <w:p>
+            <w:r>
+              <w:t>Solo pueden incluirse vinos Activos, autorizados y con stock derivado mayor a cero (catálogo gobernado).</w:t>
+            </w:r>
+          </w:p>
+        </w:tc>
+      </w:tr>
+      <w:tr>
+        <w:tc>
+          <w:tcPr>
+            <w:tcW w:type="dxa" w:w="4703"/>
+          </w:tcPr>
+          <w:p>
+            <w:r>
+              <w:t>RN-08</w:t>
+            </w:r>
+          </w:p>
+        </w:tc>
+        <w:tc>
+          <w:tcPr>
+            <w:tcW w:type="dxa" w:w="4703"/>
+          </w:tcPr>
+          <w:p>
+            <w:r>
+              <w:t>Un socio no puede tener más de una caja no cancelada por período.</w:t>
+            </w:r>
+          </w:p>
+        </w:tc>
+      </w:tr>
+      <w:tr>
+        <w:tc>
+          <w:tcPr>
+            <w:tcW w:type="dxa" w:w="4703"/>
+          </w:tcPr>
+          <w:p>
+            <w:r>
+              <w:t>RN-09</w:t>
+            </w:r>
+          </w:p>
+        </w:tc>
+        <w:tc>
+          <w:tcPr>
+            <w:tcW w:type="dxa" w:w="4703"/>
+          </w:tcPr>
+          <w:p>
+            <w:r>
+              <w:t>Armar una caja no reserva ni descuenta stock; la salida se registra recién al despachar (ver CU-31).</w:t>
+            </w:r>
+          </w:p>
+        </w:tc>
+      </w:tr>
+    </w:tbl>
+    <w:p/>
+    <w:p>
+      <w:pPr>
+        <w:pStyle w:val="Heading2"/>
+      </w:pPr>
+      <w:r>
+        <w:t>Relaciones con otros casos de uso</w:t>
+      </w:r>
+    </w:p>
+    <w:tbl>
+      <w:tblPr>
+        <w:tblStyle w:val="LightGrid-Accent1"/>
+        <w:tblW w:type="auto" w:w="0"/>
+        <w:tblLook w:firstColumn="1" w:firstRow="1" w:lastColumn="0" w:lastRow="0" w:noHBand="0" w:noVBand="1" w:val="04A0"/>
+      </w:tblPr>
+      <w:tblGrid>
+        <w:gridCol w:w="3135"/>
+        <w:gridCol w:w="3135"/>
+        <w:gridCol w:w="3135"/>
+      </w:tblGrid>
+      <w:tr>
+        <w:tc>
+          <w:tcPr>
+            <w:tcW w:type="dxa" w:w="3135"/>
+            <w:shd w:val="clear" w:color="auto" w:fill="DAE3F3"/>
+          </w:tcPr>
+          <w:p>
+            <w:r>
+              <w:rPr>
+                <w:b/>
+              </w:rPr>
+              <w:t>Tipo</w:t>
+            </w:r>
+          </w:p>
+        </w:tc>
+        <w:tc>
+          <w:tcPr>
+            <w:tcW w:type="dxa" w:w="3135"/>
+            <w:shd w:val="clear" w:color="auto" w:fill="DAE3F3"/>
+          </w:tcPr>
+          <w:p>
+            <w:r>
+              <w:rPr>
+                <w:b/>
+              </w:rPr>
+              <w:t>Destino</w:t>
+            </w:r>
+          </w:p>
+        </w:tc>
+        <w:tc>
+          <w:tcPr>
+            <w:tcW w:type="dxa" w:w="3135"/>
+            <w:shd w:val="clear" w:color="auto" w:fill="DAE3F3"/>
+          </w:tcPr>
+          <w:p>
+            <w:r>
+              <w:rPr>
+                <w:b/>
+              </w:rPr>
+              <w:t>Condición</w:t>
+            </w:r>
+          </w:p>
+        </w:tc>
+      </w:tr>
+      <w:tr>
+        <w:tc>
+          <w:tcPr>
+            <w:tcW w:type="dxa" w:w="3135"/>
+          </w:tcPr>
+          <w:p>
+            <w:r>
+              <w:t>«precede» a</w:t>
+            </w:r>
+          </w:p>
+        </w:tc>
+        <w:tc>
+          <w:tcPr>
+            <w:tcW w:type="dxa" w:w="3135"/>
+          </w:tcPr>
+          <w:p>
+            <w:r>
+              <w:t>CU-29 Registrar Sustitución por Falta de Stock</w:t>
+            </w:r>
+          </w:p>
+        </w:tc>
+        <w:tc>
+          <w:tcPr>
+            <w:tcW w:type="dxa" w:w="3135"/>
+          </w:tcPr>
+          <w:p>
+            <w:r>
+              <w:t>Solo se pueden registrar sustituciones sobre cajas previamente armadas.</w:t>
+            </w:r>
+          </w:p>
+        </w:tc>
+      </w:tr>
+      <w:tr>
+        <w:tc>
+          <w:tcPr>
+            <w:tcW w:type="dxa" w:w="3135"/>
+          </w:tcPr>
+          <w:p>
+            <w:r>
+              <w:t>«precede» a</w:t>
+            </w:r>
+          </w:p>
+        </w:tc>
+        <w:tc>
+          <w:tcPr>
+            <w:tcW w:type="dxa" w:w="3135"/>
+          </w:tcPr>
+          <w:p>
+            <w:r>
+              <w:t>CU-31 Despachar Caja</w:t>
+            </w:r>
+          </w:p>
+        </w:tc>
+        <w:tc>
+          <w:tcPr>
+            <w:tcW w:type="dxa" w:w="3135"/>
+          </w:tcPr>
+          <w:p>
+            <w:r>
+              <w:t>Solo se pueden despachar cajas previamente armadas.</w:t>
+            </w:r>
+          </w:p>
+        </w:tc>
+      </w:tr>
+    </w:tbl>
+    <w:p/>
+    <w:p>
+      <w:pPr>
+        <w:pStyle w:val="Heading2"/>
+      </w:pPr>
+      <w:r>
+        <w:t>Diagrama de clases afectadas</w:t>
+      </w:r>
+    </w:p>
+    <w:p>
+      <w:r>
+        <w:drawing>
+          <wp:inline xmlns:a="http://schemas.openxmlformats.org/drawingml/2006/main" xmlns:pic="http://schemas.openxmlformats.org/drawingml/2006/picture">
+            <wp:extent cx="5400000" cy="2538831"/>
+            <wp:docPr id="19" name="Picture 19"/>
+            <wp:cNvGraphicFramePr>
+              <a:graphicFrameLocks noChangeAspect="1"/>
+            </wp:cNvGraphicFramePr>
+            <a:graphic>
+              <a:graphicData uri="http://schemas.openxmlformats.org/drawingml/2006/picture">
+                <pic:pic>
+                  <pic:nvPicPr>
+                    <pic:cNvPr id="0" name="DiagramaClases_CuracionCajas.png"/>
+                    <pic:cNvPicPr/>
+                  </pic:nvPicPr>
+                  <pic:blipFill>
+                    <a:blip r:embed="rId17"/>
+                    <a:stretch>
+                      <a:fillRect/>
+                    </a:stretch>
+                  </pic:blipFill>
+                  <pic:spPr>
+                    <a:xfrm>
+                      <a:off x="0" y="0"/>
+                      <a:ext cx="5400000" cy="2538831"/>
+                    </a:xfrm>
+                    <a:prstGeom prst="rect"/>
+                  </pic:spPr>
+                </pic:pic>
+              </a:graphicData>
+            </a:graphic>
+          </wp:inline>
+        </w:drawing>
+      </w:r>
+    </w:p>
+    <w:p/>
+    <w:p>
+      <w:pPr>
+        <w:pStyle w:val="Heading2"/>
+      </w:pPr>
+      <w:r>
+        <w:t>Diagrama de secuencia</w:t>
+      </w:r>
+    </w:p>
+    <w:p>
+      <w:r>
+        <w:drawing>
+          <wp:inline xmlns:a="http://schemas.openxmlformats.org/drawingml/2006/main" xmlns:pic="http://schemas.openxmlformats.org/drawingml/2006/picture">
+            <wp:extent cx="5400000" cy="3891638"/>
+            <wp:docPr id="20" name="Picture 20"/>
+            <wp:cNvGraphicFramePr>
+              <a:graphicFrameLocks noChangeAspect="1"/>
+            </wp:cNvGraphicFramePr>
+            <a:graphic>
+              <a:graphicData uri="http://schemas.openxmlformats.org/drawingml/2006/picture">
+                <pic:pic>
+                  <pic:nvPicPr>
+                    <pic:cNvPr id="0" name="DiagramaSecuencia_CU28_ArmarCajaMensual.png"/>
+                    <pic:cNvPicPr/>
+                  </pic:nvPicPr>
+                  <pic:blipFill>
+                    <a:blip r:embed="rId18"/>
+                    <a:stretch>
+                      <a:fillRect/>
+                    </a:stretch>
+                  </pic:blipFill>
+                  <pic:spPr>
+                    <a:xfrm>
+                      <a:off x="0" y="0"/>
+                      <a:ext cx="5400000" cy="3891638"/>
+                    </a:xfrm>
+                    <a:prstGeom prst="rect"/>
+                  </pic:spPr>
+                </pic:pic>
+              </a:graphicData>
+            </a:graphic>
+          </wp:inline>
+        </w:drawing>
+      </w:r>
+    </w:p>
+    <w:p/>
+    <w:p>
+      <w:pPr>
+        <w:pStyle w:val="Heading2"/>
+      </w:pPr>
+      <w:r>
+        <w:t>DER — entidades afectadas</w:t>
+      </w:r>
+    </w:p>
+    <w:p>
+      <w:r>
+        <w:drawing>
+          <wp:inline xmlns:a="http://schemas.openxmlformats.org/drawingml/2006/main" xmlns:pic="http://schemas.openxmlformats.org/drawingml/2006/picture">
+            <wp:extent cx="5400000" cy="4204392"/>
+            <wp:docPr id="21" name="Picture 21"/>
+            <wp:cNvGraphicFramePr>
+              <a:graphicFrameLocks noChangeAspect="1"/>
+            </wp:cNvGraphicFramePr>
+            <a:graphic>
+              <a:graphicData uri="http://schemas.openxmlformats.org/drawingml/2006/picture">
+                <pic:pic>
+                  <pic:nvPicPr>
+                    <pic:cNvPr id="0" name="DER.png"/>
+                    <pic:cNvPicPr/>
+                  </pic:nvPicPr>
+                  <pic:blipFill>
+                    <a:blip r:embed="rId11"/>
+                    <a:stretch>
+                      <a:fillRect/>
+                    </a:stretch>
+                  </pic:blipFill>
+                  <pic:spPr>
+                    <a:xfrm>
+                      <a:off x="0" y="0"/>
+                      <a:ext cx="5400000" cy="4204392"/>
+                    </a:xfrm>
+                    <a:prstGeom prst="rect"/>
+                  </pic:spPr>
+                </pic:pic>
+              </a:graphicData>
+            </a:graphic>
+          </wp:inline>
+        </w:drawing>
+      </w:r>
+    </w:p>
+    <w:p/>
+    <w:p>
+      <w:r>
+        <w:t>Entidades afectadas: SOCIO, CAJA_MENSUAL, CAJA_VINO, VINO</w:t>
+      </w:r>
+    </w:p>
+    <w:p>
+      <w:pPr>
+        <w:pStyle w:val="Heading2"/>
+      </w:pPr>
+      <w:r>
+        <w:t>Prototipo de interfaz de usuario</w:t>
+      </w:r>
+    </w:p>
+    <w:p>
+      <w:r>
+        <w:rPr>
+          <w:rFonts w:ascii="Consolas" w:hAnsi="Consolas"/>
+          <w:sz w:val="16"/>
+        </w:rPr>
+        <w:t>frmArmarCaja (WinForms — MaterialForm)</w:t>
+        <w:br/>
+        <w:t>+-----------------------------------------------------+</w:t>
+        <w:br/>
+        <w:t>|  Armar Caja Mensual                            [x]   |</w:t>
+        <w:br/>
+        <w:t>+-------------------------------------------------------+</w:t>
+        <w:br/>
+        <w:t>| Socio:        [ ComboBox  v]   Periodo: [ 2026-10 ]   |</w:t>
+        <w:br/>
+        <w:t>| Presupuesto:  $ 15000.00        Total:  $ 0.00        |</w:t>
+        <w:br/>
+        <w:t>| [DataGridView: Vino | Precio | Preferido | Cantidad]  |</w:t>
+        <w:br/>
+        <w:t>|                                                       |</w:t>
+        <w:br/>
+        <w:t>|              [ Confirmar armado ]  [ Cancelar ]       |</w:t>
+        <w:br/>
+        <w:t>+---------------------------------------------------------+</w:t>
+      </w:r>
+    </w:p>
+    <w:p>
+      <w:pPr>
+        <w:pStyle w:val="Heading2"/>
+      </w:pPr>
+      <w:r>
+        <w:t>Observaciones</w:t>
+      </w:r>
+    </w:p>
+    <w:p>
+      <w:r>
+        <w:t>RN-09 marca explícitamente que armar la caja no genera ningún MOVIMIENTO_STOCK — la primera salida de kardex de este dominio ocurre recién en el despacho (CU-31). El diseño también define una SP CAJA_CANCELAR y un método CajaMensualBLL.Cancelar para el estado Cancelada (RN-08), sin un CU dedicado en esta entrega: la cancelación de una caja mal armada queda como operación de soporte sin flujo propio en N02.</w:t>
+      </w:r>
+    </w:p>
+    <w:p>
+      <w:r>
+        <w:br w:type="page"/>
+      </w:r>
+    </w:p>
+    <w:p>
+      <w:pPr>
+        <w:pStyle w:val="Heading1"/>
+      </w:pPr>
+      <w:r>
+        <w:t>CU-29 — Registrar Sustitución por Falta de Stock</w:t>
+      </w:r>
+    </w:p>
+    <w:tbl>
+      <w:tblPr>
+        <w:tblStyle w:val="LightGrid-Accent1"/>
+        <w:tblW w:type="auto" w:w="0"/>
+        <w:tblLook w:firstColumn="1" w:firstRow="1" w:lastColumn="0" w:lastRow="0" w:noHBand="0" w:noVBand="1" w:val="04A0"/>
+      </w:tblPr>
+      <w:tblGrid>
+        <w:gridCol w:w="4703"/>
+        <w:gridCol w:w="4703"/>
+      </w:tblGrid>
+      <w:tr>
+        <w:tc>
+          <w:tcPr>
+            <w:tcW w:type="dxa" w:w="4703"/>
+            <w:shd w:val="clear" w:color="auto" w:fill="DAE3F3"/>
+          </w:tcPr>
+          <w:p>
+            <w:r>
+              <w:rPr>
+                <w:b/>
+              </w:rPr>
+              <w:t>Versión</w:t>
+            </w:r>
+          </w:p>
+        </w:tc>
+        <w:tc>
+          <w:tcPr>
+            <w:tcW w:type="dxa" w:w="4703"/>
+          </w:tcPr>
+          <w:p>
+            <w:r>
+              <w:t>1.0</w:t>
+            </w:r>
+          </w:p>
+        </w:tc>
+      </w:tr>
+      <w:tr>
+        <w:tc>
+          <w:tcPr>
+            <w:tcW w:type="dxa" w:w="4703"/>
+            <w:shd w:val="clear" w:color="auto" w:fill="DAE3F3"/>
+          </w:tcPr>
+          <w:p>
+            <w:r>
+              <w:rPr>
+                <w:b/>
+              </w:rPr>
+              <w:t>Fecha</w:t>
+            </w:r>
+          </w:p>
+        </w:tc>
+        <w:tc>
+          <w:tcPr>
+            <w:tcW w:type="dxa" w:w="4703"/>
+          </w:tcPr>
+          <w:p>
+            <w:r>
+              <w:t>18/09/2026</w:t>
+            </w:r>
+          </w:p>
+        </w:tc>
+      </w:tr>
+      <w:tr>
+        <w:tc>
+          <w:tcPr>
+            <w:tcW w:type="dxa" w:w="4703"/>
+            <w:shd w:val="clear" w:color="auto" w:fill="DAE3F3"/>
+          </w:tcPr>
+          <w:p>
+            <w:r>
+              <w:rPr>
+                <w:b/>
+              </w:rPr>
+              <w:t>Autor</w:t>
+            </w:r>
+          </w:p>
+        </w:tc>
+        <w:tc>
+          <w:tcPr>
+            <w:tcW w:type="dxa" w:w="4703"/>
+          </w:tcPr>
+          <w:p>
+            <w:r>
+              <w:t>Equipo TP — Ingeniería de Software</w:t>
+            </w:r>
+          </w:p>
+        </w:tc>
+      </w:tr>
+    </w:tbl>
+    <w:p/>
+    <w:tbl>
+      <w:tblPr>
+        <w:tblStyle w:val="LightGrid-Accent1"/>
+        <w:tblW w:type="auto" w:w="0"/>
+        <w:tblLook w:firstColumn="1" w:firstRow="1" w:lastColumn="0" w:lastRow="0" w:noHBand="0" w:noVBand="1" w:val="04A0"/>
+      </w:tblPr>
+      <w:tblGrid>
+        <w:gridCol w:w="4703"/>
+        <w:gridCol w:w="4703"/>
+      </w:tblGrid>
+      <w:tr>
+        <w:tc>
+          <w:tcPr>
+            <w:tcW w:type="dxa" w:w="4703"/>
+            <w:shd w:val="clear" w:color="auto" w:fill="DAE3F3"/>
+          </w:tcPr>
+          <w:p>
+            <w:r>
+              <w:rPr>
+                <w:b/>
+              </w:rPr>
+              <w:t>Identificador</w:t>
+            </w:r>
+          </w:p>
+        </w:tc>
+        <w:tc>
+          <w:tcPr>
+            <w:tcW w:type="dxa" w:w="4703"/>
+          </w:tcPr>
+          <w:p>
+            <w:r>
+              <w:t>CU-29</w:t>
+            </w:r>
+          </w:p>
+        </w:tc>
+      </w:tr>
+      <w:tr>
+        <w:tc>
+          <w:tcPr>
+            <w:tcW w:type="dxa" w:w="4703"/>
+            <w:shd w:val="clear" w:color="auto" w:fill="DAE3F3"/>
+          </w:tcPr>
+          <w:p>
+            <w:r>
+              <w:rPr>
+                <w:b/>
+              </w:rPr>
+              <w:t>Nombre</w:t>
+            </w:r>
+          </w:p>
+        </w:tc>
+        <w:tc>
+          <w:tcPr>
+            <w:tcW w:type="dxa" w:w="4703"/>
+          </w:tcPr>
+          <w:p>
+            <w:r>
+              <w:t>Registrar Sustitución por Falta de Stock</w:t>
+            </w:r>
+          </w:p>
+        </w:tc>
+      </w:tr>
+      <w:tr>
+        <w:tc>
+          <w:tcPr>
+            <w:tcW w:type="dxa" w:w="4703"/>
+            <w:shd w:val="clear" w:color="auto" w:fill="DAE3F3"/>
+          </w:tcPr>
+          <w:p>
+            <w:r>
+              <w:rPr>
+                <w:b/>
+              </w:rPr>
+              <w:t>Actor primario</w:t>
+            </w:r>
+          </w:p>
+        </w:tc>
+        <w:tc>
+          <w:tcPr>
+            <w:tcW w:type="dxa" w:w="4703"/>
+          </w:tcPr>
+          <w:p>
+            <w:r>
+              <w:t>Usuario</w:t>
+            </w:r>
+          </w:p>
+        </w:tc>
+      </w:tr>
+      <w:tr>
+        <w:tc>
+          <w:tcPr>
+            <w:tcW w:type="dxa" w:w="4703"/>
+            <w:shd w:val="clear" w:color="auto" w:fill="DAE3F3"/>
+          </w:tcPr>
+          <w:p>
+            <w:r>
+              <w:rPr>
+                <w:b/>
+              </w:rPr>
+              <w:t>Frecuencia</w:t>
+            </w:r>
+          </w:p>
+        </w:tc>
+        <w:tc>
+          <w:tcPr>
+            <w:tcW w:type="dxa" w:w="4703"/>
+          </w:tcPr>
+          <w:p>
+            <w:r>
+              <w:t>Media</w:t>
+            </w:r>
+          </w:p>
+        </w:tc>
+      </w:tr>
+      <w:tr>
+        <w:tc>
+          <w:tcPr>
+            <w:tcW w:type="dxa" w:w="4703"/>
+            <w:shd w:val="clear" w:color="auto" w:fill="DAE3F3"/>
+          </w:tcPr>
+          <w:p>
+            <w:r>
+              <w:rPr>
+                <w:b/>
+              </w:rPr>
+              <w:t>Prioridad</w:t>
+            </w:r>
+          </w:p>
+        </w:tc>
+        <w:tc>
+          <w:tcPr>
+            <w:tcW w:type="dxa" w:w="4703"/>
+          </w:tcPr>
+          <w:p>
+            <w:r>
+              <w:t>Alta</w:t>
+            </w:r>
+          </w:p>
+        </w:tc>
+      </w:tr>
+    </w:tbl>
+    <w:p/>
+    <w:p>
+      <w:pPr>
+        <w:pStyle w:val="Heading2"/>
+      </w:pPr>
+      <w:r>
+        <w:t>Historial de revisión</w:t>
+      </w:r>
+    </w:p>
+    <w:tbl>
+      <w:tblPr>
+        <w:tblStyle w:val="LightGrid-Accent1"/>
+        <w:tblW w:type="auto" w:w="0"/>
+        <w:tblLook w:firstColumn="1" w:firstRow="1" w:lastColumn="0" w:lastRow="0" w:noHBand="0" w:noVBand="1" w:val="04A0"/>
+      </w:tblPr>
+      <w:tblGrid>
+        <w:gridCol w:w="2351"/>
+        <w:gridCol w:w="2351"/>
+        <w:gridCol w:w="2351"/>
+        <w:gridCol w:w="2351"/>
+      </w:tblGrid>
+      <w:tr>
+        <w:tc>
+          <w:tcPr>
+            <w:tcW w:type="dxa" w:w="2351"/>
+            <w:shd w:val="clear" w:color="auto" w:fill="DAE3F3"/>
+          </w:tcPr>
+          <w:p>
+            <w:r>
+              <w:rPr>
+                <w:b/>
+              </w:rPr>
+              <w:t>Versión</w:t>
+            </w:r>
+          </w:p>
+        </w:tc>
+        <w:tc>
+          <w:tcPr>
+            <w:tcW w:type="dxa" w:w="2351"/>
+            <w:shd w:val="clear" w:color="auto" w:fill="DAE3F3"/>
+          </w:tcPr>
+          <w:p>
+            <w:r>
+              <w:rPr>
+                <w:b/>
+              </w:rPr>
+              <w:t>Fecha</w:t>
+            </w:r>
+          </w:p>
+        </w:tc>
+        <w:tc>
+          <w:tcPr>
+            <w:tcW w:type="dxa" w:w="2351"/>
+            <w:shd w:val="clear" w:color="auto" w:fill="DAE3F3"/>
+          </w:tcPr>
+          <w:p>
+            <w:r>
+              <w:rPr>
+                <w:b/>
+              </w:rPr>
+              <w:t>Autor</w:t>
+            </w:r>
+          </w:p>
+        </w:tc>
+        <w:tc>
+          <w:tcPr>
+            <w:tcW w:type="dxa" w:w="2351"/>
+            <w:shd w:val="clear" w:color="auto" w:fill="DAE3F3"/>
+          </w:tcPr>
+          <w:p>
+            <w:r>
+              <w:rPr>
+                <w:b/>
+              </w:rPr>
+              <w:t>Descripción</w:t>
+            </w:r>
+          </w:p>
+        </w:tc>
+      </w:tr>
+      <w:tr>
+        <w:tc>
+          <w:tcPr>
+            <w:tcW w:type="dxa" w:w="2351"/>
+          </w:tcPr>
+          <w:p>
+            <w:r>
+              <w:t>1.0</w:t>
+            </w:r>
+          </w:p>
+        </w:tc>
+        <w:tc>
+          <w:tcPr>
+            <w:tcW w:type="dxa" w:w="2351"/>
+          </w:tcPr>
+          <w:p>
+            <w:r>
+              <w:t>18/09/2026</w:t>
+            </w:r>
+          </w:p>
+        </w:tc>
+        <w:tc>
+          <w:tcPr>
+            <w:tcW w:type="dxa" w:w="2351"/>
+          </w:tcPr>
+          <w:p>
+            <w:r>
+              <w:t>Equipo TP</w:t>
+            </w:r>
+          </w:p>
+        </w:tc>
+        <w:tc>
+          <w:tcPr>
+            <w:tcW w:type="dxa" w:w="2351"/>
+          </w:tcPr>
+          <w:p>
+            <w:r>
+              <w:t>Versión inicial — Entrega 2 (análisis y diseño). Dominio de curación y armado de cajas mensuales, Club de Socios.</w:t>
+            </w:r>
+          </w:p>
+        </w:tc>
+      </w:tr>
+    </w:tbl>
+    <w:p/>
+    <w:p>
+      <w:pPr>
+        <w:pStyle w:val="Heading2"/>
+      </w:pPr>
+      <w:r>
+        <w:t>Objetivo</w:t>
+      </w:r>
+    </w:p>
+    <w:p>
+      <w:r>
+        <w:t>Permitir que un Usuario con el permiso "Registrar picking y sustituciones" (rol Encargado de Depósito) registre, de forma trazable y append-only, el reemplazo de un vino de una caja armada cuando el picking detecta que no hay stock suficiente.</w:t>
+      </w:r>
+    </w:p>
+    <w:p>
+      <w:pPr>
+        <w:pStyle w:val="Heading2"/>
+      </w:pPr>
+      <w:r>
+        <w:t>Precondiciones</w:t>
+      </w:r>
+    </w:p>
+    <w:p>
+      <w:pPr>
+        <w:pStyle w:val="ListBullet"/>
+      </w:pPr>
+      <w:r>
+        <w:t>El Usuario inició sesión correctamente y tiene el permiso "Registrar picking y sustituciones".</w:t>
+      </w:r>
+    </w:p>
+    <w:p>
+      <w:pPr>
+        <w:pStyle w:val="ListBullet"/>
+      </w:pPr>
+      <w:r>
+        <w:t>La caja está en estado Armada.</w:t>
+      </w:r>
+    </w:p>
+    <w:p>
+      <w:pPr>
+        <w:pStyle w:val="ListBullet"/>
+      </w:pPr>
+      <w:r>
+        <w:t>El Usuario no es quien armó la caja (RN-10).</w:t>
+      </w:r>
+    </w:p>
+    <w:p>
+      <w:pPr>
+        <w:pStyle w:val="Heading2"/>
+      </w:pPr>
+      <w:r>
+        <w:t>Postcondiciones</w:t>
+      </w:r>
+    </w:p>
+    <w:p>
+      <w:pPr>
+        <w:pStyle w:val="Heading3"/>
+      </w:pPr>
+      <w:r>
+        <w:t>En caso de éxito</w:t>
+      </w:r>
+    </w:p>
+    <w:p>
+      <w:pPr>
+        <w:pStyle w:val="ListBullet"/>
+      </w:pPr>
+      <w:r>
+        <w:t>Se inserta una fila en SUSTITUCION (vino original, vino de reemplazo, motivo, responsable, fecha); la línea original de CAJA_VINO no se edita.</w:t>
+      </w:r>
+    </w:p>
+    <w:p>
+      <w:pPr>
+        <w:pStyle w:val="ListBullet"/>
+      </w:pPr>
+      <w:r>
+        <w:t>La composición efectiva de la caja, consultada desde ese momento, refleja el vino de reemplazo.</w:t>
+      </w:r>
+    </w:p>
+    <w:p>
+      <w:pPr>
+        <w:pStyle w:val="Heading3"/>
+      </w:pPr>
+      <w:r>
+        <w:t>En caso de fallo</w:t>
+      </w:r>
+    </w:p>
+    <w:p>
+      <w:pPr>
+        <w:pStyle w:val="ListBullet"/>
+      </w:pPr>
+      <w:r>
+        <w:t>Si el Usuario es quien armó la caja (RN-10): se rechaza y no se inserta ninguna fila.</w:t>
+      </w:r>
+    </w:p>
+    <w:p>
+      <w:pPr>
+        <w:pStyle w:val="ListBullet"/>
+      </w:pPr>
+      <w:r>
+        <w:t>Si la caja ya no está en estado Armada (RN-08): se rechaza.</w:t>
+      </w:r>
+    </w:p>
+    <w:p>
+      <w:pPr>
+        <w:pStyle w:val="ListBullet"/>
+      </w:pPr>
+      <w:r>
+        <w:t>Si el reemplazo excede el presupuesto disponible o no cumple RN-06: se rechaza.</w:t>
+      </w:r>
+    </w:p>
+    <w:p>
+      <w:pPr>
+        <w:pStyle w:val="Heading2"/>
+      </w:pPr>
+      <w:r>
+        <w:t>Evento disparador</w:t>
+      </w:r>
+    </w:p>
+    <w:p>
+      <w:r>
+        <w:t>El Usuario selecciona una línea con faltante y presiona "Registrar sustitución" en frmPickingCaja.</w:t>
+      </w:r>
+    </w:p>
+    <w:p>
+      <w:pPr>
+        <w:pStyle w:val="Heading2"/>
+      </w:pPr>
+      <w:r>
+        <w:t>Puntos de extensión</w:t>
+      </w:r>
+    </w:p>
+    <w:tbl>
+      <w:tblPr>
+        <w:tblStyle w:val="LightGrid-Accent1"/>
+        <w:tblW w:type="auto" w:w="0"/>
+        <w:tblLook w:firstColumn="1" w:firstRow="1" w:lastColumn="0" w:lastRow="0" w:noHBand="0" w:noVBand="1" w:val="04A0"/>
+      </w:tblPr>
+      <w:tblGrid>
+        <w:gridCol w:w="4703"/>
+        <w:gridCol w:w="4703"/>
+      </w:tblGrid>
+      <w:tr>
+        <w:tc>
+          <w:tcPr>
+            <w:tcW w:type="dxa" w:w="4703"/>
+            <w:shd w:val="clear" w:color="auto" w:fill="DAE3F3"/>
+          </w:tcPr>
+          <w:p>
+            <w:r>
+              <w:rPr>
+                <w:b/>
+              </w:rPr>
+              <w:t>Paso</w:t>
+            </w:r>
+          </w:p>
+        </w:tc>
+        <w:tc>
+          <w:tcPr>
+            <w:tcW w:type="dxa" w:w="4703"/>
+            <w:shd w:val="clear" w:color="auto" w:fill="DAE3F3"/>
+          </w:tcPr>
+          <w:p>
+            <w:r>
+              <w:rPr>
+                <w:b/>
+              </w:rPr>
+              <w:t>Extensión posible</w:t>
+            </w:r>
+          </w:p>
+        </w:tc>
+      </w:tr>
+      <w:tr>
+        <w:tc>
+          <w:tcPr>
+            <w:tcW w:type="dxa" w:w="4703"/>
+          </w:tcPr>
+          <w:p>
+            <w:r>
+              <w:t>Tras el paso 8 (sustitución registrada)</w:t>
+            </w:r>
+          </w:p>
+        </w:tc>
+        <w:tc>
+          <w:tcPr>
+            <w:tcW w:type="dxa" w:w="4703"/>
+          </w:tcPr>
+          <w:p>
+            <w:r>
+              <w:t>La composición efectiva actualizada es la que se despacha en CU-31 Despachar Caja.</w:t>
+            </w:r>
+          </w:p>
+        </w:tc>
+      </w:tr>
+    </w:tbl>
+    <w:p/>
+    <w:p>
+      <w:pPr>
+        <w:pStyle w:val="Heading2"/>
+      </w:pPr>
+      <w:r>
+        <w:t>Gráfico del caso de uso</w:t>
+      </w:r>
+    </w:p>
+    <w:p>
+      <w:r>
+        <w:rPr>
+          <w:rFonts w:ascii="Consolas" w:hAnsi="Consolas"/>
+          <w:sz w:val="18"/>
+        </w:rPr>
+        <w:t>Actor: Usuario (permiso "Registrar picking y sustituciones")</w:t>
+        <w:br/>
+        <w:t xml:space="preserve">  ──&gt; (Registrar Sustitución por Falta de Stock)</w:t>
+        <w:br/>
+        <w:br/>
+        <w:t>(Registrar Sustitución) ── «precedido por» ──&gt; (Armar Caja Mensual, CU-28)</w:t>
+      </w:r>
+    </w:p>
+    <w:p/>
+    <w:p>
+      <w:pPr>
+        <w:pStyle w:val="Heading2"/>
+      </w:pPr>
+      <w:r>
+        <w:t>Flujo principal</w:t>
+      </w:r>
+    </w:p>
+    <w:p>
+      <w:pPr>
+        <w:pStyle w:val="ListNumber"/>
+      </w:pPr>
+      <w:r>
+        <w:t>El Usuario abre el picking de la caja en frmPickingCaja.</w:t>
+      </w:r>
+    </w:p>
+    <w:p>
+      <w:pPr>
+        <w:pStyle w:val="ListNumber"/>
+      </w:pPr>
+      <w:r>
+        <w:t>El sistema obtiene la composición efectiva de la caja, derivada de CAJA_VINO y su historial de sustituciones (RN-07).</w:t>
+      </w:r>
+    </w:p>
+    <w:p>
+      <w:pPr>
+        <w:pStyle w:val="ListNumber"/>
+      </w:pPr>
+      <w:r>
+        <w:t>El sistema marca las líneas con faltante de stock y deshabilita "Registrar sustitución" si el Usuario es quien armó la caja (RN-10).</w:t>
+      </w:r>
+    </w:p>
+    <w:p>
+      <w:pPr>
+        <w:pStyle w:val="ListNumber"/>
+      </w:pPr>
+      <w:r>
+        <w:t>El Usuario selecciona una línea con faltante y presiona "Registrar sustitución".</w:t>
+      </w:r>
+    </w:p>
+    <w:p>
+      <w:pPr>
+        <w:pStyle w:val="ListNumber"/>
+      </w:pPr>
+      <w:r>
+        <w:t>El sistema lista vinos de reemplazo candidatos, filtrados por el saldo de presupuesto liberado por esa línea.</w:t>
+      </w:r>
+    </w:p>
+    <w:p>
+      <w:pPr>
+        <w:pStyle w:val="ListNumber"/>
+      </w:pPr>
+      <w:r>
+        <w:t>El Usuario elige un vino de reemplazo y un motivo.</w:t>
+      </w:r>
+    </w:p>
+    <w:p>
+      <w:pPr>
+        <w:pStyle w:val="ListNumber"/>
+      </w:pPr>
+      <w:r>
+        <w:t>El sistema valida RN-10, RN-08 y RN-05/RN-06 sobre el reemplazo, e inserta la sustitución como fila append-only.</w:t>
+      </w:r>
+    </w:p>
+    <w:p>
+      <w:pPr>
+        <w:pStyle w:val="ListNumber"/>
+      </w:pPr>
+      <w:r>
+        <w:t>El sistema informa que la sustitución quedó registrada y refresca la grilla con la composición efectiva actualizada.</w:t>
+      </w:r>
+    </w:p>
+    <w:p>
+      <w:pPr>
+        <w:pStyle w:val="Heading2"/>
+      </w:pPr>
+      <w:r>
+        <w:t>Flujos alternativos</w:t>
+      </w:r>
+    </w:p>
+    <w:p>
+      <w:pPr>
+        <w:pStyle w:val="Heading3"/>
+      </w:pPr>
+      <w:r>
+        <w:t>7a. El usuario armó esta caja (RN-10)</w:t>
+      </w:r>
+    </w:p>
+    <w:p>
+      <w:pPr>
+        <w:pStyle w:val="ListBullet"/>
+      </w:pPr>
+      <w:r>
+        <w:t>El sistema muestra "No puede registrar una sustitución en una caja que usted mismo armó."</w:t>
+      </w:r>
+    </w:p>
+    <w:p>
+      <w:pPr>
+        <w:pStyle w:val="ListBullet"/>
+      </w:pPr>
+      <w:r>
+        <w:t>El caso de uso vuelve al paso 4.</w:t>
+      </w:r>
+    </w:p>
+    <w:p>
+      <w:pPr>
+        <w:pStyle w:val="Heading3"/>
+      </w:pPr>
+      <w:r>
+        <w:t>7b. La caja no está en estado Armada (RN-08)</w:t>
+      </w:r>
+    </w:p>
+    <w:p>
+      <w:pPr>
+        <w:pStyle w:val="ListBullet"/>
+      </w:pPr>
+      <w:r>
+        <w:t>El sistema muestra "La caja ya fue despachada; su composición es inmutable."</w:t>
+      </w:r>
+    </w:p>
+    <w:p>
+      <w:pPr>
+        <w:pStyle w:val="ListBullet"/>
+      </w:pPr>
+      <w:r>
+        <w:t>El caso de uso vuelve al paso 1.</w:t>
+      </w:r>
+    </w:p>
+    <w:p>
+      <w:pPr>
+        <w:pStyle w:val="Heading3"/>
+      </w:pPr>
+      <w:r>
+        <w:t>7c. El reemplazo excede el presupuesto o no cumple RN-06</w:t>
+      </w:r>
+    </w:p>
+    <w:p>
+      <w:pPr>
+        <w:pStyle w:val="ListBullet"/>
+      </w:pPr>
+      <w:r>
+        <w:t>El sistema muestra "El vino de reemplazo excede el presupuesto disponible de la caja." o "El vino de reemplazo no está disponible.", según corresponda.</w:t>
+      </w:r>
+    </w:p>
+    <w:p>
+      <w:pPr>
+        <w:pStyle w:val="ListBullet"/>
+      </w:pPr>
+      <w:r>
+        <w:t>El caso de uso vuelve al paso 5.</w:t>
+      </w:r>
+    </w:p>
+    <w:p>
+      <w:pPr>
+        <w:pStyle w:val="Heading2"/>
+      </w:pPr>
+      <w:r>
+        <w:t>Excepciones</w:t>
+      </w:r>
+    </w:p>
+    <w:tbl>
+      <w:tblPr>
+        <w:tblStyle w:val="LightGrid-Accent1"/>
+        <w:tblW w:type="auto" w:w="0"/>
+        <w:tblLook w:firstColumn="1" w:firstRow="1" w:lastColumn="0" w:lastRow="0" w:noHBand="0" w:noVBand="1" w:val="04A0"/>
+      </w:tblPr>
+      <w:tblGrid>
+        <w:gridCol w:w="3135"/>
+        <w:gridCol w:w="3135"/>
+        <w:gridCol w:w="3135"/>
+      </w:tblGrid>
+      <w:tr>
+        <w:tc>
+          <w:tcPr>
+            <w:tcW w:type="dxa" w:w="3135"/>
+            <w:shd w:val="clear" w:color="auto" w:fill="DAE3F3"/>
+          </w:tcPr>
+          <w:p>
+            <w:r>
+              <w:rPr>
+                <w:b/>
+              </w:rPr>
+              <w:t>Código</w:t>
+            </w:r>
+          </w:p>
+        </w:tc>
+        <w:tc>
+          <w:tcPr>
+            <w:tcW w:type="dxa" w:w="3135"/>
+            <w:shd w:val="clear" w:color="auto" w:fill="DAE3F3"/>
+          </w:tcPr>
+          <w:p>
+            <w:r>
+              <w:rPr>
+                <w:b/>
+              </w:rPr>
+              <w:t>Descripción</w:t>
+            </w:r>
+          </w:p>
+        </w:tc>
+        <w:tc>
+          <w:tcPr>
+            <w:tcW w:type="dxa" w:w="3135"/>
+            <w:shd w:val="clear" w:color="auto" w:fill="DAE3F3"/>
+          </w:tcPr>
+          <w:p>
+            <w:r>
+              <w:rPr>
+                <w:b/>
+              </w:rPr>
+              <w:t>Manejo</w:t>
+            </w:r>
+          </w:p>
+        </w:tc>
+      </w:tr>
+      <w:tr>
+        <w:tc>
+          <w:tcPr>
+            <w:tcW w:type="dxa" w:w="3135"/>
+          </w:tcPr>
+          <w:p>
+            <w:r>
+              <w:t>EX-01</w:t>
+            </w:r>
+          </w:p>
+        </w:tc>
+        <w:tc>
+          <w:tcPr>
+            <w:tcW w:type="dxa" w:w="3135"/>
+          </w:tcPr>
+          <w:p>
+            <w:r>
+              <w:t>Error de conexión con la base de datos durante el registro.</w:t>
+            </w:r>
+          </w:p>
+        </w:tc>
+        <w:tc>
+          <w:tcPr>
+            <w:tcW w:type="dxa" w:w="3135"/>
+          </w:tcPr>
+          <w:p>
+            <w:r>
+              <w:t>Mensaje genérico al Usuario; no se persiste ninguna fila parcial.</w:t>
+            </w:r>
+          </w:p>
+        </w:tc>
+      </w:tr>
+    </w:tbl>
+    <w:p/>
+    <w:p>
+      <w:pPr>
+        <w:pStyle w:val="Heading2"/>
+      </w:pPr>
+      <w:r>
+        <w:t>Reglas de negocio</w:t>
+      </w:r>
+    </w:p>
+    <w:tbl>
+      <w:tblPr>
+        <w:tblStyle w:val="LightGrid-Accent1"/>
+        <w:tblW w:type="auto" w:w="0"/>
+        <w:tblLook w:firstColumn="1" w:firstRow="1" w:lastColumn="0" w:lastRow="0" w:noHBand="0" w:noVBand="1" w:val="04A0"/>
+      </w:tblPr>
+      <w:tblGrid>
+        <w:gridCol w:w="4703"/>
+        <w:gridCol w:w="4703"/>
+      </w:tblGrid>
+      <w:tr>
+        <w:tc>
+          <w:tcPr>
+            <w:tcW w:type="dxa" w:w="4703"/>
+            <w:shd w:val="clear" w:color="auto" w:fill="DAE3F3"/>
+          </w:tcPr>
+          <w:p>
+            <w:r>
+              <w:rPr>
+                <w:b/>
+              </w:rPr>
+              <w:t>Código</w:t>
+            </w:r>
+          </w:p>
+        </w:tc>
+        <w:tc>
+          <w:tcPr>
+            <w:tcW w:type="dxa" w:w="4703"/>
+            <w:shd w:val="clear" w:color="auto" w:fill="DAE3F3"/>
+          </w:tcPr>
+          <w:p>
+            <w:r>
+              <w:rPr>
+                <w:b/>
+              </w:rPr>
+              <w:t>Regla</w:t>
+            </w:r>
+          </w:p>
+        </w:tc>
+      </w:tr>
+      <w:tr>
+        <w:tc>
+          <w:tcPr>
+            <w:tcW w:type="dxa" w:w="4703"/>
+          </w:tcPr>
+          <w:p>
+            <w:r>
+              <w:t>RN-07</w:t>
+            </w:r>
+          </w:p>
+        </w:tc>
+        <w:tc>
+          <w:tcPr>
+            <w:tcW w:type="dxa" w:w="4703"/>
+          </w:tcPr>
+          <w:p>
+            <w:r>
+              <w:t>Toda sustitución es una fila append-only en SUSTITUCION; no existen SP de UPDATE/DELETE sobre esa tabla. La composición efectiva de la caja se deriva, nunca se edita una línea existente.</w:t>
+            </w:r>
+          </w:p>
+        </w:tc>
+      </w:tr>
+      <w:tr>
+        <w:tc>
+          <w:tcPr>
+            <w:tcW w:type="dxa" w:w="4703"/>
+          </w:tcPr>
+          <w:p>
+            <w:r>
+              <w:t>RN-08</w:t>
+            </w:r>
+          </w:p>
+        </w:tc>
+        <w:tc>
+          <w:tcPr>
+            <w:tcW w:type="dxa" w:w="4703"/>
+          </w:tcPr>
+          <w:p>
+            <w:r>
+              <w:t>Solo se pueden registrar sustituciones sobre cajas en estado Armada.</w:t>
+            </w:r>
+          </w:p>
+        </w:tc>
+      </w:tr>
+      <w:tr>
+        <w:tc>
+          <w:tcPr>
+            <w:tcW w:type="dxa" w:w="4703"/>
+          </w:tcPr>
+          <w:p>
+            <w:r>
+              <w:t>RN-10</w:t>
+            </w:r>
+          </w:p>
+        </w:tc>
+        <w:tc>
+          <w:tcPr>
+            <w:tcW w:type="dxa" w:w="4703"/>
+          </w:tcPr>
+          <w:p>
+            <w:r>
+              <w:t>El responsable de la sustitución no puede ser quien armó la caja (separación de funciones), verificado en UI, BLL y SP.</w:t>
+            </w:r>
+          </w:p>
+        </w:tc>
+      </w:tr>
+      <w:tr>
+        <w:tc>
+          <w:tcPr>
+            <w:tcW w:type="dxa" w:w="4703"/>
+          </w:tcPr>
+          <w:p>
+            <w:r>
+              <w:t>RN-05 / RN-06</w:t>
+            </w:r>
+          </w:p>
+        </w:tc>
+        <w:tc>
+          <w:tcPr>
+            <w:tcW w:type="dxa" w:w="4703"/>
+          </w:tcPr>
+          <w:p>
+            <w:r>
+              <w:t>El vino de reemplazo debe cumplir, por sí mismo, el tope de presupuesto restante y el catálogo gobernado.</w:t>
+            </w:r>
+          </w:p>
+        </w:tc>
+      </w:tr>
+    </w:tbl>
+    <w:p/>
+    <w:p>
+      <w:pPr>
+        <w:pStyle w:val="Heading2"/>
+      </w:pPr>
+      <w:r>
+        <w:t>Relaciones con otros casos de uso</w:t>
+      </w:r>
+    </w:p>
+    <w:tbl>
+      <w:tblPr>
+        <w:tblStyle w:val="LightGrid-Accent1"/>
+        <w:tblW w:type="auto" w:w="0"/>
+        <w:tblLook w:firstColumn="1" w:firstRow="1" w:lastColumn="0" w:lastRow="0" w:noHBand="0" w:noVBand="1" w:val="04A0"/>
+      </w:tblPr>
+      <w:tblGrid>
+        <w:gridCol w:w="3135"/>
+        <w:gridCol w:w="3135"/>
+        <w:gridCol w:w="3135"/>
+      </w:tblGrid>
+      <w:tr>
+        <w:tc>
+          <w:tcPr>
+            <w:tcW w:type="dxa" w:w="3135"/>
+            <w:shd w:val="clear" w:color="auto" w:fill="DAE3F3"/>
+          </w:tcPr>
+          <w:p>
+            <w:r>
+              <w:rPr>
+                <w:b/>
+              </w:rPr>
+              <w:t>Tipo</w:t>
+            </w:r>
+          </w:p>
+        </w:tc>
+        <w:tc>
+          <w:tcPr>
+            <w:tcW w:type="dxa" w:w="3135"/>
+            <w:shd w:val="clear" w:color="auto" w:fill="DAE3F3"/>
+          </w:tcPr>
+          <w:p>
+            <w:r>
+              <w:rPr>
+                <w:b/>
+              </w:rPr>
+              <w:t>Destino</w:t>
+            </w:r>
+          </w:p>
+        </w:tc>
+        <w:tc>
+          <w:tcPr>
+            <w:tcW w:type="dxa" w:w="3135"/>
+            <w:shd w:val="clear" w:color="auto" w:fill="DAE3F3"/>
+          </w:tcPr>
+          <w:p>
+            <w:r>
+              <w:rPr>
+                <w:b/>
+              </w:rPr>
+              <w:t>Condición</w:t>
+            </w:r>
+          </w:p>
+        </w:tc>
+      </w:tr>
+      <w:tr>
+        <w:tc>
+          <w:tcPr>
+            <w:tcW w:type="dxa" w:w="3135"/>
+          </w:tcPr>
+          <w:p>
+            <w:r>
+              <w:t>«precedido por»</w:t>
+            </w:r>
+          </w:p>
+        </w:tc>
+        <w:tc>
+          <w:tcPr>
+            <w:tcW w:type="dxa" w:w="3135"/>
+          </w:tcPr>
+          <w:p>
+            <w:r>
+              <w:t>CU-28 Armar Caja Mensual</w:t>
+            </w:r>
+          </w:p>
+        </w:tc>
+        <w:tc>
+          <w:tcPr>
+            <w:tcW w:type="dxa" w:w="3135"/>
+          </w:tcPr>
+          <w:p>
+            <w:r>
+              <w:t>Solo existen sustituciones sobre cajas ya armadas.</w:t>
+            </w:r>
+          </w:p>
+        </w:tc>
+      </w:tr>
+      <w:tr>
+        <w:tc>
+          <w:tcPr>
+            <w:tcW w:type="dxa" w:w="3135"/>
+          </w:tcPr>
+          <w:p>
+            <w:r>
+              <w:t>«precede» a</w:t>
+            </w:r>
+          </w:p>
+        </w:tc>
+        <w:tc>
+          <w:tcPr>
+            <w:tcW w:type="dxa" w:w="3135"/>
+          </w:tcPr>
+          <w:p>
+            <w:r>
+              <w:t>CU-31 Despachar Caja</w:t>
+            </w:r>
+          </w:p>
+        </w:tc>
+        <w:tc>
+          <w:tcPr>
+            <w:tcW w:type="dxa" w:w="3135"/>
+          </w:tcPr>
+          <w:p>
+            <w:r>
+              <w:t>Las sustituciones registradas antes del despacho determinan la composición efectiva que se despacha.</w:t>
+            </w:r>
+          </w:p>
+        </w:tc>
+      </w:tr>
+    </w:tbl>
+    <w:p/>
+    <w:p>
+      <w:pPr>
+        <w:pStyle w:val="Heading2"/>
+      </w:pPr>
+      <w:r>
+        <w:t>Diagrama de clases afectadas</w:t>
+      </w:r>
+    </w:p>
+    <w:p>
+      <w:r>
+        <w:drawing>
+          <wp:inline xmlns:a="http://schemas.openxmlformats.org/drawingml/2006/main" xmlns:pic="http://schemas.openxmlformats.org/drawingml/2006/picture">
+            <wp:extent cx="5400000" cy="2538831"/>
+            <wp:docPr id="22" name="Picture 22"/>
+            <wp:cNvGraphicFramePr>
+              <a:graphicFrameLocks noChangeAspect="1"/>
+            </wp:cNvGraphicFramePr>
+            <a:graphic>
+              <a:graphicData uri="http://schemas.openxmlformats.org/drawingml/2006/picture">
+                <pic:pic>
+                  <pic:nvPicPr>
+                    <pic:cNvPr id="0" name="DiagramaClases_CuracionCajas.png"/>
+                    <pic:cNvPicPr/>
+                  </pic:nvPicPr>
+                  <pic:blipFill>
+                    <a:blip r:embed="rId17"/>
+                    <a:stretch>
+                      <a:fillRect/>
+                    </a:stretch>
+                  </pic:blipFill>
+                  <pic:spPr>
+                    <a:xfrm>
+                      <a:off x="0" y="0"/>
+                      <a:ext cx="5400000" cy="2538831"/>
+                    </a:xfrm>
+                    <a:prstGeom prst="rect"/>
+                  </pic:spPr>
+                </pic:pic>
+              </a:graphicData>
+            </a:graphic>
+          </wp:inline>
+        </w:drawing>
+      </w:r>
+    </w:p>
+    <w:p/>
+    <w:p>
+      <w:pPr>
+        <w:pStyle w:val="Heading2"/>
+      </w:pPr>
+      <w:r>
+        <w:t>Diagrama de secuencia</w:t>
+      </w:r>
+    </w:p>
+    <w:p>
+      <w:r>
+        <w:drawing>
+          <wp:inline xmlns:a="http://schemas.openxmlformats.org/drawingml/2006/main" xmlns:pic="http://schemas.openxmlformats.org/drawingml/2006/picture">
+            <wp:extent cx="5400000" cy="3268914"/>
+            <wp:docPr id="23" name="Picture 23"/>
+            <wp:cNvGraphicFramePr>
+              <a:graphicFrameLocks noChangeAspect="1"/>
+            </wp:cNvGraphicFramePr>
+            <a:graphic>
+              <a:graphicData uri="http://schemas.openxmlformats.org/drawingml/2006/picture">
+                <pic:pic>
+                  <pic:nvPicPr>
+                    <pic:cNvPr id="0" name="DiagramaSecuencia_CU29_RegistrarSustitucion.png"/>
+                    <pic:cNvPicPr/>
+                  </pic:nvPicPr>
+                  <pic:blipFill>
+                    <a:blip r:embed="rId19"/>
+                    <a:stretch>
+                      <a:fillRect/>
+                    </a:stretch>
+                  </pic:blipFill>
+                  <pic:spPr>
+                    <a:xfrm>
+                      <a:off x="0" y="0"/>
+                      <a:ext cx="5400000" cy="3268914"/>
+                    </a:xfrm>
+                    <a:prstGeom prst="rect"/>
+                  </pic:spPr>
+                </pic:pic>
+              </a:graphicData>
+            </a:graphic>
+          </wp:inline>
+        </w:drawing>
+      </w:r>
+    </w:p>
+    <w:p/>
+    <w:p>
+      <w:pPr>
+        <w:pStyle w:val="Heading2"/>
+      </w:pPr>
+      <w:r>
+        <w:t>DER — entidades afectadas</w:t>
+      </w:r>
+    </w:p>
+    <w:p>
+      <w:r>
+        <w:drawing>
+          <wp:inline xmlns:a="http://schemas.openxmlformats.org/drawingml/2006/main" xmlns:pic="http://schemas.openxmlformats.org/drawingml/2006/picture">
+            <wp:extent cx="5400000" cy="4204392"/>
+            <wp:docPr id="24" name="Picture 24"/>
+            <wp:cNvGraphicFramePr>
+              <a:graphicFrameLocks noChangeAspect="1"/>
+            </wp:cNvGraphicFramePr>
+            <a:graphic>
+              <a:graphicData uri="http://schemas.openxmlformats.org/drawingml/2006/picture">
+                <pic:pic>
+                  <pic:nvPicPr>
+                    <pic:cNvPr id="0" name="DER.png"/>
+                    <pic:cNvPicPr/>
+                  </pic:nvPicPr>
+                  <pic:blipFill>
+                    <a:blip r:embed="rId11"/>
+                    <a:stretch>
+                      <a:fillRect/>
+                    </a:stretch>
+                  </pic:blipFill>
+                  <pic:spPr>
+                    <a:xfrm>
+                      <a:off x="0" y="0"/>
+                      <a:ext cx="5400000" cy="4204392"/>
+                    </a:xfrm>
+                    <a:prstGeom prst="rect"/>
+                  </pic:spPr>
+                </pic:pic>
+              </a:graphicData>
+            </a:graphic>
+          </wp:inline>
+        </w:drawing>
+      </w:r>
+    </w:p>
+    <w:p/>
+    <w:p>
+      <w:r>
+        <w:t>Entidades afectadas: CAJA_MENSUAL, CAJA_VINO, SUSTITUCION, VINO</w:t>
+      </w:r>
+    </w:p>
+    <w:p>
+      <w:pPr>
+        <w:pStyle w:val="Heading2"/>
+      </w:pPr>
+      <w:r>
+        <w:t>Prototipo de interfaz de usuario</w:t>
+      </w:r>
+    </w:p>
+    <w:p>
+      <w:r>
+        <w:rPr>
+          <w:rFonts w:ascii="Consolas" w:hAnsi="Consolas"/>
+          <w:sz w:val="16"/>
+        </w:rPr>
+        <w:t>frmPickingCaja (WinForms — MaterialForm)</w:t>
+        <w:br/>
+        <w:t>+-----------------------------------------------------+</w:t>
+        <w:br/>
+        <w:t>|  Picking de Caja #128 — Socio: Juana Pérez     [x]    |</w:t>
+        <w:br/>
+        <w:t>+-------------------------------------------------------+</w:t>
+        <w:br/>
+        <w:t>| [DataGridView: Vino | Cantidad | Stock | Faltante]     |</w:t>
+        <w:br/>
+        <w:t>|                                                        |</w:t>
+        <w:br/>
+        <w:t>|          [ Registrar sustitución ]  [ Cerrar ]         |</w:t>
+        <w:br/>
+        <w:t>+----------------------------------------------------------+</w:t>
+      </w:r>
+    </w:p>
+    <w:p>
+      <w:pPr>
+        <w:pStyle w:val="Heading2"/>
+      </w:pPr>
+      <w:r>
+        <w:t>Observaciones</w:t>
+      </w:r>
+    </w:p>
+    <w:p>
+      <w:r>
+        <w:t>Una línea puede sustituirse más de una vez (A→B→C): la identidad estable es CAJA_VINO_ID, y el vino efectivo es el VINO_REEMPLAZO_ID de la sustitución con mayor ID para esa línea. Como una sustitución solo puede ocurrir mientras la caja está Armada (RN-08), es decir antes de cualquier MOVIMIENTO_STOCK (RN-09), nunca hace falta compensar kardex por una sustitución.</w:t>
+      </w:r>
+    </w:p>
+    <w:p>
+      <w:r>
+        <w:br w:type="page"/>
+      </w:r>
+    </w:p>
+    <w:p>
+      <w:pPr>
+        <w:pStyle w:val="Heading1"/>
+      </w:pPr>
+      <w:r>
+        <w:t>CU-30 — Actualizar Perfil de Socio</w:t>
+      </w:r>
+    </w:p>
+    <w:tbl>
+      <w:tblPr>
+        <w:tblStyle w:val="LightGrid-Accent1"/>
+        <w:tblW w:type="auto" w:w="0"/>
+        <w:tblLook w:firstColumn="1" w:firstRow="1" w:lastColumn="0" w:lastRow="0" w:noHBand="0" w:noVBand="1" w:val="04A0"/>
+      </w:tblPr>
+      <w:tblGrid>
+        <w:gridCol w:w="4703"/>
+        <w:gridCol w:w="4703"/>
+      </w:tblGrid>
+      <w:tr>
+        <w:tc>
+          <w:tcPr>
+            <w:tcW w:type="dxa" w:w="4703"/>
+            <w:shd w:val="clear" w:color="auto" w:fill="DAE3F3"/>
+          </w:tcPr>
+          <w:p>
+            <w:r>
+              <w:rPr>
+                <w:b/>
+              </w:rPr>
+              <w:t>Identificador</w:t>
+            </w:r>
+          </w:p>
+        </w:tc>
+        <w:tc>
+          <w:tcPr>
+            <w:tcW w:type="dxa" w:w="4703"/>
+          </w:tcPr>
+          <w:p>
+            <w:r>
+              <w:t>CU-30</w:t>
+            </w:r>
+          </w:p>
+        </w:tc>
+      </w:tr>
+      <w:tr>
+        <w:tc>
+          <w:tcPr>
+            <w:tcW w:type="dxa" w:w="4703"/>
+            <w:shd w:val="clear" w:color="auto" w:fill="DAE3F3"/>
+          </w:tcPr>
+          <w:p>
+            <w:r>
+              <w:rPr>
+                <w:b/>
+              </w:rPr>
+              <w:t>Nombre</w:t>
+            </w:r>
+          </w:p>
+        </w:tc>
+        <w:tc>
+          <w:tcPr>
+            <w:tcW w:type="dxa" w:w="4703"/>
+          </w:tcPr>
+          <w:p>
+            <w:r>
+              <w:t>Actualizar Perfil de Socio</w:t>
+            </w:r>
+          </w:p>
+        </w:tc>
+      </w:tr>
+      <w:tr>
+        <w:tc>
+          <w:tcPr>
+            <w:tcW w:type="dxa" w:w="4703"/>
+            <w:shd w:val="clear" w:color="auto" w:fill="DAE3F3"/>
+          </w:tcPr>
+          <w:p>
+            <w:r>
+              <w:rPr>
+                <w:b/>
+              </w:rPr>
+              <w:t>Actor primario</w:t>
+            </w:r>
+          </w:p>
+        </w:tc>
+        <w:tc>
+          <w:tcPr>
+            <w:tcW w:type="dxa" w:w="4703"/>
+          </w:tcPr>
+          <w:p>
+            <w:r>
+              <w:t>Usuario</w:t>
+            </w:r>
+          </w:p>
+        </w:tc>
+      </w:tr>
+      <w:tr>
+        <w:tc>
+          <w:tcPr>
+            <w:tcW w:type="dxa" w:w="4703"/>
+            <w:shd w:val="clear" w:color="auto" w:fill="DAE3F3"/>
+          </w:tcPr>
+          <w:p>
+            <w:r>
+              <w:rPr>
+                <w:b/>
+              </w:rPr>
+              <w:t>Frecuencia</w:t>
+            </w:r>
+          </w:p>
+        </w:tc>
+        <w:tc>
+          <w:tcPr>
+            <w:tcW w:type="dxa" w:w="4703"/>
+          </w:tcPr>
+          <w:p>
+            <w:r>
+              <w:t>Media</w:t>
+            </w:r>
+          </w:p>
+        </w:tc>
+      </w:tr>
+      <w:tr>
+        <w:tc>
+          <w:tcPr>
+            <w:tcW w:type="dxa" w:w="4703"/>
+            <w:shd w:val="clear" w:color="auto" w:fill="DAE3F3"/>
+          </w:tcPr>
+          <w:p>
+            <w:r>
+              <w:rPr>
+                <w:b/>
+              </w:rPr>
+              <w:t>Prioridad</w:t>
+            </w:r>
+          </w:p>
+        </w:tc>
+        <w:tc>
+          <w:tcPr>
+            <w:tcW w:type="dxa" w:w="4703"/>
+          </w:tcPr>
+          <w:p>
+            <w:r>
+              <w:t>Media</w:t>
+            </w:r>
+          </w:p>
+        </w:tc>
+      </w:tr>
+    </w:tbl>
+    <w:p/>
+    <w:p>
+      <w:pPr>
+        <w:pStyle w:val="Heading2"/>
+      </w:pPr>
+      <w:r>
+        <w:t>Objetivo</w:t>
+      </w:r>
+    </w:p>
+    <w:p>
+      <w:r>
+        <w:t>Permitir que un Usuario con el permiso "Gestionar socios" (rol Atención al Socio) registre y actualice el perfil de un SOCIO — nombre, contacto, presupuesto mensual y varietales preferidos — sin crear un USUARIO ni credenciales de acceso: el socio es una entidad de dominio, nunca un actor con sesión propia.</w:t>
+      </w:r>
+    </w:p>
+    <w:p>
+      <w:pPr>
+        <w:pStyle w:val="Heading2"/>
+      </w:pPr>
+      <w:r>
+        <w:t>Precondiciones</w:t>
+      </w:r>
+    </w:p>
+    <w:p>
+      <w:pPr>
+        <w:pStyle w:val="ListBullet"/>
+      </w:pPr>
+      <w:r>
+        <w:t>El Usuario inició sesión correctamente y tiene el permiso "Gestionar socios".</w:t>
+      </w:r>
+    </w:p>
+    <w:p>
+      <w:pPr>
+        <w:pStyle w:val="Heading2"/>
+      </w:pPr>
+      <w:r>
+        <w:t>Postcondiciones</w:t>
+      </w:r>
+    </w:p>
+    <w:p>
+      <w:pPr>
+        <w:pStyle w:val="Heading3"/>
+      </w:pPr>
+      <w:r>
+        <w:t>En caso de éxito</w:t>
+      </w:r>
+    </w:p>
+    <w:p>
+      <w:pPr>
+        <w:pStyle w:val="ListBullet"/>
+      </w:pPr>
+      <w:r>
+        <w:t>El SOCIO queda registrado o actualizado (nombre, contacto, presupuesto mensual, varietales preferidos), sin vínculo a ningún USUARIO.</w:t>
+      </w:r>
+    </w:p>
+    <w:p>
+      <w:pPr>
+        <w:pStyle w:val="Heading3"/>
+      </w:pPr>
+      <w:r>
+        <w:t>En caso de fallo</w:t>
+      </w:r>
+    </w:p>
+    <w:p>
+      <w:pPr>
+        <w:pStyle w:val="ListBullet"/>
+      </w:pPr>
+      <w:r>
+        <w:t>Si el presupuesto mensual es menor o igual a cero: no se persiste ningún cambio.</w:t>
+      </w:r>
+    </w:p>
+    <w:p>
+      <w:pPr>
+        <w:pStyle w:val="ListBullet"/>
+      </w:pPr>
+      <w:r>
+        <w:t>Si el nombre está vacío: no se persiste ningún cambio.</w:t>
+      </w:r>
+    </w:p>
+    <w:p>
+      <w:pPr>
+        <w:pStyle w:val="Heading2"/>
+      </w:pPr>
+      <w:r>
+        <w:t>Evento disparador</w:t>
+      </w:r>
+    </w:p>
+    <w:p>
+      <w:r>
+        <w:t>El Usuario abre frmSocios y presiona "Nuevo socio" o selecciona un socio existente para editarlo.</w:t>
+      </w:r>
+    </w:p>
+    <w:p>
+      <w:pPr>
+        <w:pStyle w:val="Heading2"/>
+      </w:pPr>
+      <w:r>
+        <w:t>Flujo principal</w:t>
+      </w:r>
+    </w:p>
+    <w:p>
+      <w:pPr>
+        <w:pStyle w:val="ListNumber"/>
+      </w:pPr>
+      <w:r>
+        <w:t>El Usuario abre frmSocios.</w:t>
+      </w:r>
+    </w:p>
+    <w:p>
+      <w:pPr>
+        <w:pStyle w:val="ListNumber"/>
+      </w:pPr>
+      <w:r>
+        <w:t>El Usuario ingresa o edita nombre, apellido, contacto, presupuesto mensual y varietales preferidos del socio.</w:t>
+      </w:r>
+    </w:p>
+    <w:p>
+      <w:pPr>
+        <w:pStyle w:val="ListNumber"/>
+      </w:pPr>
+      <w:r>
+        <w:t>El sistema valida que el nombre esté completo y que el presupuesto mensual sea mayor a cero.</w:t>
+      </w:r>
+    </w:p>
+    <w:p>
+      <w:pPr>
+        <w:pStyle w:val="ListNumber"/>
+      </w:pPr>
+      <w:r>
+        <w:t>El sistema guarda el socio y, si cambiaron, reemplaza la lista de varietales preferidos.</w:t>
+      </w:r>
+    </w:p>
+    <w:p>
+      <w:pPr>
+        <w:pStyle w:val="ListNumber"/>
+      </w:pPr>
+      <w:r>
+        <w:t>El sistema informa que el perfil quedó guardado.</w:t>
+      </w:r>
+    </w:p>
+    <w:p>
+      <w:pPr>
+        <w:pStyle w:val="Heading2"/>
+      </w:pPr>
+      <w:r>
+        <w:t>Flujos alternativos</w:t>
+      </w:r>
+    </w:p>
+    <w:p>
+      <w:pPr>
+        <w:pStyle w:val="Heading3"/>
+      </w:pPr>
+      <w:r>
+        <w:t>3a. Nombre vacío</w:t>
+      </w:r>
+    </w:p>
+    <w:p>
+      <w:pPr>
+        <w:pStyle w:val="ListBullet"/>
+      </w:pPr>
+      <w:r>
+        <w:t>El sistema muestra "El nombre del socio es obligatorio."</w:t>
+      </w:r>
+    </w:p>
+    <w:p>
+      <w:pPr>
+        <w:pStyle w:val="ListBullet"/>
+      </w:pPr>
+      <w:r>
+        <w:t>El caso de uso vuelve al paso 2.</w:t>
+      </w:r>
+    </w:p>
+    <w:p>
+      <w:pPr>
+        <w:pStyle w:val="Heading3"/>
+      </w:pPr>
+      <w:r>
+        <w:t>3b. Presupuesto mensual inválido</w:t>
+      </w:r>
+    </w:p>
+    <w:p>
+      <w:pPr>
+        <w:pStyle w:val="ListBullet"/>
+      </w:pPr>
+      <w:r>
+        <w:t>El sistema muestra "El presupuesto mensual debe ser mayor a cero."</w:t>
+      </w:r>
+    </w:p>
+    <w:p>
+      <w:pPr>
+        <w:pStyle w:val="ListBullet"/>
+      </w:pPr>
+      <w:r>
+        <w:t>El caso de uso vuelve al paso 2.</w:t>
+      </w:r>
+    </w:p>
+    <w:p>
+      <w:pPr>
+        <w:pStyle w:val="Heading2"/>
+      </w:pPr>
+      <w:r>
+        <w:t>Reglas de negocio</w:t>
+      </w:r>
+    </w:p>
+    <w:tbl>
+      <w:tblPr>
+        <w:tblStyle w:val="LightGrid-Accent1"/>
+        <w:tblW w:type="auto" w:w="0"/>
+        <w:tblLook w:firstColumn="1" w:firstRow="1" w:lastColumn="0" w:lastRow="0" w:noHBand="0" w:noVBand="1" w:val="04A0"/>
+      </w:tblPr>
+      <w:tblGrid>
+        <w:gridCol w:w="4703"/>
+        <w:gridCol w:w="4703"/>
+      </w:tblGrid>
+      <w:tr>
+        <w:tc>
+          <w:tcPr>
+            <w:tcW w:type="dxa" w:w="4703"/>
+            <w:shd w:val="clear" w:color="auto" w:fill="DAE3F3"/>
+          </w:tcPr>
+          <w:p>
+            <w:r>
+              <w:rPr>
+                <w:b/>
+              </w:rPr>
+              <w:t>Código</w:t>
+            </w:r>
+          </w:p>
+        </w:tc>
+        <w:tc>
+          <w:tcPr>
+            <w:tcW w:type="dxa" w:w="4703"/>
+            <w:shd w:val="clear" w:color="auto" w:fill="DAE3F3"/>
+          </w:tcPr>
+          <w:p>
+            <w:r>
+              <w:rPr>
+                <w:b/>
+              </w:rPr>
+              <w:t>Regla</w:t>
+            </w:r>
+          </w:p>
+        </w:tc>
+      </w:tr>
+      <w:tr>
+        <w:tc>
+          <w:tcPr>
+            <w:tcW w:type="dxa" w:w="4703"/>
+          </w:tcPr>
+          <w:p>
+            <w:r>
+              <w:t>Validación</w:t>
+            </w:r>
+          </w:p>
+        </w:tc>
+        <w:tc>
+          <w:tcPr>
+            <w:tcW w:type="dxa" w:w="4703"/>
+          </w:tcPr>
+          <w:p>
+            <w:r>
+              <w:t>Actualizar los varietales preferidos de un socio no recalcula cajas ya armadas — el nuevo perfil solo afecta futuros armados (ver CU-28).</w:t>
+            </w:r>
+          </w:p>
+        </w:tc>
+      </w:tr>
+    </w:tbl>
+    <w:p/>
+    <w:p>
+      <w:pPr>
+        <w:pStyle w:val="Heading2"/>
+      </w:pPr>
+      <w:r>
+        <w:t>Relaciones con otros casos de uso</w:t>
+      </w:r>
+    </w:p>
+    <w:tbl>
+      <w:tblPr>
+        <w:tblStyle w:val="LightGrid-Accent1"/>
+        <w:tblW w:type="auto" w:w="0"/>
+        <w:tblLook w:firstColumn="1" w:firstRow="1" w:lastColumn="0" w:lastRow="0" w:noHBand="0" w:noVBand="1" w:val="04A0"/>
+      </w:tblPr>
+      <w:tblGrid>
+        <w:gridCol w:w="3135"/>
+        <w:gridCol w:w="3135"/>
+        <w:gridCol w:w="3135"/>
+      </w:tblGrid>
+      <w:tr>
+        <w:tc>
+          <w:tcPr>
+            <w:tcW w:type="dxa" w:w="3135"/>
+            <w:shd w:val="clear" w:color="auto" w:fill="DAE3F3"/>
+          </w:tcPr>
+          <w:p>
+            <w:r>
+              <w:rPr>
+                <w:b/>
+              </w:rPr>
+              <w:t>Tipo</w:t>
+            </w:r>
+          </w:p>
+        </w:tc>
+        <w:tc>
+          <w:tcPr>
+            <w:tcW w:type="dxa" w:w="3135"/>
+            <w:shd w:val="clear" w:color="auto" w:fill="DAE3F3"/>
+          </w:tcPr>
+          <w:p>
+            <w:r>
+              <w:rPr>
+                <w:b/>
+              </w:rPr>
+              <w:t>Destino</w:t>
+            </w:r>
+          </w:p>
+        </w:tc>
+        <w:tc>
+          <w:tcPr>
+            <w:tcW w:type="dxa" w:w="3135"/>
+            <w:shd w:val="clear" w:color="auto" w:fill="DAE3F3"/>
+          </w:tcPr>
+          <w:p>
+            <w:r>
+              <w:rPr>
+                <w:b/>
+              </w:rPr>
+              <w:t>Condición</w:t>
+            </w:r>
+          </w:p>
+        </w:tc>
+      </w:tr>
+      <w:tr>
+        <w:tc>
+          <w:tcPr>
+            <w:tcW w:type="dxa" w:w="3135"/>
+          </w:tcPr>
+          <w:p>
+            <w:r>
+              <w:t>relacionado con</w:t>
+            </w:r>
+          </w:p>
+        </w:tc>
+        <w:tc>
+          <w:tcPr>
+            <w:tcW w:type="dxa" w:w="3135"/>
+          </w:tcPr>
+          <w:p>
+            <w:r>
+              <w:t>CU-28 Armar Caja Mensual</w:t>
+            </w:r>
+          </w:p>
+        </w:tc>
+        <w:tc>
+          <w:tcPr>
+            <w:tcW w:type="dxa" w:w="3135"/>
+          </w:tcPr>
+          <w:p>
+            <w:r>
+              <w:t>El presupuesto mensual y los varietales preferidos del socio son la entrada para el armado de sus futuras cajas.</w:t>
+            </w:r>
+          </w:p>
+        </w:tc>
+      </w:tr>
+    </w:tbl>
+    <w:p/>
+    <w:p>
+      <w:pPr>
+        <w:pStyle w:val="Heading2"/>
+      </w:pPr>
+      <w:r>
+        <w:t>Observaciones</w:t>
+      </w:r>
+    </w:p>
+    <w:p>
+      <w:r>
+        <w:t>Especificación simple — no requiere diagrama de secuencia dedicado (ver diseño: solo los CU principales de N02 llevan modelado completo).</w:t>
+      </w:r>
+    </w:p>
+    <w:p>
+      <w:r>
+        <w:br w:type="page"/>
+      </w:r>
+    </w:p>
+    <w:p>
+      <w:pPr>
+        <w:pStyle w:val="Heading1"/>
+      </w:pPr>
+      <w:r>
+        <w:t>CU-31 — Despachar Caja</w:t>
+      </w:r>
+    </w:p>
+    <w:tbl>
+      <w:tblPr>
+        <w:tblStyle w:val="LightGrid-Accent1"/>
+        <w:tblW w:type="auto" w:w="0"/>
+        <w:tblLook w:firstColumn="1" w:firstRow="1" w:lastColumn="0" w:lastRow="0" w:noHBand="0" w:noVBand="1" w:val="04A0"/>
+      </w:tblPr>
+      <w:tblGrid>
+        <w:gridCol w:w="4703"/>
+        <w:gridCol w:w="4703"/>
+      </w:tblGrid>
+      <w:tr>
+        <w:tc>
+          <w:tcPr>
+            <w:tcW w:type="dxa" w:w="4703"/>
+            <w:shd w:val="clear" w:color="auto" w:fill="DAE3F3"/>
+          </w:tcPr>
+          <w:p>
+            <w:r>
+              <w:rPr>
+                <w:b/>
+              </w:rPr>
+              <w:t>Identificador</w:t>
+            </w:r>
+          </w:p>
+        </w:tc>
+        <w:tc>
+          <w:tcPr>
+            <w:tcW w:type="dxa" w:w="4703"/>
+          </w:tcPr>
+          <w:p>
+            <w:r>
+              <w:t>CU-31</w:t>
+            </w:r>
+          </w:p>
+        </w:tc>
+      </w:tr>
+      <w:tr>
+        <w:tc>
+          <w:tcPr>
+            <w:tcW w:type="dxa" w:w="4703"/>
+            <w:shd w:val="clear" w:color="auto" w:fill="DAE3F3"/>
+          </w:tcPr>
+          <w:p>
+            <w:r>
+              <w:rPr>
+                <w:b/>
+              </w:rPr>
+              <w:t>Nombre</w:t>
+            </w:r>
+          </w:p>
+        </w:tc>
+        <w:tc>
+          <w:tcPr>
+            <w:tcW w:type="dxa" w:w="4703"/>
+          </w:tcPr>
+          <w:p>
+            <w:r>
+              <w:t>Despachar Caja</w:t>
+            </w:r>
+          </w:p>
+        </w:tc>
+      </w:tr>
+      <w:tr>
+        <w:tc>
+          <w:tcPr>
+            <w:tcW w:type="dxa" w:w="4703"/>
+            <w:shd w:val="clear" w:color="auto" w:fill="DAE3F3"/>
+          </w:tcPr>
+          <w:p>
+            <w:r>
+              <w:rPr>
+                <w:b/>
+              </w:rPr>
+              <w:t>Actor primario</w:t>
+            </w:r>
+          </w:p>
+        </w:tc>
+        <w:tc>
+          <w:tcPr>
+            <w:tcW w:type="dxa" w:w="4703"/>
+          </w:tcPr>
+          <w:p>
+            <w:r>
+              <w:t>Usuario</w:t>
+            </w:r>
+          </w:p>
+        </w:tc>
+      </w:tr>
+      <w:tr>
+        <w:tc>
+          <w:tcPr>
+            <w:tcW w:type="dxa" w:w="4703"/>
+            <w:shd w:val="clear" w:color="auto" w:fill="DAE3F3"/>
+          </w:tcPr>
+          <w:p>
+            <w:r>
+              <w:rPr>
+                <w:b/>
+              </w:rPr>
+              <w:t>Frecuencia</w:t>
+            </w:r>
+          </w:p>
+        </w:tc>
+        <w:tc>
+          <w:tcPr>
+            <w:tcW w:type="dxa" w:w="4703"/>
+          </w:tcPr>
+          <w:p>
+            <w:r>
+              <w:t>Alta</w:t>
+            </w:r>
+          </w:p>
+        </w:tc>
+      </w:tr>
+      <w:tr>
+        <w:tc>
+          <w:tcPr>
+            <w:tcW w:type="dxa" w:w="4703"/>
+            <w:shd w:val="clear" w:color="auto" w:fill="DAE3F3"/>
+          </w:tcPr>
+          <w:p>
+            <w:r>
+              <w:rPr>
+                <w:b/>
+              </w:rPr>
+              <w:t>Prioridad</w:t>
+            </w:r>
+          </w:p>
+        </w:tc>
+        <w:tc>
+          <w:tcPr>
+            <w:tcW w:type="dxa" w:w="4703"/>
+          </w:tcPr>
+          <w:p>
+            <w:r>
+              <w:t>Alta</w:t>
+            </w:r>
+          </w:p>
+        </w:tc>
+      </w:tr>
+    </w:tbl>
+    <w:p/>
+    <w:p>
+      <w:pPr>
+        <w:pStyle w:val="Heading2"/>
+      </w:pPr>
+      <w:r>
+        <w:t>Objetivo</w:t>
+      </w:r>
+    </w:p>
+    <w:p>
+      <w:r>
+        <w:t>Permitir que un Usuario con el permiso "Despachar cajas" (rol Logística) despache una caja mensual en estado Armada, transicionándola a Despachada y registrando, por cada línea efectiva, un movimiento de kardex de tipo Salida.</w:t>
+      </w:r>
+    </w:p>
+    <w:p>
+      <w:pPr>
+        <w:pStyle w:val="Heading2"/>
+      </w:pPr>
+      <w:r>
+        <w:t>Precondiciones</w:t>
+      </w:r>
+    </w:p>
+    <w:p>
+      <w:pPr>
+        <w:pStyle w:val="ListBullet"/>
+      </w:pPr>
+      <w:r>
+        <w:t>El Usuario inició sesión correctamente y tiene el permiso "Despachar cajas".</w:t>
+      </w:r>
+    </w:p>
+    <w:p>
+      <w:pPr>
+        <w:pStyle w:val="ListBullet"/>
+      </w:pPr>
+      <w:r>
+        <w:t>La caja está en estado Armada.</w:t>
+      </w:r>
+    </w:p>
+    <w:p>
+      <w:pPr>
+        <w:pStyle w:val="ListBullet"/>
+      </w:pPr>
+      <w:r>
+        <w:t>El Usuario no es quien armó la caja (RN-10).</w:t>
+      </w:r>
+    </w:p>
+    <w:p>
+      <w:pPr>
+        <w:pStyle w:val="Heading2"/>
+      </w:pPr>
+      <w:r>
+        <w:t>Postcondiciones</w:t>
+      </w:r>
+    </w:p>
+    <w:p>
+      <w:pPr>
+        <w:pStyle w:val="Heading3"/>
+      </w:pPr>
+      <w:r>
+        <w:t>En caso de éxito</w:t>
+      </w:r>
+    </w:p>
+    <w:p>
+      <w:pPr>
+        <w:pStyle w:val="ListBullet"/>
+      </w:pPr>
+      <w:r>
+        <w:t>La caja pasa a estado Despachada.</w:t>
+      </w:r>
+    </w:p>
+    <w:p>
+      <w:pPr>
+        <w:pStyle w:val="ListBullet"/>
+      </w:pPr>
+      <w:r>
+        <w:t>Se crea un MOVIMIENTO_STOCK de tipo Salida por cada línea efectiva de la caja, referenciando la caja (REFERENCIA_TIPO='CAJA', REFERENCIA_ID=caja).</w:t>
+      </w:r>
+    </w:p>
+    <w:p>
+      <w:pPr>
+        <w:pStyle w:val="Heading3"/>
+      </w:pPr>
+      <w:r>
+        <w:t>En caso de fallo</w:t>
+      </w:r>
+    </w:p>
+    <w:p>
+      <w:pPr>
+        <w:pStyle w:val="ListBullet"/>
+      </w:pPr>
+      <w:r>
+        <w:t>Si la caja no está en estado Armada: se rechaza y no se genera ningún movimiento.</w:t>
+      </w:r>
+    </w:p>
+    <w:p>
+      <w:pPr>
+        <w:pStyle w:val="ListBullet"/>
+      </w:pPr>
+      <w:r>
+        <w:t>Si el Usuario es quien armó la caja (RN-10): se rechaza.</w:t>
+      </w:r>
+    </w:p>
+    <w:p>
+      <w:pPr>
+        <w:pStyle w:val="ListBullet"/>
+      </w:pPr>
+      <w:r>
+        <w:t>Si alguna línea no tiene stock suficiente al momento del despacho (RN-03): toda la operación se revierte, sin movimientos parciales.</w:t>
+      </w:r>
+    </w:p>
+    <w:p>
+      <w:pPr>
+        <w:pStyle w:val="Heading2"/>
+      </w:pPr>
+      <w:r>
+        <w:t>Evento disparador</w:t>
+      </w:r>
+    </w:p>
+    <w:p>
+      <w:r>
+        <w:t>El Usuario presiona "Despachar" sobre una caja en estado Armada.</w:t>
+      </w:r>
+    </w:p>
+    <w:p>
+      <w:pPr>
+        <w:pStyle w:val="Heading2"/>
+      </w:pPr>
+      <w:r>
+        <w:t>Flujo principal</w:t>
+      </w:r>
+    </w:p>
+    <w:p>
+      <w:pPr>
+        <w:pStyle w:val="ListNumber"/>
+      </w:pPr>
+      <w:r>
+        <w:t>El Usuario abre la lista de cajas en estado Armada.</w:t>
+      </w:r>
+    </w:p>
+    <w:p>
+      <w:pPr>
+        <w:pStyle w:val="ListNumber"/>
+      </w:pPr>
+      <w:r>
+        <w:t>El Usuario selecciona una caja y presiona "Despachar".</w:t>
+      </w:r>
+    </w:p>
+    <w:p>
+      <w:pPr>
+        <w:pStyle w:val="ListNumber"/>
+      </w:pPr>
+      <w:r>
+        <w:t>El sistema valida que el Usuario no sea quien armó la caja (RN-10) y que la caja siga en estado Armada (RN-08).</w:t>
+      </w:r>
+    </w:p>
+    <w:p>
+      <w:pPr>
+        <w:pStyle w:val="ListNumber"/>
+      </w:pPr>
+      <w:r>
+        <w:t>El sistema verifica el stock disponible de cada línea efectiva de la caja (RN-03).</w:t>
+      </w:r>
+    </w:p>
+    <w:p>
+      <w:pPr>
+        <w:pStyle w:val="ListNumber"/>
+      </w:pPr>
+      <w:r>
+        <w:t>El sistema inserta un MOVIMIENTO_STOCK de tipo Salida por cada línea y actualiza la caja a estado Despachada, en una única transacción.</w:t>
+      </w:r>
+    </w:p>
+    <w:p>
+      <w:pPr>
+        <w:pStyle w:val="ListNumber"/>
+      </w:pPr>
+      <w:r>
+        <w:t>El sistema informa que la caja fue despachada.</w:t>
+      </w:r>
+    </w:p>
+    <w:p>
+      <w:pPr>
+        <w:pStyle w:val="Heading2"/>
+      </w:pPr>
+      <w:r>
+        <w:t>Flujos alternativos</w:t>
+      </w:r>
+    </w:p>
+    <w:p>
+      <w:pPr>
+        <w:pStyle w:val="Heading3"/>
+      </w:pPr>
+      <w:r>
+        <w:t>3a. El usuario armó la caja (RN-10)</w:t>
+      </w:r>
+    </w:p>
+    <w:p>
+      <w:pPr>
+        <w:pStyle w:val="ListBullet"/>
+      </w:pPr>
+      <w:r>
+        <w:t>El sistema muestra "No puede despachar una caja que usted mismo armó."</w:t>
+      </w:r>
+    </w:p>
+    <w:p>
+      <w:pPr>
+        <w:pStyle w:val="ListBullet"/>
+      </w:pPr>
+      <w:r>
+        <w:t>El caso de uso vuelve al paso 1.</w:t>
+      </w:r>
+    </w:p>
+    <w:p>
+      <w:pPr>
+        <w:pStyle w:val="Heading3"/>
+      </w:pPr>
+      <w:r>
+        <w:t>3b. La caja no está en estado Armada (RN-08)</w:t>
+      </w:r>
+    </w:p>
+    <w:p>
+      <w:pPr>
+        <w:pStyle w:val="ListBullet"/>
+      </w:pPr>
+      <w:r>
+        <w:t>El sistema muestra "Solo se pueden despachar cajas en estado Armada."</w:t>
+      </w:r>
+    </w:p>
+    <w:p>
+      <w:pPr>
+        <w:pStyle w:val="ListBullet"/>
+      </w:pPr>
+      <w:r>
+        <w:t>El caso de uso vuelve al paso 1.</w:t>
+      </w:r>
+    </w:p>
+    <w:p>
+      <w:pPr>
+        <w:pStyle w:val="Heading3"/>
+      </w:pPr>
+      <w:r>
+        <w:t>4a. Stock insuficiente en alguna línea (RN-03)</w:t>
+      </w:r>
+    </w:p>
+    <w:p>
+      <w:pPr>
+        <w:pStyle w:val="ListBullet"/>
+      </w:pPr>
+      <w:r>
+        <w:t>El sistema muestra "No hay stock suficiente para despachar la línea del vino."</w:t>
+      </w:r>
+    </w:p>
+    <w:p>
+      <w:pPr>
+        <w:pStyle w:val="ListBullet"/>
+      </w:pPr>
+      <w:r>
+        <w:t>La transacción se revierte por completo; no se genera ningún movimiento.</w:t>
+      </w:r>
+    </w:p>
+    <w:p>
+      <w:pPr>
+        <w:pStyle w:val="ListBullet"/>
+      </w:pPr>
+      <w:r>
+        <w:t>El caso de uso vuelve al paso 1.</w:t>
+      </w:r>
+    </w:p>
+    <w:p>
+      <w:pPr>
+        <w:pStyle w:val="Heading2"/>
+      </w:pPr>
+      <w:r>
+        <w:t>Reglas de negocio</w:t>
+      </w:r>
+    </w:p>
+    <w:tbl>
+      <w:tblPr>
+        <w:tblStyle w:val="LightGrid-Accent1"/>
+        <w:tblW w:type="auto" w:w="0"/>
+        <w:tblLook w:firstColumn="1" w:firstRow="1" w:lastColumn="0" w:lastRow="0" w:noHBand="0" w:noVBand="1" w:val="04A0"/>
+      </w:tblPr>
+      <w:tblGrid>
+        <w:gridCol w:w="4703"/>
+        <w:gridCol w:w="4703"/>
+      </w:tblGrid>
+      <w:tr>
+        <w:tc>
+          <w:tcPr>
+            <w:tcW w:type="dxa" w:w="4703"/>
+            <w:shd w:val="clear" w:color="auto" w:fill="DAE3F3"/>
+          </w:tcPr>
+          <w:p>
+            <w:r>
+              <w:rPr>
+                <w:b/>
+              </w:rPr>
+              <w:t>Código</w:t>
+            </w:r>
+          </w:p>
+        </w:tc>
+        <w:tc>
+          <w:tcPr>
+            <w:tcW w:type="dxa" w:w="4703"/>
+            <w:shd w:val="clear" w:color="auto" w:fill="DAE3F3"/>
+          </w:tcPr>
+          <w:p>
+            <w:r>
+              <w:rPr>
+                <w:b/>
+              </w:rPr>
+              <w:t>Regla</w:t>
+            </w:r>
+          </w:p>
+        </w:tc>
+      </w:tr>
+      <w:tr>
+        <w:tc>
+          <w:tcPr>
+            <w:tcW w:type="dxa" w:w="4703"/>
+          </w:tcPr>
+          <w:p>
+            <w:r>
+              <w:t>RN-03</w:t>
+            </w:r>
+          </w:p>
+        </w:tc>
+        <w:tc>
+          <w:tcPr>
+            <w:tcW w:type="dxa" w:w="4703"/>
+          </w:tcPr>
+          <w:p>
+            <w:r>
+              <w:t>Todo movimiento de Salida que dejaría el stock derivado por debajo de cero se rechaza (bloqueo por stock cero, reactivado desde N01).</w:t>
+            </w:r>
+          </w:p>
+        </w:tc>
+      </w:tr>
+      <w:tr>
+        <w:tc>
+          <w:tcPr>
+            <w:tcW w:type="dxa" w:w="4703"/>
+          </w:tcPr>
+          <w:p>
+            <w:r>
+              <w:t>RN-08</w:t>
+            </w:r>
+          </w:p>
+        </w:tc>
+        <w:tc>
+          <w:tcPr>
+            <w:tcW w:type="dxa" w:w="4703"/>
+          </w:tcPr>
+          <w:p>
+            <w:r>
+              <w:t>Solo se pueden despachar cajas en estado Armada; el ciclo de una caja despachada es unidireccional.</w:t>
+            </w:r>
+          </w:p>
+        </w:tc>
+      </w:tr>
+      <w:tr>
+        <w:tc>
+          <w:tcPr>
+            <w:tcW w:type="dxa" w:w="4703"/>
+          </w:tcPr>
+          <w:p>
+            <w:r>
+              <w:t>RN-09</w:t>
+            </w:r>
+          </w:p>
+        </w:tc>
+        <w:tc>
+          <w:tcPr>
+            <w:tcW w:type="dxa" w:w="4703"/>
+          </w:tcPr>
+          <w:p>
+            <w:r>
+              <w:t>El despacho es el único punto del proceso que genera movimientos de kardex (Salida) para este dominio.</w:t>
+            </w:r>
+          </w:p>
+        </w:tc>
+      </w:tr>
+      <w:tr>
+        <w:tc>
+          <w:tcPr>
+            <w:tcW w:type="dxa" w:w="4703"/>
+          </w:tcPr>
+          <w:p>
+            <w:r>
+              <w:t>RN-10</w:t>
+            </w:r>
+          </w:p>
+        </w:tc>
+        <w:tc>
+          <w:tcPr>
+            <w:tcW w:type="dxa" w:w="4703"/>
+          </w:tcPr>
+          <w:p>
+            <w:r>
+              <w:t>El responsable del despacho no puede ser quien armó la caja (separación de funciones).</w:t>
+            </w:r>
+          </w:p>
+        </w:tc>
+      </w:tr>
+    </w:tbl>
+    <w:p/>
+    <w:p>
+      <w:pPr>
+        <w:pStyle w:val="Heading2"/>
+      </w:pPr>
+      <w:r>
+        <w:t>Relaciones con otros casos de uso</w:t>
+      </w:r>
+    </w:p>
+    <w:tbl>
+      <w:tblPr>
+        <w:tblStyle w:val="LightGrid-Accent1"/>
+        <w:tblW w:type="auto" w:w="0"/>
+        <w:tblLook w:firstColumn="1" w:firstRow="1" w:lastColumn="0" w:lastRow="0" w:noHBand="0" w:noVBand="1" w:val="04A0"/>
+      </w:tblPr>
+      <w:tblGrid>
+        <w:gridCol w:w="3135"/>
+        <w:gridCol w:w="3135"/>
+        <w:gridCol w:w="3135"/>
+      </w:tblGrid>
+      <w:tr>
+        <w:tc>
+          <w:tcPr>
+            <w:tcW w:type="dxa" w:w="3135"/>
+            <w:shd w:val="clear" w:color="auto" w:fill="DAE3F3"/>
+          </w:tcPr>
+          <w:p>
+            <w:r>
+              <w:rPr>
+                <w:b/>
+              </w:rPr>
+              <w:t>Tipo</w:t>
+            </w:r>
+          </w:p>
+        </w:tc>
+        <w:tc>
+          <w:tcPr>
+            <w:tcW w:type="dxa" w:w="3135"/>
+            <w:shd w:val="clear" w:color="auto" w:fill="DAE3F3"/>
+          </w:tcPr>
+          <w:p>
+            <w:r>
+              <w:rPr>
+                <w:b/>
+              </w:rPr>
+              <w:t>Destino</w:t>
+            </w:r>
+          </w:p>
+        </w:tc>
+        <w:tc>
+          <w:tcPr>
+            <w:tcW w:type="dxa" w:w="3135"/>
+            <w:shd w:val="clear" w:color="auto" w:fill="DAE3F3"/>
+          </w:tcPr>
+          <w:p>
+            <w:r>
+              <w:rPr>
+                <w:b/>
+              </w:rPr>
+              <w:t>Condición</w:t>
+            </w:r>
+          </w:p>
+        </w:tc>
+      </w:tr>
+      <w:tr>
+        <w:tc>
+          <w:tcPr>
+            <w:tcW w:type="dxa" w:w="3135"/>
+          </w:tcPr>
+          <w:p>
+            <w:r>
+              <w:t>«precedido por»</w:t>
+            </w:r>
+          </w:p>
+        </w:tc>
+        <w:tc>
+          <w:tcPr>
+            <w:tcW w:type="dxa" w:w="3135"/>
+          </w:tcPr>
+          <w:p>
+            <w:r>
+              <w:t>CU-28 Armar Caja Mensual</w:t>
+            </w:r>
+          </w:p>
+        </w:tc>
+        <w:tc>
+          <w:tcPr>
+            <w:tcW w:type="dxa" w:w="3135"/>
+          </w:tcPr>
+          <w:p>
+            <w:r>
+              <w:t>Solo se pueden despachar cajas previamente armadas.</w:t>
+            </w:r>
+          </w:p>
+        </w:tc>
+      </w:tr>
+      <w:tr>
+        <w:tc>
+          <w:tcPr>
+            <w:tcW w:type="dxa" w:w="3135"/>
+          </w:tcPr>
+          <w:p>
+            <w:r>
+              <w:t>relacionado con</w:t>
+            </w:r>
+          </w:p>
+        </w:tc>
+        <w:tc>
+          <w:tcPr>
+            <w:tcW w:type="dxa" w:w="3135"/>
+          </w:tcPr>
+          <w:p>
+            <w:r>
+              <w:t>CU-29 Registrar Sustitución por Falta de Stock</w:t>
+            </w:r>
+          </w:p>
+        </w:tc>
+        <w:tc>
+          <w:tcPr>
+            <w:tcW w:type="dxa" w:w="3135"/>
+          </w:tcPr>
+          <w:p>
+            <w:r>
+              <w:t>Las sustituciones registradas antes del despacho determinan la composición efectiva que se despacha.</w:t>
+            </w:r>
+          </w:p>
+        </w:tc>
+      </w:tr>
+    </w:tbl>
+    <w:p/>
+    <w:p>
+      <w:pPr>
+        <w:pStyle w:val="Heading2"/>
+      </w:pPr>
+      <w:r>
+        <w:t>Observaciones</w:t>
+      </w:r>
+    </w:p>
+    <w:p>
+      <w:r>
+        <w:t>REFERENCIA_TIPO/REFERENCIA_ID de MOVIMIENTO_STOCK fueron creados en N01 y dejados en null en esa entrega; el despacho de una caja es su primer consumidor real, vinculando cada Salida a su CAJA_MENSUAL por una referencia blanda (soft link, sin FK física). Especificación simple — no requiere diagrama de secuencia dedicado en esta entrega (ver diseño: solo CU-28 y CU-29 llevan modelado completo con diagrama de secuencia).</w:t>
       </w:r>
     </w:p>
     <w:sectPr>

</xml_diff>

<commit_message>
feat: generate PDF dispatch remito on caja despacho (CU-31, A02)
Add a static MigraDoc/PDFsharp renderer (CAPAS/RemitoDespachoPdf.cs) that
builds Remitos/Remito_Caja{id}.pdf from a caja's effective RN-07
composition and opens it. Wire it into frmDespacharCaja.btnDespachar_Click
as a best-effort step after the transactional despacho confirms (RN-11):
a PDF failure never reverts the despacho. Add CajaMensualBLL.ListarDespachadas()
as the data foundation for the upcoming despatch history (CU-32). Extend
CU-31 documentation with the new postcondicion, flujo step 6, and
alternate flow 6a.
</commit_message>
<xml_diff>
--- a/DIAGRAMAS/CasosDeUso.docx
+++ b/DIAGRAMAS/CasosDeUso.docx
@@ -22698,6 +22698,14 @@
     </w:p>
     <w:p>
       <w:pPr>
+        <w:pStyle w:val="ListBullet"/>
+      </w:pPr>
+      <w:r>
+        <w:t>Se genera y abre el Remito de Despacho en PDF (Remitos/Remito_Caja{id}.pdf); si la generación falla, el despacho ya confirmado no se revierte (RN-11).</w:t>
+      </w:r>
+    </w:p>
+    <w:p>
+      <w:pPr>
         <w:pStyle w:val="Heading3"/>
       </w:pPr>
       <w:r>
@@ -22794,6 +22802,14 @@
         <w:pStyle w:val="ListNumber"/>
       </w:pPr>
       <w:r>
+        <w:t>El sistema genera el Remito de Despacho en PDF y lo abre (RN-11).</w:t>
+      </w:r>
+    </w:p>
+    <w:p>
+      <w:pPr>
+        <w:pStyle w:val="ListNumber"/>
+      </w:pPr>
+      <w:r>
         <w:t>El sistema informa que la caja fue despachada.</w:t>
       </w:r>
     </w:p>
@@ -22883,6 +22899,38 @@
       </w:pPr>
       <w:r>
         <w:t>El caso de uso vuelve al paso 1.</w:t>
+      </w:r>
+    </w:p>
+    <w:p>
+      <w:pPr>
+        <w:pStyle w:val="Heading3"/>
+      </w:pPr>
+      <w:r>
+        <w:t>6a. Falla la generación del remito de despacho (RN-11)</w:t>
+      </w:r>
+    </w:p>
+    <w:p>
+      <w:pPr>
+        <w:pStyle w:val="ListBullet"/>
+      </w:pPr>
+      <w:r>
+        <w:t>El sistema muestra "No se pudo generar el remito de despacho; la caja fue despachada igualmente."</w:t>
+      </w:r>
+    </w:p>
+    <w:p>
+      <w:pPr>
+        <w:pStyle w:val="ListBullet"/>
+      </w:pPr>
+      <w:r>
+        <w:t>El despacho ya confirmado no se revierte.</w:t>
+      </w:r>
+    </w:p>
+    <w:p>
+      <w:pPr>
+        <w:pStyle w:val="ListBullet"/>
+      </w:pPr>
+      <w:r>
+        <w:t>El caso de uso continúa al paso 7.</w:t>
       </w:r>
     </w:p>
     <w:p>
@@ -23017,6 +23065,28 @@
           <w:p>
             <w:r>
               <w:t>El responsable del despacho no puede ser quien armó la caja (separación de funciones).</w:t>
+            </w:r>
+          </w:p>
+        </w:tc>
+      </w:tr>
+      <w:tr>
+        <w:tc>
+          <w:tcPr>
+            <w:tcW w:type="dxa" w:w="4703"/>
+          </w:tcPr>
+          <w:p>
+            <w:r>
+              <w:t>RN-11</w:t>
+            </w:r>
+          </w:p>
+        </w:tc>
+        <w:tc>
+          <w:tcPr>
+            <w:tcW w:type="dxa" w:w="4703"/>
+          </w:tcPr>
+          <w:p>
+            <w:r>
+              <w:t>La generación del Remito de Despacho es best-effort: si falla, el despacho queda confirmado igual (CAJA_DESPACHAR es la fuente de verdad transaccional), se informa al usuario, y no se revierte ninguna operación.</w:t>
             </w:r>
           </w:p>
         </w:tc>

</xml_diff>

<commit_message>
feat: add dispatch history with remito regeneration (CU-32, A02)
Adds frmHistorialDespachos to list Despachada boxes and regenerate
their Remito de Despacho PDF on demand, reusing RemitoDespachoPdf and
CajaMensualBLL.ListarDespachadas from CU-31. Wires a new menu entry
under Club de Socios gated by the existing "Despachar cajas" permission
and seeds i18n for the new form.
</commit_message>
<xml_diff>
--- a/DIAGRAMAS/CasosDeUso.docx
+++ b/DIAGRAMAS/CasosDeUso.docx
@@ -14,7 +14,7 @@
       <w:r>
         <w:t>Sistema de Gestión de Usuarios — TP Ingeniería de Software.</w:t>
         <w:br/>
-        <w:t>Documento de descripción de los 31 casos de uso identificados: CU-01..CU-20 (esqueleto base — usuarios, roles/permisos, idiomas, bitácora, integridad) y CU-21..CU-25 y CU-27 (Proponer/Autorizar Alta, Registrar Movimiento de Stock, Solicitar/Autorizar Descontinuación, Registrar Ajuste de Inventario) más el caso de soporte CU-26 Consultar Alerta de Stock Mínimo, del dominio de Gestión de Catálogo y Stock de Vinos (Entrega N01); y CU-28..CU-31 (Armar Caja Mensual, Registrar Sustitución por Falta de Stock, Actualizar Perfil de Socio, Despachar Caja), del dominio de Curación y Armado de Cajas Mensuales, Club de Socios (Entrega N02).</w:t>
+        <w:t>Documento de descripción de los 32 casos de uso identificados: CU-01..CU-20 (esqueleto base — usuarios, roles/permisos, idiomas, bitácora, integridad) y CU-21..CU-25 y CU-27 (Proponer/Autorizar Alta, Registrar Movimiento de Stock, Solicitar/Autorizar Descontinuación, Registrar Ajuste de Inventario) más el caso de soporte CU-26 Consultar Alerta de Stock Mínimo, del dominio de Gestión de Catálogo y Stock de Vinos (Entrega N01); y CU-28..CU-32 (Armar Caja Mensual, Registrar Sustitución por Falta de Stock, Actualizar Perfil de Socio, Despachar Caja, Consultar Historial de Despachos), del dominio de Curación y Armado de Cajas Mensuales, Club de Socios (Entrega N02).</w:t>
       </w:r>
     </w:p>
     <w:p>
@@ -1152,6 +1152,38 @@
           <w:p>
             <w:r>
               <w:t>Despachar Caja</w:t>
+            </w:r>
+          </w:p>
+        </w:tc>
+        <w:tc>
+          <w:tcPr>
+            <w:tcW w:type="dxa" w:w="3135"/>
+          </w:tcPr>
+          <w:p>
+            <w:r>
+              <w:t>Usuario</w:t>
+            </w:r>
+          </w:p>
+        </w:tc>
+      </w:tr>
+      <w:tr>
+        <w:tc>
+          <w:tcPr>
+            <w:tcW w:type="dxa" w:w="3135"/>
+          </w:tcPr>
+          <w:p>
+            <w:r>
+              <w:t>CU-32</w:t>
+            </w:r>
+          </w:p>
+        </w:tc>
+        <w:tc>
+          <w:tcPr>
+            <w:tcW w:type="dxa" w:w="3135"/>
+          </w:tcPr>
+          <w:p>
+            <w:r>
+              <w:t>Consultar Historial de Despachos</w:t>
             </w:r>
           </w:p>
         </w:tc>
@@ -23233,6 +23265,622 @@
     <w:p>
       <w:r>
         <w:t>REFERENCIA_TIPO/REFERENCIA_ID de MOVIMIENTO_STOCK fueron creados en N01 y dejados en null en esa entrega; el despacho de una caja es su primer consumidor real, vinculando cada Salida a su CAJA_MENSUAL por una referencia blanda (soft link, sin FK física). Especificación simple — no requiere diagrama de secuencia dedicado en esta entrega (ver diseño: solo CU-28 y CU-29 llevan modelado completo con diagrama de secuencia).</w:t>
+      </w:r>
+    </w:p>
+    <w:p>
+      <w:r>
+        <w:br w:type="page"/>
+      </w:r>
+    </w:p>
+    <w:p>
+      <w:pPr>
+        <w:pStyle w:val="Heading1"/>
+      </w:pPr>
+      <w:r>
+        <w:t>CU-32 — Consultar Historial de Despachos</w:t>
+      </w:r>
+    </w:p>
+    <w:tbl>
+      <w:tblPr>
+        <w:tblStyle w:val="LightGrid-Accent1"/>
+        <w:tblW w:type="auto" w:w="0"/>
+        <w:tblLook w:firstColumn="1" w:firstRow="1" w:lastColumn="0" w:lastRow="0" w:noHBand="0" w:noVBand="1" w:val="04A0"/>
+      </w:tblPr>
+      <w:tblGrid>
+        <w:gridCol w:w="4703"/>
+        <w:gridCol w:w="4703"/>
+      </w:tblGrid>
+      <w:tr>
+        <w:tc>
+          <w:tcPr>
+            <w:tcW w:type="dxa" w:w="4703"/>
+            <w:shd w:val="clear" w:color="auto" w:fill="DAE3F3"/>
+          </w:tcPr>
+          <w:p>
+            <w:r>
+              <w:rPr>
+                <w:b/>
+              </w:rPr>
+              <w:t>Identificador</w:t>
+            </w:r>
+          </w:p>
+        </w:tc>
+        <w:tc>
+          <w:tcPr>
+            <w:tcW w:type="dxa" w:w="4703"/>
+          </w:tcPr>
+          <w:p>
+            <w:r>
+              <w:t>CU-32</w:t>
+            </w:r>
+          </w:p>
+        </w:tc>
+      </w:tr>
+      <w:tr>
+        <w:tc>
+          <w:tcPr>
+            <w:tcW w:type="dxa" w:w="4703"/>
+            <w:shd w:val="clear" w:color="auto" w:fill="DAE3F3"/>
+          </w:tcPr>
+          <w:p>
+            <w:r>
+              <w:rPr>
+                <w:b/>
+              </w:rPr>
+              <w:t>Nombre</w:t>
+            </w:r>
+          </w:p>
+        </w:tc>
+        <w:tc>
+          <w:tcPr>
+            <w:tcW w:type="dxa" w:w="4703"/>
+          </w:tcPr>
+          <w:p>
+            <w:r>
+              <w:t>Consultar Historial de Despachos</w:t>
+            </w:r>
+          </w:p>
+        </w:tc>
+      </w:tr>
+      <w:tr>
+        <w:tc>
+          <w:tcPr>
+            <w:tcW w:type="dxa" w:w="4703"/>
+            <w:shd w:val="clear" w:color="auto" w:fill="DAE3F3"/>
+          </w:tcPr>
+          <w:p>
+            <w:r>
+              <w:rPr>
+                <w:b/>
+              </w:rPr>
+              <w:t>Actor primario</w:t>
+            </w:r>
+          </w:p>
+        </w:tc>
+        <w:tc>
+          <w:tcPr>
+            <w:tcW w:type="dxa" w:w="4703"/>
+          </w:tcPr>
+          <w:p>
+            <w:r>
+              <w:t>Usuario</w:t>
+            </w:r>
+          </w:p>
+        </w:tc>
+      </w:tr>
+      <w:tr>
+        <w:tc>
+          <w:tcPr>
+            <w:tcW w:type="dxa" w:w="4703"/>
+            <w:shd w:val="clear" w:color="auto" w:fill="DAE3F3"/>
+          </w:tcPr>
+          <w:p>
+            <w:r>
+              <w:rPr>
+                <w:b/>
+              </w:rPr>
+              <w:t>Frecuencia</w:t>
+            </w:r>
+          </w:p>
+        </w:tc>
+        <w:tc>
+          <w:tcPr>
+            <w:tcW w:type="dxa" w:w="4703"/>
+          </w:tcPr>
+          <w:p>
+            <w:r>
+              <w:t>Media</w:t>
+            </w:r>
+          </w:p>
+        </w:tc>
+      </w:tr>
+      <w:tr>
+        <w:tc>
+          <w:tcPr>
+            <w:tcW w:type="dxa" w:w="4703"/>
+            <w:shd w:val="clear" w:color="auto" w:fill="DAE3F3"/>
+          </w:tcPr>
+          <w:p>
+            <w:r>
+              <w:rPr>
+                <w:b/>
+              </w:rPr>
+              <w:t>Prioridad</w:t>
+            </w:r>
+          </w:p>
+        </w:tc>
+        <w:tc>
+          <w:tcPr>
+            <w:tcW w:type="dxa" w:w="4703"/>
+          </w:tcPr>
+          <w:p>
+            <w:r>
+              <w:t>Media</w:t>
+            </w:r>
+          </w:p>
+        </w:tc>
+      </w:tr>
+    </w:tbl>
+    <w:p/>
+    <w:p>
+      <w:pPr>
+        <w:pStyle w:val="Heading2"/>
+      </w:pPr>
+      <w:r>
+        <w:t>Objetivo</w:t>
+      </w:r>
+    </w:p>
+    <w:p>
+      <w:r>
+        <w:t>Permitir que un Usuario con el permiso "Despachar cajas" (rol Logística) liste las cajas mensuales ya despachadas y reimprima el Remito de Despacho de cualquiera de ellas bajo demanda, sin rehacer el despacho.</w:t>
+      </w:r>
+    </w:p>
+    <w:p>
+      <w:pPr>
+        <w:pStyle w:val="Heading2"/>
+      </w:pPr>
+      <w:r>
+        <w:t>Precondiciones</w:t>
+      </w:r>
+    </w:p>
+    <w:p>
+      <w:pPr>
+        <w:pStyle w:val="ListBullet"/>
+      </w:pPr>
+      <w:r>
+        <w:t>El Usuario inició sesión correctamente y tiene el permiso "Despachar cajas".</w:t>
+      </w:r>
+    </w:p>
+    <w:p>
+      <w:pPr>
+        <w:pStyle w:val="ListBullet"/>
+      </w:pPr>
+      <w:r>
+        <w:t>Existe al menos una caja en estado Despachada.</w:t>
+      </w:r>
+    </w:p>
+    <w:p>
+      <w:pPr>
+        <w:pStyle w:val="Heading2"/>
+      </w:pPr>
+      <w:r>
+        <w:t>Postcondiciones</w:t>
+      </w:r>
+    </w:p>
+    <w:p>
+      <w:pPr>
+        <w:pStyle w:val="Heading3"/>
+      </w:pPr>
+      <w:r>
+        <w:t>En caso de éxito</w:t>
+      </w:r>
+    </w:p>
+    <w:p>
+      <w:pPr>
+        <w:pStyle w:val="ListBullet"/>
+      </w:pPr>
+      <w:r>
+        <w:t>El Remito de Despacho de la caja seleccionada se regenera, sobrescribiendo Remitos/Remito_Caja{id}.pdf en el mismo path, sin sufijo de timestamp (RN-12), y se abre.</w:t>
+      </w:r>
+    </w:p>
+    <w:p>
+      <w:pPr>
+        <w:pStyle w:val="Heading3"/>
+      </w:pPr>
+      <w:r>
+        <w:t>En caso de fallo</w:t>
+      </w:r>
+    </w:p>
+    <w:p>
+      <w:pPr>
+        <w:pStyle w:val="ListBullet"/>
+      </w:pPr>
+      <w:r>
+        <w:t>Si la generación del PDF falla: se muestra un mensaje de error y no se abre ningún archivo; el historial permanece navegable y ninguna otra operación se ve afectada.</w:t>
+      </w:r>
+    </w:p>
+    <w:p>
+      <w:pPr>
+        <w:pStyle w:val="Heading2"/>
+      </w:pPr>
+      <w:r>
+        <w:t>Evento disparador</w:t>
+      </w:r>
+    </w:p>
+    <w:p>
+      <w:r>
+        <w:t>El Usuario abre frmHistorialDespachos.</w:t>
+      </w:r>
+    </w:p>
+    <w:p>
+      <w:pPr>
+        <w:pStyle w:val="Heading2"/>
+      </w:pPr>
+      <w:r>
+        <w:t>Flujo principal</w:t>
+      </w:r>
+    </w:p>
+    <w:p>
+      <w:pPr>
+        <w:pStyle w:val="ListNumber"/>
+      </w:pPr>
+      <w:r>
+        <w:t>El Usuario abre el historial de despachos.</w:t>
+      </w:r>
+    </w:p>
+    <w:p>
+      <w:pPr>
+        <w:pStyle w:val="ListNumber"/>
+      </w:pPr>
+      <w:r>
+        <w:t>El sistema lista las cajas en estado Despachada, ordenadas por fecha de despacho descendente.</w:t>
+      </w:r>
+    </w:p>
+    <w:p>
+      <w:pPr>
+        <w:pStyle w:val="ListNumber"/>
+      </w:pPr>
+      <w:r>
+        <w:t>El Usuario selecciona una caja y presiona "Regenerar remito".</w:t>
+      </w:r>
+    </w:p>
+    <w:p>
+      <w:pPr>
+        <w:pStyle w:val="ListNumber"/>
+      </w:pPr>
+      <w:r>
+        <w:t>El sistema obtiene la composición efectiva de la caja y regenera el PDF, sobrescribiendo Remito_Caja{id}.pdf (RN-12).</w:t>
+      </w:r>
+    </w:p>
+    <w:p>
+      <w:pPr>
+        <w:pStyle w:val="ListNumber"/>
+      </w:pPr>
+      <w:r>
+        <w:t>El sistema abre el PDF regenerado.</w:t>
+      </w:r>
+    </w:p>
+    <w:p>
+      <w:pPr>
+        <w:pStyle w:val="Heading2"/>
+      </w:pPr>
+      <w:r>
+        <w:t>Excepciones</w:t>
+      </w:r>
+    </w:p>
+    <w:tbl>
+      <w:tblPr>
+        <w:tblStyle w:val="LightGrid-Accent1"/>
+        <w:tblW w:type="auto" w:w="0"/>
+        <w:tblLook w:firstColumn="1" w:firstRow="1" w:lastColumn="0" w:lastRow="0" w:noHBand="0" w:noVBand="1" w:val="04A0"/>
+      </w:tblPr>
+      <w:tblGrid>
+        <w:gridCol w:w="3135"/>
+        <w:gridCol w:w="3135"/>
+        <w:gridCol w:w="3135"/>
+      </w:tblGrid>
+      <w:tr>
+        <w:tc>
+          <w:tcPr>
+            <w:tcW w:type="dxa" w:w="3135"/>
+            <w:shd w:val="clear" w:color="auto" w:fill="DAE3F3"/>
+          </w:tcPr>
+          <w:p>
+            <w:r>
+              <w:rPr>
+                <w:b/>
+              </w:rPr>
+              <w:t>Código</w:t>
+            </w:r>
+          </w:p>
+        </w:tc>
+        <w:tc>
+          <w:tcPr>
+            <w:tcW w:type="dxa" w:w="3135"/>
+            <w:shd w:val="clear" w:color="auto" w:fill="DAE3F3"/>
+          </w:tcPr>
+          <w:p>
+            <w:r>
+              <w:rPr>
+                <w:b/>
+              </w:rPr>
+              <w:t>Descripción</w:t>
+            </w:r>
+          </w:p>
+        </w:tc>
+        <w:tc>
+          <w:tcPr>
+            <w:tcW w:type="dxa" w:w="3135"/>
+            <w:shd w:val="clear" w:color="auto" w:fill="DAE3F3"/>
+          </w:tcPr>
+          <w:p>
+            <w:r>
+              <w:rPr>
+                <w:b/>
+              </w:rPr>
+              <w:t>Manejo</w:t>
+            </w:r>
+          </w:p>
+        </w:tc>
+      </w:tr>
+      <w:tr>
+        <w:tc>
+          <w:tcPr>
+            <w:tcW w:type="dxa" w:w="3135"/>
+          </w:tcPr>
+          <w:p>
+            <w:r>
+              <w:t>EX-01</w:t>
+            </w:r>
+          </w:p>
+        </w:tc>
+        <w:tc>
+          <w:tcPr>
+            <w:tcW w:type="dxa" w:w="3135"/>
+          </w:tcPr>
+          <w:p>
+            <w:r>
+              <w:t>Falla la generación del remito (RN-11): permisos, disco lleno, lector de PDF ausente, etc.</w:t>
+            </w:r>
+          </w:p>
+        </w:tc>
+        <w:tc>
+          <w:tcPr>
+            <w:tcW w:type="dxa" w:w="3135"/>
+          </w:tcPr>
+          <w:p>
+            <w:r>
+              <w:t>El sistema muestra "No se pudo generar el remito de despacho; la caja fue despachada igualmente."; no abre ningún archivo; el historial sigue navegable.</w:t>
+            </w:r>
+          </w:p>
+        </w:tc>
+      </w:tr>
+    </w:tbl>
+    <w:p/>
+    <w:p>
+      <w:pPr>
+        <w:pStyle w:val="Heading2"/>
+      </w:pPr>
+      <w:r>
+        <w:t>Reglas de negocio</w:t>
+      </w:r>
+    </w:p>
+    <w:tbl>
+      <w:tblPr>
+        <w:tblStyle w:val="LightGrid-Accent1"/>
+        <w:tblW w:type="auto" w:w="0"/>
+        <w:tblLook w:firstColumn="1" w:firstRow="1" w:lastColumn="0" w:lastRow="0" w:noHBand="0" w:noVBand="1" w:val="04A0"/>
+      </w:tblPr>
+      <w:tblGrid>
+        <w:gridCol w:w="4703"/>
+        <w:gridCol w:w="4703"/>
+      </w:tblGrid>
+      <w:tr>
+        <w:tc>
+          <w:tcPr>
+            <w:tcW w:type="dxa" w:w="4703"/>
+            <w:shd w:val="clear" w:color="auto" w:fill="DAE3F3"/>
+          </w:tcPr>
+          <w:p>
+            <w:r>
+              <w:rPr>
+                <w:b/>
+              </w:rPr>
+              <w:t>Código</w:t>
+            </w:r>
+          </w:p>
+        </w:tc>
+        <w:tc>
+          <w:tcPr>
+            <w:tcW w:type="dxa" w:w="4703"/>
+            <w:shd w:val="clear" w:color="auto" w:fill="DAE3F3"/>
+          </w:tcPr>
+          <w:p>
+            <w:r>
+              <w:rPr>
+                <w:b/>
+              </w:rPr>
+              <w:t>Regla</w:t>
+            </w:r>
+          </w:p>
+        </w:tc>
+      </w:tr>
+      <w:tr>
+        <w:tc>
+          <w:tcPr>
+            <w:tcW w:type="dxa" w:w="4703"/>
+          </w:tcPr>
+          <w:p>
+            <w:r>
+              <w:t>RN-07</w:t>
+            </w:r>
+          </w:p>
+        </w:tc>
+        <w:tc>
+          <w:tcPr>
+            <w:tcW w:type="dxa" w:w="4703"/>
+          </w:tcPr>
+          <w:p>
+            <w:r>
+              <w:t>El remito regenerado refleja la composición efectiva de la caja (líneas con sustituciones aplicadas), igual que en el despacho original.</w:t>
+            </w:r>
+          </w:p>
+        </w:tc>
+      </w:tr>
+      <w:tr>
+        <w:tc>
+          <w:tcPr>
+            <w:tcW w:type="dxa" w:w="4703"/>
+          </w:tcPr>
+          <w:p>
+            <w:r>
+              <w:t>RN-11</w:t>
+            </w:r>
+          </w:p>
+        </w:tc>
+        <w:tc>
+          <w:tcPr>
+            <w:tcW w:type="dxa" w:w="4703"/>
+          </w:tcPr>
+          <w:p>
+            <w:r>
+              <w:t>La generación del Remito de Despacho es best-effort: una falla no afecta el estado de la caja, que ya es Despachada e inmutable desde este form.</w:t>
+            </w:r>
+          </w:p>
+        </w:tc>
+      </w:tr>
+      <w:tr>
+        <w:tc>
+          <w:tcPr>
+            <w:tcW w:type="dxa" w:w="4703"/>
+          </w:tcPr>
+          <w:p>
+            <w:r>
+              <w:t>RN-12</w:t>
+            </w:r>
+          </w:p>
+        </w:tc>
+        <w:tc>
+          <w:tcPr>
+            <w:tcW w:type="dxa" w:w="4703"/>
+          </w:tcPr>
+          <w:p>
+            <w:r>
+              <w:t>La regeneración del remito desde el historial sobrescribe Remito_Caja{id}.pdf en el mismo path — no se generan copias versionadas con timestamp.</w:t>
+            </w:r>
+          </w:p>
+        </w:tc>
+      </w:tr>
+    </w:tbl>
+    <w:p/>
+    <w:p>
+      <w:pPr>
+        <w:pStyle w:val="Heading2"/>
+      </w:pPr>
+      <w:r>
+        <w:t>Relaciones con otros casos de uso</w:t>
+      </w:r>
+    </w:p>
+    <w:tbl>
+      <w:tblPr>
+        <w:tblStyle w:val="LightGrid-Accent1"/>
+        <w:tblW w:type="auto" w:w="0"/>
+        <w:tblLook w:firstColumn="1" w:firstRow="1" w:lastColumn="0" w:lastRow="0" w:noHBand="0" w:noVBand="1" w:val="04A0"/>
+      </w:tblPr>
+      <w:tblGrid>
+        <w:gridCol w:w="3135"/>
+        <w:gridCol w:w="3135"/>
+        <w:gridCol w:w="3135"/>
+      </w:tblGrid>
+      <w:tr>
+        <w:tc>
+          <w:tcPr>
+            <w:tcW w:type="dxa" w:w="3135"/>
+            <w:shd w:val="clear" w:color="auto" w:fill="DAE3F3"/>
+          </w:tcPr>
+          <w:p>
+            <w:r>
+              <w:rPr>
+                <w:b/>
+              </w:rPr>
+              <w:t>Tipo</w:t>
+            </w:r>
+          </w:p>
+        </w:tc>
+        <w:tc>
+          <w:tcPr>
+            <w:tcW w:type="dxa" w:w="3135"/>
+            <w:shd w:val="clear" w:color="auto" w:fill="DAE3F3"/>
+          </w:tcPr>
+          <w:p>
+            <w:r>
+              <w:rPr>
+                <w:b/>
+              </w:rPr>
+              <w:t>Destino</w:t>
+            </w:r>
+          </w:p>
+        </w:tc>
+        <w:tc>
+          <w:tcPr>
+            <w:tcW w:type="dxa" w:w="3135"/>
+            <w:shd w:val="clear" w:color="auto" w:fill="DAE3F3"/>
+          </w:tcPr>
+          <w:p>
+            <w:r>
+              <w:rPr>
+                <w:b/>
+              </w:rPr>
+              <w:t>Condición</w:t>
+            </w:r>
+          </w:p>
+        </w:tc>
+      </w:tr>
+      <w:tr>
+        <w:tc>
+          <w:tcPr>
+            <w:tcW w:type="dxa" w:w="3135"/>
+          </w:tcPr>
+          <w:p>
+            <w:r>
+              <w:t>relacionado con</w:t>
+            </w:r>
+          </w:p>
+        </w:tc>
+        <w:tc>
+          <w:tcPr>
+            <w:tcW w:type="dxa" w:w="3135"/>
+          </w:tcPr>
+          <w:p>
+            <w:r>
+              <w:t>CU-31 Despachar Caja</w:t>
+            </w:r>
+          </w:p>
+        </w:tc>
+        <w:tc>
+          <w:tcPr>
+            <w:tcW w:type="dxa" w:w="3135"/>
+          </w:tcPr>
+          <w:p>
+            <w:r>
+              <w:t>Ambos comparten el renderer RemitoDespachoPdf como detalle de implementación; no existe relación «include»/«extend» entre los dos casos de uso.</w:t>
+            </w:r>
+          </w:p>
+        </w:tc>
+      </w:tr>
+    </w:tbl>
+    <w:p/>
+    <w:p>
+      <w:pPr>
+        <w:pStyle w:val="Heading2"/>
+      </w:pPr>
+      <w:r>
+        <w:t>Observaciones</w:t>
+      </w:r>
+    </w:p>
+    <w:p>
+      <w:r>
+        <w:t>Especificación simple — no requiere diagrama de secuencia dedicado en esta entrega (ver diseño: solo CU-28 y CU-29 llevan modelado completo con diagrama de secuencia). Reutiliza el mismo permiso "Despachar cajas" que CU-31 — no se creó ningún permiso nuevo.</w:t>
       </w:r>
     </w:p>
     <w:sectPr>

</xml_diff>